<commit_message>
Revision Round 2: Shrinkage, Bootstrap CIs, Active-Comparator Check, Text Fixes
Co-Authored-By: Claude Opus 5.5 (1M context) <noreply@anthropic.com>
</commit_message>
<xml_diff>
--- a/paper/manuscript.docx
+++ b/paper/manuscript.docx
@@ -7,7 +7,7 @@
         <w:pStyle w:val="Title"/>
       </w:pPr>
       <w:r>
-        <w:t xml:space="preserve">Adjustment and external replication of drug–hearing-loss signals in FAERS:</w:t>
+        <w:t xml:space="preserve">Adjustment and external replication of drug–hearing-loss signals:</w:t>
       </w:r>
       <w:r>
         <w:t xml:space="preserve"> </w:t>
@@ -62,19 +62,19 @@
         <w:t xml:space="preserve"> </w:t>
       </w:r>
       <w:r>
-        <w:t xml:space="preserve">Recent disproportionality analyses of the FDA Adverse Event Reporting System (FAERS)</w:t>
-      </w:r>
-      <w:r>
-        <w:t xml:space="preserve"> </w:t>
-      </w:r>
-      <w:r>
-        <w:t xml:space="preserve">reported many drug–hearing-loss signals absent from labels. We assessed which survive adjustment for hearing-specific biases</w:t>
-      </w:r>
-      <w:r>
-        <w:t xml:space="preserve"> </w:t>
-      </w:r>
-      <w:r>
-        <w:t xml:space="preserve">and external replication.</w:t>
+        <w:t xml:space="preserve">Recent disproportionality analyses of the US Food and Drug Administration Adverse Event</w:t>
+      </w:r>
+      <w:r>
+        <w:t xml:space="preserve"> </w:t>
+      </w:r>
+      <w:r>
+        <w:t xml:space="preserve">Reporting System (FAERS) reported many drug–hearing-loss signals absent from labels. We assessed which survive adjustment for</w:t>
+      </w:r>
+      <w:r>
+        <w:t xml:space="preserve"> </w:t>
+      </w:r>
+      <w:r>
+        <w:t xml:space="preserve">hearing-specific biases and external replication.</w:t>
       </w:r>
     </w:p>
     <w:p>
@@ -104,7 +104,7 @@
         <w:t xml:space="preserve"> </w:t>
       </w:r>
       <w:r>
-        <w:t xml:space="preserve">analysis. For hearing loss and tinnitus, crude reporting odds ratios (ROR; signal: lower 95% bound</w:t>
+        <w:t xml:space="preserve">analysis. For hearing loss and tinnitus, crude reporting odds ratios (signal: lower 95% bound</w:t>
       </w:r>
       <w:r>
         <w:t xml:space="preserve"> </w:t>
@@ -153,13 +153,13 @@
         <w:t xml:space="preserve"> </w:t>
       </w:r>
       <w:r>
-        <w:t xml:space="preserve">ROC curve, AUC) and by replication in Canada Vigilance, observed and power-calibrated; robust unlabelled signals underwent</w:t>
-      </w:r>
-      <w:r>
-        <w:t xml:space="preserve"> </w:t>
-      </w:r>
-      <w:r>
-        <w:t xml:space="preserve">case-by-case review.</w:t>
+        <w:t xml:space="preserve">receiver operating characteristic curve, AUC) and by replication in Canada Vigilance, observed and power-calibrated; robust</w:t>
+      </w:r>
+      <w:r>
+        <w:t xml:space="preserve"> </w:t>
+      </w:r>
+      <w:r>
+        <w:t xml:space="preserve">unlabelled signals underwent case-by-case review.</w:t>
       </w:r>
     </w:p>
     <w:p>
@@ -195,31 +195,37 @@
         <w:t xml:space="preserve"> </w:t>
       </w:r>
       <w:r>
-        <w:t xml:space="preserve">1.00); unlabelled signals did not (0.42;</w:t>
-      </w:r>
-      <w:r>
-        <w:t xml:space="preserve"> </w:t>
-      </w:r>
-      <w:r>
-        <w:t xml:space="preserve">post hoc, both databases adjusted: 0.20). Solicited patient-support-programme</w:t>
-      </w:r>
-      <w:r>
-        <w:t xml:space="preserve"> </w:t>
-      </w:r>
-      <w:r>
-        <w:t xml:space="preserve">reports and shared co-medication produced spurious replications. Of 22 robust unlabelled hearing-loss and tinnitus signals</w:t>
-      </w:r>
-      <w:r>
-        <w:t xml:space="preserve"> </w:t>
-      </w:r>
-      <w:r>
-        <w:t xml:space="preserve">(post hoc), 18 were attributed to report clusters, stimulated reporting, indication or an established class;</w:t>
-      </w:r>
-      <w:r>
-        <w:t xml:space="preserve"> </w:t>
-      </w:r>
-      <w:r>
-        <w:t xml:space="preserve">4 remained, led by pregabalin.</w:t>
+        <w:t xml:space="preserve">1.02, 95% CI 0.77–1.32);</w:t>
+      </w:r>
+      <w:r>
+        <w:t xml:space="preserve"> </w:t>
+      </w:r>
+      <w:r>
+        <w:t xml:space="preserve">unlabelled signals did not (0.44, 0.29–0.62;</w:t>
+      </w:r>
+      <w:r>
+        <w:t xml:space="preserve"> </w:t>
+      </w:r>
+      <w:r>
+        <w:t xml:space="preserve">post hoc, both databases adjusted: 0.26). Solicited patient-support-programme</w:t>
+      </w:r>
+      <w:r>
+        <w:t xml:space="preserve"> </w:t>
+      </w:r>
+      <w:r>
+        <w:t xml:space="preserve">reports, report clusters and shared co-medication produced spurious replications. Of 22 robust unlabelled signals (post</w:t>
+      </w:r>
+      <w:r>
+        <w:t xml:space="preserve"> </w:t>
+      </w:r>
+      <w:r>
+        <w:t xml:space="preserve">hoc), 15 were attributed to report clusters, stimulated reporting, indication or an established class; 7 remained,</w:t>
+      </w:r>
+      <w:r>
+        <w:t xml:space="preserve"> </w:t>
+      </w:r>
+      <w:r>
+        <w:t xml:space="preserve">led by pregabalin.</w:t>
       </w:r>
     </w:p>
     <w:p>
@@ -289,13 +295,13 @@
         </w:numPr>
       </w:pPr>
       <w:r>
-        <w:t xml:space="preserve">In Canada Vigilance, labelled hearing-loss signals replicated as often as predicted, unlabelled ones less than half as</w:t>
-      </w:r>
-      <w:r>
-        <w:t xml:space="preserve"> </w:t>
-      </w:r>
-      <w:r>
-        <w:t xml:space="preserve">often; solicited patient-support-programme reports and shared co-medication produced spurious replications.</w:t>
+        <w:t xml:space="preserve">In Canada Vigilance, labelled hearing-loss signals replicated about as often as predicted, unlabelled ones less than half</w:t>
+      </w:r>
+      <w:r>
+        <w:t xml:space="preserve"> </w:t>
+      </w:r>
+      <w:r>
+        <w:t xml:space="preserve">as often; solicited patient-support-programme reports and shared co-medication produced spurious replications.</w:t>
       </w:r>
     </w:p>
     <w:p>
@@ -307,7 +313,7 @@
         </w:numPr>
       </w:pPr>
       <w:r>
-        <w:t xml:space="preserve">After adjusted replication and case-by-case review of report provenance, 4 of 22 robust unlabelled signals</w:t>
+        <w:t xml:space="preserve">After adjusted replication and case-by-case review of report provenance, 7 of 22 robust unlabelled signals</w:t>
       </w:r>
       <w:r>
         <w:t xml:space="preserve"> </w:t>
@@ -502,7 +508,7 @@
         <w:t xml:space="preserve"> </w:t>
       </w:r>
       <w:r>
-        <w:t xml:space="preserve">data source or a reference set, as recommended for signal-detection methods</w:t>
+        <w:t xml:space="preserve">data source or a reference set, as done in evaluations of signal-detection methods</w:t>
       </w:r>
       <w:r>
         <w:t xml:space="preserve"> </w:t>
@@ -623,7 +629,7 @@
         <w:t xml:space="preserve"> </w:t>
       </w:r>
       <w:r>
-        <w:t xml:space="preserve">committed to a version-controlled repository (git) before the first result was computed; every later change is dated and</w:t>
+        <w:t xml:space="preserve">committed to a version-controlled repository (git commit ff77c40, 26 October 2026, 02:05 UTC+5) before the first result was computed; every later change is dated and</w:t>
       </w:r>
       <w:r>
         <w:t xml:space="preserve"> </w:t>
@@ -1600,7 +1606,146 @@
         <w:t xml:space="preserve"> </w:t>
       </w:r>
       <w:r>
-        <w:t xml:space="preserve">estimate; observed-to-expected ratios near 1 indicate that signals replicate as often as their FAERS strength predicts. For</w:t>
+        <w:t xml:space="preserve">estimate shrunk towards the null by empirical Bayes (log OR</w:t>
+      </w:r>
+      <w:r>
+        <w:t xml:space="preserve"> </w:t>
+      </w:r>
+      <m:oMath>
+        <m:r>
+          <m:rPr>
+            <m:sty m:val="p"/>
+          </m:rPr>
+          <m:t>×</m:t>
+        </m:r>
+        <m:r>
+          <m:t> </m:t>
+        </m:r>
+        <m:sSup>
+          <m:e>
+            <m:r>
+              <m:t>τ</m:t>
+            </m:r>
+          </m:e>
+          <m:sup>
+            <m:r>
+              <m:t>2</m:t>
+            </m:r>
+          </m:sup>
+        </m:sSup>
+        <m:r>
+          <m:rPr>
+            <m:sty m:val="p"/>
+          </m:rPr>
+          <m:t>/</m:t>
+        </m:r>
+        <m:r>
+          <m:rPr>
+            <m:sty m:val="p"/>
+          </m:rPr>
+          <m:t>(</m:t>
+        </m:r>
+        <m:sSup>
+          <m:e>
+            <m:r>
+              <m:t>τ</m:t>
+            </m:r>
+          </m:e>
+          <m:sup>
+            <m:r>
+              <m:t>2</m:t>
+            </m:r>
+          </m:sup>
+        </m:sSup>
+        <m:r>
+          <m:rPr>
+            <m:sty m:val="p"/>
+          </m:rPr>
+          <m:t>+</m:t>
+        </m:r>
+        <m:sSup>
+          <m:e>
+            <m:r>
+              <m:rPr>
+                <m:sty m:val="p"/>
+              </m:rPr>
+              <m:t>s</m:t>
+            </m:r>
+            <m:r>
+              <m:rPr>
+                <m:sty m:val="p"/>
+              </m:rPr>
+              <m:t>e</m:t>
+            </m:r>
+          </m:e>
+          <m:sup>
+            <m:r>
+              <m:t>2</m:t>
+            </m:r>
+          </m:sup>
+        </m:sSup>
+        <m:r>
+          <m:rPr>
+            <m:sty m:val="p"/>
+          </m:rPr>
+          <m:t>)</m:t>
+        </m:r>
+      </m:oMath>
+      <w:r>
+        <w:t xml:space="preserve">, with</w:t>
+      </w:r>
+      <w:r>
+        <w:t xml:space="preserve"> </w:t>
+      </w:r>
+      <m:oMath>
+        <m:sSup>
+          <m:e>
+            <m:r>
+              <m:t>τ</m:t>
+            </m:r>
+          </m:e>
+          <m:sup>
+            <m:r>
+              <m:t>2</m:t>
+            </m:r>
+          </m:sup>
+        </m:sSup>
+      </m:oMath>
+      <w:r>
+        <w:t xml:space="preserve"> </w:t>
+      </w:r>
+      <w:r>
+        <w:t xml:space="preserve">estimated</w:t>
+      </w:r>
+      <w:r>
+        <w:t xml:space="preserve"> </w:t>
+      </w:r>
+      <w:r>
+        <w:t xml:space="preserve">across all ingredients) to counter the selection of signals on their estimate; observed-to-expected ratios near 1 indicate that</w:t>
+      </w:r>
+      <w:r>
+        <w:t xml:space="preserve"> </w:t>
+      </w:r>
+      <w:r>
+        <w:t xml:space="preserve">signals replicate as often as their FAERS strength predicts. Confidence intervals were bootstrapped over ingredients (2</w:t>
+      </w:r>
+      <w:r>
+        <w:t xml:space="preserve">,</w:t>
+      </w:r>
+      <w:r>
+        <w:t xml:space="preserve">000</w:t>
+      </w:r>
+      <w:r>
+        <w:t xml:space="preserve"> </w:t>
+      </w:r>
+      <w:r>
+        <w:t xml:space="preserve">resamples). In the post-hoc adjusted-to-adjusted analysis the Canadian adjusted case count was compared with its stratified</w:t>
+      </w:r>
+      <w:r>
+        <w:t xml:space="preserve"> </w:t>
+      </w:r>
+      <w:r>
+        <w:t xml:space="preserve">expected count. For</w:t>
       </w:r>
       <w:r>
         <w:t xml:space="preserve"> </w:t>
@@ -1829,13 +1974,37 @@
         <w:t xml:space="preserve"> </w:t>
       </w:r>
       <w:r>
-        <w:t xml:space="preserve">author applied the rubric, and an independent AI assessor applied it blind to the author’s assignments, with the same</w:t>
-      </w:r>
-      <w:r>
-        <w:t xml:space="preserve"> </w:t>
-      </w:r>
-      <w:r>
-        <w:t xml:space="preserve">profiles and literature access; agreement is reported as Cohen’s</w:t>
+        <w:t xml:space="preserve">rubric distinguishes C from D only on documented evidence; a high consumer share alone does not make a signal C. For</w:t>
+      </w:r>
+      <w:r>
+        <w:t xml:space="preserve"> </w:t>
+      </w:r>
+      <w:r>
+        <w:t xml:space="preserve">category D we additionally required that the signal not persist against other drugs used for the same indication: within</w:t>
+      </w:r>
+      <w:r>
+        <w:t xml:space="preserve"> </w:t>
+      </w:r>
+      <w:r>
+        <w:t xml:space="preserve">FAERS reports (without Canadian origin) whose indication matched the drug’s main indication, we computed the ROR of the drug</w:t>
+      </w:r>
+      <w:r>
+        <w:t xml:space="preserve"> </w:t>
+      </w:r>
+      <w:r>
+        <w:t xml:space="preserve">against all other suspect drugs (active-comparator check, post hoc). The author applied the rubric, and a second, AI-based</w:t>
+      </w:r>
+      <w:r>
+        <w:t xml:space="preserve"> </w:t>
+      </w:r>
+      <w:r>
+        <w:t xml:space="preserve">assessor applied it blind to the author’s assignments, with the same profiles and literature access; agreement is reported as</w:t>
+      </w:r>
+      <w:r>
+        <w:t xml:space="preserve"> </w:t>
+      </w:r>
+      <w:r>
+        <w:t xml:space="preserve">Cohen’s</w:t>
       </w:r>
       <w:r>
         <w:t xml:space="preserve"> </w:t>
@@ -2046,13 +2215,13 @@
         <w:t xml:space="preserve">,</w:t>
       </w:r>
       <w:r>
-        <w:t xml:space="preserve">900 tinnitus reports. Hearing-loss</w:t>
-      </w:r>
-      <w:r>
-        <w:t xml:space="preserve"> </w:t>
-      </w:r>
-      <w:r>
-        <w:t xml:space="preserve">reports came more often from consumers and from patients aged</w:t>
+        <w:t xml:space="preserve">900 tinnitus reports; hearing-loss reports</w:t>
+      </w:r>
+      <w:r>
+        <w:t xml:space="preserve"> </w:t>
+      </w:r>
+      <w:r>
+        <w:t xml:space="preserve">came more often from consumers and from patients aged</w:t>
       </w:r>
       <w:r>
         <w:t xml:space="preserve"> </w:t>
@@ -2066,109 +2235,127 @@
         </m:r>
       </m:oMath>
       <w:r>
-        <w:t xml:space="preserve">65 years than other reports (Supplementary Table S4).</w:t>
-      </w:r>
-      <w:r>
-        <w:t xml:space="preserve"> </w:t>
-      </w:r>
-      <w:r>
-        <w:t xml:space="preserve">The primary adjusted population excluded 19</w:t>
+        <w:t xml:space="preserve">65 years than other reports (Supplementary Table S4). Without</w:t>
+      </w:r>
+      <w:r>
+        <w:t xml:space="preserve"> </w:t>
+      </w:r>
+      <w:r>
+        <w:t xml:space="preserve">Canadian reports, the population used for signal detection held 19</w:t>
       </w:r>
       <w:r>
         <w:t xml:space="preserve">,</w:t>
       </w:r>
       <w:r>
-        <w:t xml:space="preserve">277 reports with an ear or hearing</w:t>
-      </w:r>
-      <w:r>
-        <w:t xml:space="preserve"> </w:t>
-      </w:r>
-      <w:r>
-        <w:t xml:space="preserve">indication, 1</w:t>
+        <w:t xml:space="preserve">135</w:t>
       </w:r>
       <w:r>
         <w:t xml:space="preserve">,</w:t>
       </w:r>
       <w:r>
-        <w:t xml:space="preserve">842</w:t>
+        <w:t xml:space="preserve">329 reports and 8</w:t>
       </w:r>
       <w:r>
         <w:t xml:space="preserve">,</w:t>
       </w:r>
       <w:r>
-        <w:t xml:space="preserve">774 reports naming a listed ototoxic drug and</w:t>
-      </w:r>
-      <w:r>
-        <w:t xml:space="preserve"> </w:t>
-      </w:r>
-      <w:r>
-        <w:t xml:space="preserve">486</w:t>
+        <w:t xml:space="preserve">122 suspect</w:t>
+      </w:r>
+      <w:r>
+        <w:t xml:space="preserve"> </w:t>
+      </w:r>
+      <w:r>
+        <w:t xml:space="preserve">ingredients; its adjusted subset excluded 18</w:t>
       </w:r>
       <w:r>
         <w:t xml:space="preserve">,</w:t>
       </w:r>
       <w:r>
-        <w:t xml:space="preserve">359 lawyer reports, leaving 17</w:t>
+        <w:t xml:space="preserve">735 reports with an ear or hearing indication,</w:t>
+      </w:r>
+      <w:r>
+        <w:t xml:space="preserve"> </w:t>
+      </w:r>
+      <w:r>
+        <w:t xml:space="preserve">1</w:t>
       </w:r>
       <w:r>
         <w:t xml:space="preserve">,</w:t>
       </w:r>
       <w:r>
-        <w:t xml:space="preserve">571</w:t>
+        <w:t xml:space="preserve">712</w:t>
       </w:r>
       <w:r>
         <w:t xml:space="preserve">,</w:t>
       </w:r>
       <w:r>
-        <w:t xml:space="preserve">385 reports</w:t>
-      </w:r>
-      <w:r>
-        <w:t xml:space="preserve"> </w:t>
-      </w:r>
-      <w:r>
-        <w:t xml:space="preserve">(70</w:t>
+        <w:t xml:space="preserve">914 reports naming a listed ototoxic drug and 484</w:t>
       </w:r>
       <w:r>
         <w:t xml:space="preserve">,</w:t>
       </w:r>
       <w:r>
-        <w:t xml:space="preserve">438 hearing-loss cases). Canada Vigilance contributed 1</w:t>
+        <w:t xml:space="preserve">957 lawyer reports,</w:t>
+      </w:r>
+      <w:r>
+        <w:t xml:space="preserve"> </w:t>
+      </w:r>
+      <w:r>
+        <w:t xml:space="preserve">leaving 16</w:t>
       </w:r>
       <w:r>
         <w:t xml:space="preserve">,</w:t>
       </w:r>
       <w:r>
+        <w:t xml:space="preserve">962</w:t>
+      </w:r>
+      <w:r>
+        <w:t xml:space="preserve">,</w:t>
+      </w:r>
+      <w:r>
+        <w:t xml:space="preserve">022 reports (67</w:t>
+      </w:r>
+      <w:r>
+        <w:t xml:space="preserve">,</w:t>
+      </w:r>
+      <w:r>
+        <w:t xml:space="preserve">913 hearing-loss cases). Canada Vigilance</w:t>
+      </w:r>
+      <w:r>
+        <w:t xml:space="preserve"> </w:t>
+      </w:r>
+      <w:r>
+        <w:t xml:space="preserve">contributed 1</w:t>
+      </w:r>
+      <w:r>
+        <w:t xml:space="preserve">,</w:t>
+      </w:r>
+      <w:r>
         <w:t xml:space="preserve">210</w:t>
       </w:r>
       <w:r>
         <w:t xml:space="preserve">,</w:t>
       </w:r>
       <w:r>
-        <w:t xml:space="preserve">857 reports</w:t>
-      </w:r>
-      <w:r>
-        <w:t xml:space="preserve"> </w:t>
-      </w:r>
-      <w:r>
-        <w:t xml:space="preserve">after removing 58</w:t>
+        <w:t xml:space="preserve">857 reports after removing 58</w:t>
       </w:r>
       <w:r>
         <w:t xml:space="preserve">,</w:t>
       </w:r>
       <w:r>
-        <w:t xml:space="preserve">623 duplicates (4</w:t>
+        <w:t xml:space="preserve">623 duplicates</w:t>
+      </w:r>
+      <w:r>
+        <w:t xml:space="preserve"> </w:t>
+      </w:r>
+      <w:r>
+        <w:t xml:space="preserve">(4</w:t>
       </w:r>
       <w:r>
         <w:t xml:space="preserve">,</w:t>
       </w:r>
       <w:r>
-        <w:t xml:space="preserve">000 hearing-loss and</w:t>
-      </w:r>
-      <w:r>
-        <w:t xml:space="preserve"> </w:t>
-      </w:r>
-      <w:r>
-        <w:t xml:space="preserve">3</w:t>
+        <w:t xml:space="preserve">000 hearing-loss and 3</w:t>
       </w:r>
       <w:r>
         <w:t xml:space="preserve">,</w:t>
@@ -2200,31 +2387,31 @@
         <w:t xml:space="preserve"> </w:t>
       </w:r>
       <w:r>
-        <w:t xml:space="preserve">warnings, and teprotumumab (59.8 (55.4–64.5)). Several label-positive drugs did not signal: oxaliplatin (crude ROR</w:t>
-      </w:r>
-      <w:r>
-        <w:t xml:space="preserve"> </w:t>
-      </w:r>
-      <w:r>
-        <w:t xml:space="preserve">0.44), vardenafil (6 cases), and, after adjustment,</w:t>
-      </w:r>
-      <w:r>
-        <w:t xml:space="preserve"> </w:t>
-      </w:r>
-      <w:r>
-        <w:t xml:space="preserve">carboplatin (crude 1.96, adjusted 0.82) and</w:t>
-      </w:r>
-      <w:r>
-        <w:t xml:space="preserve"> </w:t>
-      </w:r>
-      <w:r>
-        <w:t xml:space="preserve">vincristine, whose crude associations were carried largely by reports that also named another listed drug—the</w:t>
-      </w:r>
-      <w:r>
-        <w:t xml:space="preserve"> </w:t>
-      </w:r>
-      <w:r>
-        <w:t xml:space="preserve">sensitivity that the co-medication filter costs.</w:t>
+        <w:t xml:space="preserve">warnings, and teprotumumab (59.8 (55.4–64.5)). Some label-positive drugs did not signal: oxaliplatin (crude ROR</w:t>
+      </w:r>
+      <w:r>
+        <w:t xml:space="preserve"> </w:t>
+      </w:r>
+      <w:r>
+        <w:t xml:space="preserve">0.44) and vardenafil (6 cases); carboplatin was a</w:t>
+      </w:r>
+      <w:r>
+        <w:t xml:space="preserve"> </w:t>
+      </w:r>
+      <w:r>
+        <w:t xml:space="preserve">crude signal that fell below 1 after adjustment (1.96 to</w:t>
+      </w:r>
+      <w:r>
+        <w:t xml:space="preserve"> </w:t>
+      </w:r>
+      <w:r>
+        <w:t xml:space="preserve">0.82), as did vincristine’s estimate, an example of the sensitivity that the</w:t>
+      </w:r>
+      <w:r>
+        <w:t xml:space="preserve"> </w:t>
+      </w:r>
+      <w:r>
+        <w:t xml:space="preserve">co-medication filter costs.</w:t>
       </w:r>
     </w:p>
     <w:p>
@@ -2303,19 +2490,13 @@
         <w:t xml:space="preserve"> </w:t>
       </w:r>
       <w:r>
-        <w:t xml:space="preserve">0.005, 95% CI -0.023 to 0.030, which excludes an</w:t>
-      </w:r>
-      <w:r>
-        <w:t xml:space="preserve"> </w:t>
-      </w:r>
-      <w:r>
-        <w:t xml:space="preserve">improvement larger than 0.03). The same held for point estimates</w:t>
-      </w:r>
-      <w:r>
-        <w:t xml:space="preserve"> </w:t>
-      </w:r>
-      <w:r>
-        <w:t xml:space="preserve">(0.700 vs 0.705), for the IC</w:t>
+        <w:t xml:space="preserve">0.005, 95% CI -0.023 to 0.030). The same held for point</w:t>
+      </w:r>
+      <w:r>
+        <w:t xml:space="preserve"> </w:t>
+      </w:r>
+      <w:r>
+        <w:t xml:space="preserve">estimates (0.700 vs 0.705), for the IC</w:t>
       </w:r>
       <m:oMath>
         <m:sSub>
@@ -2335,19 +2516,37 @@
         <w:t xml:space="preserve"> </w:t>
       </w:r>
       <w:r>
-        <w:t xml:space="preserve">(0.720), at lower report thresholds, without the 29 listed drugs, and for tinnitus</w:t>
-      </w:r>
-      <w:r>
-        <w:t xml:space="preserve"> </w:t>
-      </w:r>
-      <w:r>
-        <w:t xml:space="preserve">(0.775 vs 0.777). Adjustment lowered sensitivity</w:t>
-      </w:r>
-      <w:r>
-        <w:t xml:space="preserve"> </w:t>
-      </w:r>
-      <w:r>
-        <w:t xml:space="preserve">(0.40 to 0.35) with little change in specificity (0.866 to 0.873).</w:t>
+        <w:t xml:space="preserve">(0.720), after excluding the 83 ingredients without an estimable</w:t>
+      </w:r>
+      <w:r>
+        <w:t xml:space="preserve"> </w:t>
+      </w:r>
+      <w:r>
+        <w:t xml:space="preserve">adjusted bound (0.698 vs</w:t>
+      </w:r>
+      <w:r>
+        <w:t xml:space="preserve"> </w:t>
+      </w:r>
+      <w:r>
+        <w:t xml:space="preserve">0.703), at lower report thresholds, without the 29 listed</w:t>
+      </w:r>
+      <w:r>
+        <w:t xml:space="preserve"> </w:t>
+      </w:r>
+      <w:r>
+        <w:t xml:space="preserve">drugs, and for tinnitus (0.775 vs 0.777). Adjustment lowered</w:t>
+      </w:r>
+      <w:r>
+        <w:t xml:space="preserve"> </w:t>
+      </w:r>
+      <w:r>
+        <w:t xml:space="preserve">sensitivity (0.40 to 0.35) with little change in specificity</w:t>
+      </w:r>
+      <w:r>
+        <w:t xml:space="preserve"> </w:t>
+      </w:r>
+      <w:r>
+        <w:t xml:space="preserve">(0.866 to 0.873).</w:t>
       </w:r>
     </w:p>
     <w:p>
@@ -2377,13 +2576,19 @@
         <w:t xml:space="preserve"> </w:t>
       </w:r>
       <w:r>
-        <w:t xml:space="preserve">21/54 (39%), crude-only signals in 9/21 (43%), and the background of label-negative</w:t>
-      </w:r>
-      <w:r>
-        <w:t xml:space="preserve"> </w:t>
-      </w:r>
-      <w:r>
-        <w:t xml:space="preserve">non-signals in 43/214 (20%) (Table </w:t>
+        <w:t xml:space="preserve">21/54 (39%), crude-only signals in 9/21 (43%), and label-negative ingredients that</w:t>
+      </w:r>
+      <w:r>
+        <w:t xml:space="preserve"> </w:t>
+      </w:r>
+      <w:r>
+        <w:t xml:space="preserve">were neither crude nor adjusted signals in 43/214 (20%) (all label-negative ingredients, as literally specified in</w:t>
+      </w:r>
+      <w:r>
+        <w:t xml:space="preserve"> </w:t>
+      </w:r>
+      <w:r>
+        <w:t xml:space="preserve">the protocol: 68/281 (24%); Table </w:t>
       </w:r>
       <w:hyperlink w:anchor="_01d9fd756df68368595dee6b7688533f3c9fbbd">
         <w:r>
@@ -2394,13 +2599,13 @@
         </w:r>
       </w:hyperlink>
       <w:r>
-        <w:t xml:space="preserve">). The power-calibrated comparison separated the groups</w:t>
-      </w:r>
-      <w:r>
-        <w:t xml:space="preserve"> </w:t>
-      </w:r>
-      <w:r>
-        <w:t xml:space="preserve">more clearly (Figure </w:t>
+        <w:t xml:space="preserve">). The power-calibrated comparison</w:t>
+      </w:r>
+      <w:r>
+        <w:t xml:space="preserve"> </w:t>
+      </w:r>
+      <w:r>
+        <w:t xml:space="preserve">separated the groups more clearly (Figure </w:t>
       </w:r>
       <w:hyperlink w:anchor="_576b9bd78d0890981a1f156b59228419fd8f27c">
         <w:r>
@@ -2411,31 +2616,31 @@
         </w:r>
       </w:hyperlink>
       <w:r>
-        <w:t xml:space="preserve">): labelled signals replicated exactly as often as their FAERS strength predicted</w:t>
-      </w:r>
-      <w:r>
-        <w:t xml:space="preserve"> </w:t>
-      </w:r>
-      <w:r>
-        <w:t xml:space="preserve">(31 observed vs 31.2 expected (O/E 1.00)), whereas unlabelled signals replicated less than half as often</w:t>
-      </w:r>
-      <w:r>
-        <w:t xml:space="preserve"> </w:t>
-      </w:r>
-      <w:r>
-        <w:t xml:space="preserve">(25 observed vs 59.5 expected (O/E 0.42)), like label-negative signals (18 observed vs 39.0 expected (O/E 0.46)). Tinnitus showed</w:t>
-      </w:r>
-      <w:r>
-        <w:t xml:space="preserve"> </w:t>
-      </w:r>
-      <w:r>
-        <w:t xml:space="preserve">the same contrast (60 observed vs 64.4 expected (O/E 0.93) for labelled and 22 observed vs 49.4 expected (O/E 0.45) for unlabelled</w:t>
-      </w:r>
-      <w:r>
-        <w:t xml:space="preserve"> </w:t>
-      </w:r>
-      <w:r>
-        <w:t xml:space="preserve">signals).</w:t>
+        <w:t xml:space="preserve">): labelled signals replicated as often as their shrunken FAERS</w:t>
+      </w:r>
+      <w:r>
+        <w:t xml:space="preserve"> </w:t>
+      </w:r>
+      <w:r>
+        <w:t xml:space="preserve">estimates predicted (31 observed vs 30.5 expected; O/E 1.02, 95% CI 0.77–1.32), whereas unlabelled signals replicated less than half as often</w:t>
+      </w:r>
+      <w:r>
+        <w:t xml:space="preserve"> </w:t>
+      </w:r>
+      <w:r>
+        <w:t xml:space="preserve">(25 observed vs 56.8 expected; O/E 0.44, 95% CI 0.29–0.62), like label-negative signals (18 observed vs 37.5 expected; O/E 0.48, 95% CI 0.27–0.72). Results were the same</w:t>
+      </w:r>
+      <w:r>
+        <w:t xml:space="preserve"> </w:t>
+      </w:r>
+      <w:r>
+        <w:t xml:space="preserve">with unshrunken estimates and with the pre-specified label definition, and for tinnitus (60 observed vs 63.2 expected; O/E 0.95, 95% CI 0.79–1.13</w:t>
+      </w:r>
+      <w:r>
+        <w:t xml:space="preserve"> </w:t>
+      </w:r>
+      <w:r>
+        <w:t xml:space="preserve">for labelled and 22 observed vs 46.4 expected; O/E 0.47, 95% CI 0.30–0.66 for unlabelled signals).</w:t>
       </w:r>
     </w:p>
     <w:p>
@@ -2443,13 +2648,13 @@
         <w:pStyle w:val="BodyText"/>
       </w:pPr>
       <w:r>
-        <w:t xml:space="preserve">The background replicated more often than chance (36 observed vs</w:t>
-      </w:r>
-      <w:r>
-        <w:t xml:space="preserve"> </w:t>
-      </w:r>
-      <w:r>
-        <w:t xml:space="preserve">8.5 expected without any association). Solicited reports explained much of this:</w:t>
+        <w:t xml:space="preserve">The replication test was not conservative: label-negative non-signals replicated 4.2 times as often as expected without any association</w:t>
+      </w:r>
+      <w:r>
+        <w:t xml:space="preserve"> </w:t>
+      </w:r>
+      <w:r>
+        <w:t xml:space="preserve">(36 vs 8.5). Solicited reports explained much of this:</w:t>
       </w:r>
       <w:r>
         <w:t xml:space="preserve"> </w:t>
@@ -2513,13 +2718,7 @@
         <w:t xml:space="preserve">,</w:t>
       </w:r>
       <w:r>
-        <w:t xml:space="preserve">801 FAERS reports) none against 1.9 expected (too few to be testable under the</w:t>
-      </w:r>
-      <w:r>
-        <w:t xml:space="preserve"> </w:t>
-      </w:r>
-      <w:r>
-        <w:t xml:space="preserve">pre-specified rule).</w:t>
+        <w:t xml:space="preserve">801 FAERS reports) none against 1.9 expected (too few to be testable).</w:t>
       </w:r>
     </w:p>
     <w:p>
@@ -2527,7 +2726,7 @@
         <w:pStyle w:val="BodyText"/>
       </w:pPr>
       <w:r>
-        <w:t xml:space="preserve">Co-medication bias also replicated when crude estimates were compared. Etoposide, given in cisplatin-containing regimens,</w:t>
+        <w:t xml:space="preserve">Co-medication bias can also replicate when crude estimates are compared. Etoposide, given in cisplatin-containing regimens,</w:t>
       </w:r>
       <w:r>
         <w:t xml:space="preserve"> </w:t>
@@ -2539,37 +2738,37 @@
         <w:t xml:space="preserve"> </w:t>
       </w:r>
       <w:r>
-        <w:t xml:space="preserve">Canada 5.13 (3.68–7.14)) and disappeared after adjustment in both (FAERS</w:t>
-      </w:r>
-      <w:r>
-        <w:t xml:space="preserve"> </w:t>
-      </w:r>
-      <w:r>
-        <w:t xml:space="preserve">0.67 (0.46–0.98); Canada</w:t>
-      </w:r>
-      <w:r>
-        <w:t xml:space="preserve"> </w:t>
-      </w:r>
-      <w:r>
-        <w:t xml:space="preserve">1.15 (0.29–4.64)). Temporal replication within FAERS did not separate crude-only</w:t>
-      </w:r>
-      <w:r>
-        <w:t xml:space="preserve"> </w:t>
-      </w:r>
-      <w:r>
-        <w:t xml:space="preserve">from adjusted hearing-loss signals (early adjusted signals recurred after 2014 in 81/155 (52%), crude-only</w:t>
-      </w:r>
-      <w:r>
-        <w:t xml:space="preserve"> </w:t>
-      </w:r>
-      <w:r>
-        <w:t xml:space="preserve">signals in 18/28 (64%), background 137/938 (15%)); for tinnitus adjusted signals recurred more</w:t>
-      </w:r>
-      <w:r>
-        <w:t xml:space="preserve"> </w:t>
-      </w:r>
-      <w:r>
-        <w:t xml:space="preserve">often (100/121 (83%) vs 9/15 (60%)).</w:t>
+        <w:t xml:space="preserve">Canada 5.13 (3.68–7.14)); after adjustment the FAERS estimate reversed</w:t>
+      </w:r>
+      <w:r>
+        <w:t xml:space="preserve"> </w:t>
+      </w:r>
+      <w:r>
+        <w:t xml:space="preserve">(0.67 (0.46–0.98)) and the Canadian one rested on</w:t>
+      </w:r>
+      <w:r>
+        <w:t xml:space="preserve"> </w:t>
+      </w:r>
+      <w:r>
+        <w:t xml:space="preserve">2 cases (1.15 (0.29–4.64)). Temporal replication within FAERS</w:t>
+      </w:r>
+      <w:r>
+        <w:t xml:space="preserve"> </w:t>
+      </w:r>
+      <w:r>
+        <w:t xml:space="preserve">did not separate crude-only from adjusted hearing-loss signals (early adjusted signals recurred after 2014 in</w:t>
+      </w:r>
+      <w:r>
+        <w:t xml:space="preserve"> </w:t>
+      </w:r>
+      <w:r>
+        <w:t xml:space="preserve">81/155 (52%), crude-only signals in 18/28 (64%), background 137/938 (15%)); for</w:t>
+      </w:r>
+      <w:r>
+        <w:t xml:space="preserve"> </w:t>
+      </w:r>
+      <w:r>
+        <w:t xml:space="preserve">tinnitus adjusted signals recurred more often (100/121 (83%) vs 9/15 (60%)).</w:t>
       </w:r>
     </w:p>
     <w:p>
@@ -2610,7 +2809,7 @@
         <w:t xml:space="preserve"> </w:t>
       </w:r>
       <w:r>
-        <w:t xml:space="preserve">10/51 (20%) and the background in 19/158 (12%) (unlabelled vs background, Fisher</w:t>
+        <w:t xml:space="preserve">10/51 (20%) and the background in 19/158 (12%) (Fisher</w:t>
       </w:r>
       <w:r>
         <w:t xml:space="preserve"> </w:t>
@@ -2630,19 +2829,49 @@
         </m:r>
       </m:oMath>
       <w:r>
-        <w:t xml:space="preserve">); calibrated O/E ratios were 0.81</w:t>
-      </w:r>
-      <w:r>
-        <w:t xml:space="preserve"> </w:t>
-      </w:r>
-      <w:r>
-        <w:t xml:space="preserve">for labelled and 0.20 for unlabelled signals. Handling co-medication by</w:t>
-      </w:r>
-      <w:r>
-        <w:t xml:space="preserve"> </w:t>
-      </w:r>
-      <w:r>
-        <w:t xml:space="preserve">stratification instead of exclusion, with a short list of strongly ototoxic drugs, or after removing reports listing</w:t>
+        <w:t xml:space="preserve">);</w:t>
+      </w:r>
+      <w:r>
+        <w:t xml:space="preserve"> </w:t>
+      </w:r>
+      <w:r>
+        <w:t xml:space="preserve">calibrated on adjusted Canadian counts, O/E was 1.10 (95% CI</w:t>
+      </w:r>
+      <w:r>
+        <w:t xml:space="preserve"> </w:t>
+      </w:r>
+      <w:r>
+        <w:t xml:space="preserve">0.76–1.49) for labelled and</w:t>
+      </w:r>
+      <w:r>
+        <w:t xml:space="preserve"> </w:t>
+      </w:r>
+      <w:r>
+        <w:t xml:space="preserve">0.26 (0.11–0.43)</w:t>
+      </w:r>
+      <w:r>
+        <w:t xml:space="preserve"> </w:t>
+      </w:r>
+      <w:r>
+        <w:t xml:space="preserve">for unlabelled signals. Across the co-medication variants and the restriction of Canada Vigilance to reports from 2004,</w:t>
+      </w:r>
+      <w:r>
+        <w:t xml:space="preserve"> </w:t>
+      </w:r>
+      <w:r>
+        <w:t xml:space="preserve">unlabelled O/E ranged 0.23–0.28 and labelled</w:t>
+      </w:r>
+      <w:r>
+        <w:t xml:space="preserve"> </w:t>
+      </w:r>
+      <w:r>
+        <w:t xml:space="preserve">0.94–1.18. The comparison with the background depended on</w:t>
+      </w:r>
+      <w:r>
+        <w:t xml:space="preserve"> </w:t>
+      </w:r>
+      <w:r>
+        <w:t xml:space="preserve">report clusters: after excluding reports that list</w:t>
       </w:r>
       <w:r>
         <w:t xml:space="preserve"> </w:t>
@@ -2656,19 +2885,69 @@
         </m:r>
       </m:oMath>
       <w:r>
-        <w:t xml:space="preserve">15 drugs left this contrast unchanged (unlabelled O/E 0.20–0.27</w:t>
-      </w:r>
-      <w:r>
-        <w:t xml:space="preserve"> </w:t>
-      </w:r>
-      <w:r>
-        <w:t xml:space="preserve">across variants, labelled 0.81–1.02),</w:t>
-      </w:r>
-      <w:r>
-        <w:t xml:space="preserve"> </w:t>
-      </w:r>
-      <w:r>
-        <w:t xml:space="preserve">as did restricting Canada Vigilance to reports from 2004.</w:t>
+        <w:t xml:space="preserve">15 drugs, the background fell to 5/159 (3%) and</w:t>
+      </w:r>
+      <w:r>
+        <w:t xml:space="preserve"> </w:t>
+      </w:r>
+      <w:r>
+        <w:t xml:space="preserve">unlabelled signals (8/48 (17%)) exceeded it (Fisher</w:t>
+      </w:r>
+      <w:r>
+        <w:t xml:space="preserve"> </w:t>
+      </w:r>
+      <m:oMath>
+        <m:r>
+          <m:t>p</m:t>
+        </m:r>
+        <m:r>
+          <m:rPr>
+            <m:sty m:val="p"/>
+          </m:rPr>
+          <m:t>=</m:t>
+        </m:r>
+        <m:r>
+          <m:t>0.002</m:t>
+        </m:r>
+      </m:oMath>
+      <w:r>
+        <w:t xml:space="preserve">),</w:t>
+      </w:r>
+      <w:r>
+        <w:t xml:space="preserve"> </w:t>
+      </w:r>
+      <w:r>
+        <w:t xml:space="preserve">although still replicating far below expectation (O/E 0.27). Handling</w:t>
+      </w:r>
+      <w:r>
+        <w:t xml:space="preserve"> </w:t>
+      </w:r>
+      <w:r>
+        <w:t xml:space="preserve">co-medication as a stratum rather than an exclusion removed the below-1 estimates of label-positive drugs (carboplatin</w:t>
+      </w:r>
+      <w:r>
+        <w:t xml:space="preserve"> </w:t>
+      </w:r>
+      <w:r>
+        <w:t xml:space="preserve">0.79 to 1.34; vincristine</w:t>
+      </w:r>
+      <w:r>
+        <w:t xml:space="preserve"> </w:t>
+      </w:r>
+      <w:r>
+        <w:t xml:space="preserve">0.48 to 1.04), consistent</w:t>
+      </w:r>
+      <w:r>
+        <w:t xml:space="preserve"> </w:t>
+      </w:r>
+      <w:r>
+        <w:t xml:space="preserve">with selection bias from the exclusion, but did not remove the etoposide association</w:t>
+      </w:r>
+      <w:r>
+        <w:t xml:space="preserve"> </w:t>
+      </w:r>
+      <w:r>
+        <w:t xml:space="preserve">(1.57), consistent with residual co-medication bias under a binary stratum.</w:t>
       </w:r>
     </w:p>
     <w:p>
@@ -2707,49 +2986,43 @@
         <w:t xml:space="preserve"> </w:t>
       </w:r>
       <w:r>
-        <w:t xml:space="preserve">6 were testable in Canada and 2 replicated; under the post-hoc</w:t>
-      </w:r>
-      <w:r>
-        <w:t xml:space="preserve"> </w:t>
-      </w:r>
-      <w:r>
-        <w:t xml:space="preserve">definition 1 remained (glycopyrrolate).</w:t>
-      </w:r>
-      <w:r>
-        <w:t xml:space="preserve"> </w:t>
-      </w:r>
-      <w:r>
-        <w:t xml:space="preserve">Their strongest unlabelled signals included sacubitril/valsartan and tafamidis. Of the 28 unlabelled</w:t>
-      </w:r>
-      <w:r>
-        <w:t xml:space="preserve"> </w:t>
-      </w:r>
-      <w:r>
-        <w:t xml:space="preserve">paediatric signals of Liu et al. </w:t>
+        <w:t xml:space="preserve">6 were testable in Canada and 2 replicated; 1</w:t>
+      </w:r>
+      <w:r>
+        <w:t xml:space="preserve"> </w:t>
+      </w:r>
+      <w:r>
+        <w:t xml:space="preserve">met the post-hoc robust definition (glycopyrrolate). Their strongest unlabelled signals included</w:t>
+      </w:r>
+      <w:r>
+        <w:t xml:space="preserve"> </w:t>
+      </w:r>
+      <w:r>
+        <w:t xml:space="preserve">sacubitril/valsartan and tafamidis. Of the 28 unlabelled paediatric signals of Liu et al. </w:t>
       </w:r>
       <w:r>
         <w:t xml:space="preserve">[4]</w:t>
       </w:r>
       <w:r>
-        <w:t xml:space="preserve">, 11 were adjusted signals in our all-age data and</w:t>
-      </w:r>
-      <w:r>
-        <w:t xml:space="preserve"> </w:t>
-      </w:r>
-      <w:r>
-        <w:t xml:space="preserve">1 met the post-hoc definition (azithromycin,</w:t>
-      </w:r>
-      <w:r>
-        <w:t xml:space="preserve"> </w:t>
-      </w:r>
-      <w:r>
-        <w:t xml:space="preserve">which is on the a-priori ototoxic list); cefixime, ceftriaxone, etoposide, isoniazid were lost on adjustment</w:t>
-      </w:r>
-      <w:r>
-        <w:t xml:space="preserve"> </w:t>
-      </w:r>
-      <w:r>
-        <w:t xml:space="preserve">(Table </w:t>
+        <w:t xml:space="preserve">,</w:t>
+      </w:r>
+      <w:r>
+        <w:t xml:space="preserve"> </w:t>
+      </w:r>
+      <w:r>
+        <w:t xml:space="preserve">11 were adjusted signals in our all-age data and 1 met the robust definition</w:t>
+      </w:r>
+      <w:r>
+        <w:t xml:space="preserve"> </w:t>
+      </w:r>
+      <w:r>
+        <w:t xml:space="preserve">(azithromycin, which is on the a-priori ototoxic list);</w:t>
+      </w:r>
+      <w:r>
+        <w:t xml:space="preserve"> </w:t>
+      </w:r>
+      <w:r>
+        <w:t xml:space="preserve">cefixime, ceftriaxone, etoposide and isoniazid were lost on adjustment (Table </w:t>
       </w:r>
       <w:hyperlink w:anchor="_5dcdb19b87d05ca6b5d15ccad55830f58746f11">
         <w:r>
@@ -2760,7 +3033,13 @@
         </w:r>
       </w:hyperlink>
       <w:r>
-        <w:t xml:space="preserve">). Only abstract-level lists were available for the remaining screens (Supplementary Table S6).</w:t>
+        <w:t xml:space="preserve">). Only</w:t>
+      </w:r>
+      <w:r>
+        <w:t xml:space="preserve"> </w:t>
+      </w:r>
+      <w:r>
+        <w:t xml:space="preserve">abstract-level lists were available for the other screens (Supplementary Table S6).</w:t>
       </w:r>
     </w:p>
     <w:p>
@@ -2812,49 +3091,73 @@
         <w:t xml:space="preserve"> </w:t>
       </w:r>
       <w:r>
-        <w:t xml:space="preserve">example candesartan–tinnitus: 80% of cases from the United Kingdom, median 42 drugs per report),</w:t>
-      </w:r>
-      <w:r>
-        <w:t xml:space="preserve"> </w:t>
-      </w:r>
-      <w:r>
-        <w:t xml:space="preserve">6 to stimulated or mass-exposure reporting (mRNA COVID-19 vaccines, rofecoxib, finasteride),</w:t>
-      </w:r>
-      <w:r>
-        <w:t xml:space="preserve"> </w:t>
-      </w:r>
-      <w:r>
-        <w:t xml:space="preserve">7 to an indication itself associated with the event (rheumatoid arthritis for etanercept and</w:t>
-      </w:r>
-      <w:r>
-        <w:t xml:space="preserve"> </w:t>
-      </w:r>
-      <w:r>
-        <w:t xml:space="preserve">tofacitinib; COPD for glycopyrrolate; glaucoma for travoprost; diabetes for insulin aspart; migraine for galcanezumab;</w:t>
-      </w:r>
-      <w:r>
-        <w:t xml:space="preserve"> </w:t>
-      </w:r>
-      <w:r>
-        <w:t xml:space="preserve">hypothyroidism for liothyronine) and 1 to an established ototoxic class (oral paromomycin).</w:t>
-      </w:r>
-      <w:r>
-        <w:t xml:space="preserve"> </w:t>
-      </w:r>
-      <w:r>
-        <w:t xml:space="preserve">Four remained without a dominant artefactual explanation: pregabalin and amlodipine for hearing loss, and doxycycline and</w:t>
-      </w:r>
-      <w:r>
-        <w:t xml:space="preserve"> </w:t>
-      </w:r>
-      <w:r>
-        <w:t xml:space="preserve">chlorthalidone (10 cases) for tinnitus.</w:t>
-      </w:r>
-      <w:r>
-        <w:t xml:space="preserve"> </w:t>
-      </w:r>
-      <w:r>
-        <w:t xml:space="preserve">The independent assessor agreed on 19 of 22 assignments (Cohen’s</w:t>
+        <w:t xml:space="preserve">example candesartan–tinnitus: 80%</w:t>
+      </w:r>
+      <w:r>
+        <w:t xml:space="preserve"> </w:t>
+      </w:r>
+      <w:r>
+        <w:t xml:space="preserve">of cases from the United Kingdom, median 42 drugs per</w:t>
+      </w:r>
+      <w:r>
+        <w:t xml:space="preserve"> </w:t>
+      </w:r>
+      <w:r>
+        <w:t xml:space="preserve">report), 6 to stimulated or mass-exposure reporting (mRNA COVID-19 vaccines, rofecoxib, finasteride),</w:t>
+      </w:r>
+      <w:r>
+        <w:t xml:space="preserve"> </w:t>
+      </w:r>
+      <w:r>
+        <w:t xml:space="preserve">1 to an established ototoxic class (oral paromomycin) and 4 to an indication whose</w:t>
+      </w:r>
+      <w:r>
+        <w:t xml:space="preserve"> </w:t>
+      </w:r>
+      <w:r>
+        <w:t xml:space="preserve">association with the event was confirmed by the active-comparator check (etanercept against other rheumatoid-arthritis drugs,</w:t>
+      </w:r>
+      <w:r>
+        <w:t xml:space="preserve"> </w:t>
+      </w:r>
+      <w:r>
+        <w:t xml:space="preserve">ROR 0.93 (0.87–1.00); insulin aspart within diabetes, 1.17 (1.00–1.37); galcanezumab within migraine,</w:t>
+      </w:r>
+      <w:r>
+        <w:t xml:space="preserve"> </w:t>
+      </w:r>
+      <w:r>
+        <w:t xml:space="preserve">0.82 (0.63–1.06); chlorthalidone within hypertension, 1.04 (0.43–2.51)). For seven signals the</w:t>
+      </w:r>
+      <w:r>
+        <w:t xml:space="preserve"> </w:t>
+      </w:r>
+      <w:r>
+        <w:t xml:space="preserve">indication did not account for the association, because it persisted against other drugs for the same indication:</w:t>
+      </w:r>
+      <w:r>
+        <w:t xml:space="preserve"> </w:t>
+      </w:r>
+      <w:r>
+        <w:t xml:space="preserve">tofacitinib, pregabalin, amlodipine, glycopyrrolate and travoprost for hearing loss (for example pregabalin within pain and neuropathy, ROR 3.27 (3.04–3.52); amlodipine</w:t>
+      </w:r>
+      <w:r>
+        <w:t xml:space="preserve"> </w:t>
+      </w:r>
+      <w:r>
+        <w:t xml:space="preserve">within hypertension, 1.89 (1.69–2.10)) and doxycycline and liothyronine for tinnitus (doxycycline, 3.63 (2.98–4.42)).</w:t>
+      </w:r>
+      <w:r>
+        <w:t xml:space="preserve"> </w:t>
+      </w:r>
+      <w:r>
+        <w:t xml:space="preserve">A second, AI-based assessor applying the same rubric to the same profiles agreed on 19 of 22 assignments</w:t>
+      </w:r>
+      <w:r>
+        <w:t xml:space="preserve"> </w:t>
+      </w:r>
+      <w:r>
+        <w:t xml:space="preserve">before the active-comparator step (Cohen’s</w:t>
       </w:r>
       <w:r>
         <w:t xml:space="preserve"> </w:t>
@@ -2874,25 +3177,36 @@
         </m:r>
       </m:oMath>
       <w:r>
-        <w:t xml:space="preserve">);</w:t>
-      </w:r>
-      <w:r>
-        <w:t xml:space="preserve"> </w:t>
-      </w:r>
-      <w:r>
-        <w:t xml:space="preserve">it placed Tozinameran (hearing loss) in K rather than C; Amlodipine (hearing loss) in D rather than E; Galcanezumab (tinnitus) in E rather than D</w:t>
-      </w:r>
-      <w:r>
-        <w:t xml:space="preserve"> </w:t>
-      </w:r>
-      <w:r>
-        <w:t xml:space="preserve">(Supplementary Table S3), which would leave the number of unexplained signals at</w:t>
-      </w:r>
-      <w:r>
-        <w:t xml:space="preserve"> </w:t>
-      </w:r>
-      <w:r>
-        <w:t xml:space="preserve">4.</w:t>
+        <w:t xml:space="preserve">) and on 19 after the same mechanical rule</w:t>
+      </w:r>
+      <w:r>
+        <w:t xml:space="preserve"> </w:t>
+      </w:r>
+      <w:r>
+        <w:t xml:space="preserve">was applied to both (</w:t>
+      </w:r>
+      <m:oMath>
+        <m:r>
+          <m:t>κ</m:t>
+        </m:r>
+        <m:r>
+          <m:rPr>
+            <m:sty m:val="p"/>
+          </m:rPr>
+          <m:t>=</m:t>
+        </m:r>
+        <m:r>
+          <m:t>0.82</m:t>
+        </m:r>
+      </m:oMath>
+      <w:r>
+        <w:t xml:space="preserve">); with its assignments, nine signals would remain unexplained</w:t>
+      </w:r>
+      <w:r>
+        <w:t xml:space="preserve"> </w:t>
+      </w:r>
+      <w:r>
+        <w:t xml:space="preserve">(Supplementary Table S3).</w:t>
       </w:r>
     </w:p>
     <w:bookmarkStart w:id="28" w:name="_01d9fd756df68368595dee6b7688533f3c9fbbd"/>
@@ -3309,6 +3623,34 @@
               <w:jc w:val="left"/>
             </w:pPr>
             <w:r>
+              <w:t xml:space="preserve">all label-negative ingredients (protocol wording)</w:t>
+            </w:r>
+          </w:p>
+        </w:tc>
+        <w:tc>
+          <w:tcPr>
+            <w:gridSpan w:val="2"/>
+          </w:tcPr>
+          <w:p>
+            <w:pPr>
+              <w:pStyle w:val="Compact"/>
+              <w:jc w:val="center"/>
+            </w:pPr>
+            <w:r>
+              <w:t xml:space="preserve">68/281 (24%)</w:t>
+            </w:r>
+          </w:p>
+        </w:tc>
+      </w:tr>
+      <w:tr>
+        <w:tc>
+          <w:tcPr/>
+          <w:p>
+            <w:pPr>
+              <w:pStyle w:val="Compact"/>
+              <w:jc w:val="left"/>
+            </w:pPr>
+            <w:r>
               <w:t xml:space="preserve">Observed/expected replications</w:t>
             </w:r>
             <m:oMath>
@@ -3340,7 +3682,7 @@
               <w:jc w:val="center"/>
             </w:pPr>
             <w:r>
-              <w:t xml:space="preserve">31/31.2 = 1.00</w:t>
+              <w:t xml:space="preserve">31/30.5 = 1.02 (0.77–1.32)</w:t>
             </w:r>
           </w:p>
         </w:tc>
@@ -3368,7 +3710,7 @@
               <w:jc w:val="center"/>
             </w:pPr>
             <w:r>
-              <w:t xml:space="preserve">25/59.5 = 0.42</w:t>
+              <w:t xml:space="preserve">25/56.8 = 0.44 (0.29–0.62)</w:t>
             </w:r>
           </w:p>
         </w:tc>
@@ -3396,7 +3738,7 @@
               <w:jc w:val="center"/>
             </w:pPr>
             <w:r>
-              <w:t xml:space="preserve">18/39.0 = 0.46</w:t>
+              <w:t xml:space="preserve">18/37.5 = 0.48 (0.27–0.72)</w:t>
             </w:r>
           </w:p>
         </w:tc>
@@ -3510,7 +3852,7 @@
               <w:jc w:val="center"/>
             </w:pPr>
             <w:r>
-              <w:t xml:space="preserve">0.002 (-0.015 to 0.019)</w:t>
+              <w:t xml:space="preserve">0.002 (-0.016 to 0.018)</w:t>
             </w:r>
           </w:p>
         </w:tc>
@@ -3757,6 +4099,34 @@
               <w:jc w:val="left"/>
             </w:pPr>
             <w:r>
+              <w:t xml:space="preserve">all label-negative ingredients (protocol wording)</w:t>
+            </w:r>
+          </w:p>
+        </w:tc>
+        <w:tc>
+          <w:tcPr>
+            <w:gridSpan w:val="2"/>
+          </w:tcPr>
+          <w:p>
+            <w:pPr>
+              <w:pStyle w:val="Compact"/>
+              <w:jc w:val="center"/>
+            </w:pPr>
+            <w:r>
+              <w:t xml:space="preserve">53/252 (21%)</w:t>
+            </w:r>
+          </w:p>
+        </w:tc>
+      </w:tr>
+      <w:tr>
+        <w:tc>
+          <w:tcPr/>
+          <w:p>
+            <w:pPr>
+              <w:pStyle w:val="Compact"/>
+              <w:jc w:val="left"/>
+            </w:pPr>
+            <w:r>
               <w:t xml:space="preserve">Observed/expected replications</w:t>
             </w:r>
             <m:oMath>
@@ -3788,7 +4158,7 @@
               <w:jc w:val="center"/>
             </w:pPr>
             <w:r>
-              <w:t xml:space="preserve">60/64.4 = 0.93</w:t>
+              <w:t xml:space="preserve">60/63.2 = 0.95 (0.79–1.13)</w:t>
             </w:r>
           </w:p>
         </w:tc>
@@ -3816,7 +4186,7 @@
               <w:jc w:val="center"/>
             </w:pPr>
             <w:r>
-              <w:t xml:space="preserve">22/49.4 = 0.45</w:t>
+              <w:t xml:space="preserve">22/46.4 = 0.47 (0.30–0.66)</w:t>
             </w:r>
           </w:p>
         </w:tc>
@@ -3844,7 +4214,7 @@
               <w:jc w:val="center"/>
             </w:pPr>
             <w:r>
-              <w:t xml:space="preserve">16/35.5 = 0.45</w:t>
+              <w:t xml:space="preserve">16/33.8 = 0.47 (0.28–0.71)</w:t>
             </w:r>
           </w:p>
         </w:tc>
@@ -3928,14 +4298,15 @@
         <w:tblCaption w:val="Post-hoc analyses: extended indication filter, Canada Vigilance without solicited reports, both estimates adjusted, with four ways of handling ototoxic co-medication. O/E: observed/expected replications. Robust: adjusted signals replicated adjusted-to-adjusted (unlabelled in brackets)."/>
       </w:tblPr>
       <w:tblGrid>
-        <w:gridCol w:w="990"/>
-        <w:gridCol w:w="990"/>
-        <w:gridCol w:w="990"/>
-        <w:gridCol w:w="990"/>
-        <w:gridCol w:w="990"/>
-        <w:gridCol w:w="990"/>
-        <w:gridCol w:w="990"/>
-        <w:gridCol w:w="990"/>
+        <w:gridCol w:w="880"/>
+        <w:gridCol w:w="880"/>
+        <w:gridCol w:w="880"/>
+        <w:gridCol w:w="880"/>
+        <w:gridCol w:w="880"/>
+        <w:gridCol w:w="880"/>
+        <w:gridCol w:w="880"/>
+        <w:gridCol w:w="880"/>
+        <w:gridCol w:w="880"/>
       </w:tblGrid>
       <w:tr>
         <w:trPr>
@@ -4021,6 +4392,26 @@
               <w:jc w:val="center"/>
             </w:pPr>
             <w:r>
+              <w:t xml:space="preserve">Fisher</w:t>
+            </w:r>
+            <w:r>
+              <w:t xml:space="preserve"> </w:t>
+            </w:r>
+            <m:oMath>
+              <m:r>
+                <m:t>p</m:t>
+              </m:r>
+            </m:oMath>
+          </w:p>
+        </w:tc>
+        <w:tc>
+          <w:tcPr/>
+          <w:p>
+            <w:pPr>
+              <w:pStyle w:val="Compact"/>
+              <w:jc w:val="center"/>
+            </w:pPr>
+            <w:r>
               <w:t xml:space="preserve">O/E lab./unlab.</w:t>
             </w:r>
           </w:p>
@@ -4041,7 +4432,7 @@
       <w:tr>
         <w:tc>
           <w:tcPr>
-            <w:gridSpan w:val="8"/>
+            <w:gridSpan w:val="9"/>
           </w:tcPr>
           <w:p>
             <w:pPr>
@@ -4139,7 +4530,19 @@
               <w:jc w:val="center"/>
             </w:pPr>
             <w:r>
-              <w:t xml:space="preserve">0.81 / 0.20</w:t>
+              <w:t xml:space="preserve">0.242</w:t>
+            </w:r>
+          </w:p>
+        </w:tc>
+        <w:tc>
+          <w:tcPr/>
+          <w:p>
+            <w:pPr>
+              <w:pStyle w:val="Compact"/>
+              <w:jc w:val="center"/>
+            </w:pPr>
+            <w:r>
+              <w:t xml:space="preserve">1.10 / 0.26</w:t>
             </w:r>
           </w:p>
         </w:tc>
@@ -4237,7 +4640,19 @@
               <w:jc w:val="center"/>
             </w:pPr>
             <w:r>
-              <w:t xml:space="preserve">1.02 / 0.27</w:t>
+              <w:t xml:space="preserve">0.060</w:t>
+            </w:r>
+          </w:p>
+        </w:tc>
+        <w:tc>
+          <w:tcPr/>
+          <w:p>
+            <w:pPr>
+              <w:pStyle w:val="Compact"/>
+              <w:jc w:val="center"/>
+            </w:pPr>
+            <w:r>
+              <w:t xml:space="preserve">0.94 / 0.25</w:t>
             </w:r>
           </w:p>
         </w:tc>
@@ -4335,7 +4750,19 @@
               <w:jc w:val="center"/>
             </w:pPr>
             <w:r>
-              <w:t xml:space="preserve">0.83 / 0.22</w:t>
+              <w:t xml:space="preserve">0.058</w:t>
+            </w:r>
+          </w:p>
+        </w:tc>
+        <w:tc>
+          <w:tcPr/>
+          <w:p>
+            <w:pPr>
+              <w:pStyle w:val="Compact"/>
+              <w:jc w:val="center"/>
+            </w:pPr>
+            <w:r>
+              <w:t xml:space="preserve">1.03 / 0.28</w:t>
             </w:r>
           </w:p>
         </w:tc>
@@ -4447,7 +4874,19 @@
               <w:jc w:val="center"/>
             </w:pPr>
             <w:r>
-              <w:t xml:space="preserve">0.81 / 0.24</w:t>
+              <w:t xml:space="preserve">0.002</w:t>
+            </w:r>
+          </w:p>
+        </w:tc>
+        <w:tc>
+          <w:tcPr/>
+          <w:p>
+            <w:pPr>
+              <w:pStyle w:val="Compact"/>
+              <w:jc w:val="center"/>
+            </w:pPr>
+            <w:r>
+              <w:t xml:space="preserve">1.18 / 0.27</w:t>
             </w:r>
           </w:p>
         </w:tc>
@@ -4466,8 +4905,118 @@
       </w:tr>
       <w:tr>
         <w:tc>
+          <w:tcPr/>
+          <w:p>
+            <w:pPr>
+              <w:pStyle w:val="Compact"/>
+              <w:jc w:val="left"/>
+            </w:pPr>
+            <w:r>
+              <w:t xml:space="preserve">Exclusion; Canada from 2004</w:t>
+            </w:r>
+          </w:p>
+        </w:tc>
+        <w:tc>
+          <w:tcPr/>
+          <w:p>
+            <w:pPr>
+              <w:pStyle w:val="Compact"/>
+              <w:jc w:val="center"/>
+            </w:pPr>
+            <w:r>
+              <w:t xml:space="preserve">295</w:t>
+            </w:r>
+          </w:p>
+        </w:tc>
+        <w:tc>
+          <w:tcPr/>
+          <w:p>
+            <w:pPr>
+              <w:pStyle w:val="Compact"/>
+              <w:jc w:val="center"/>
+            </w:pPr>
+            <w:r>
+              <w:t xml:space="preserve">0.719</w:t>
+            </w:r>
+          </w:p>
+        </w:tc>
+        <w:tc>
+          <w:tcPr/>
+          <w:p>
+            <w:pPr>
+              <w:pStyle w:val="Compact"/>
+              <w:jc w:val="center"/>
+            </w:pPr>
+            <w:r>
+              <w:t xml:space="preserve">18/37 (49%)</w:t>
+            </w:r>
+          </w:p>
+        </w:tc>
+        <w:tc>
+          <w:tcPr/>
+          <w:p>
+            <w:pPr>
+              <w:pStyle w:val="Compact"/>
+              <w:jc w:val="center"/>
+            </w:pPr>
+            <w:r>
+              <w:t xml:space="preserve">10/48 (21%)</w:t>
+            </w:r>
+          </w:p>
+        </w:tc>
+        <w:tc>
+          <w:tcPr/>
+          <w:p>
+            <w:pPr>
+              <w:pStyle w:val="Compact"/>
+              <w:jc w:val="center"/>
+            </w:pPr>
+            <w:r>
+              <w:t xml:space="preserve">15/125 (12%)</w:t>
+            </w:r>
+          </w:p>
+        </w:tc>
+        <w:tc>
+          <w:tcPr/>
+          <w:p>
+            <w:pPr>
+              <w:pStyle w:val="Compact"/>
+              <w:jc w:val="center"/>
+            </w:pPr>
+            <w:r>
+              <w:t xml:space="preserve">0.152</w:t>
+            </w:r>
+          </w:p>
+        </w:tc>
+        <w:tc>
+          <w:tcPr/>
+          <w:p>
+            <w:pPr>
+              <w:pStyle w:val="Compact"/>
+              <w:jc w:val="center"/>
+            </w:pPr>
+            <w:r>
+              <w:t xml:space="preserve">1.03 / 0.23</w:t>
+            </w:r>
+          </w:p>
+        </w:tc>
+        <w:tc>
+          <w:tcPr/>
+          <w:p>
+            <w:pPr>
+              <w:pStyle w:val="Compact"/>
+              <w:jc w:val="center"/>
+            </w:pPr>
+            <w:r>
+              <w:t xml:space="preserve">28 (10)</w:t>
+            </w:r>
+          </w:p>
+        </w:tc>
+      </w:tr>
+      <w:tr>
+        <w:tc>
           <w:tcPr>
-            <w:gridSpan w:val="8"/>
+            <w:gridSpan w:val="9"/>
           </w:tcPr>
           <w:p>
             <w:pPr>
@@ -4565,7 +5114,19 @@
               <w:jc w:val="center"/>
             </w:pPr>
             <w:r>
-              <w:t xml:space="preserve">0.69 / 0.26</w:t>
+              <w:t xml:space="preserve">0.000</w:t>
+            </w:r>
+          </w:p>
+        </w:tc>
+        <w:tc>
+          <w:tcPr/>
+          <w:p>
+            <w:pPr>
+              <w:pStyle w:val="Compact"/>
+              <w:jc w:val="center"/>
+            </w:pPr>
+            <w:r>
+              <w:t xml:space="preserve">0.70 / 0.21</w:t>
             </w:r>
           </w:p>
         </w:tc>
@@ -4663,7 +5224,19 @@
               <w:jc w:val="center"/>
             </w:pPr>
             <w:r>
-              <w:t xml:space="preserve">0.64 / 0.18</w:t>
+              <w:t xml:space="preserve">0.000</w:t>
+            </w:r>
+          </w:p>
+        </w:tc>
+        <w:tc>
+          <w:tcPr/>
+          <w:p>
+            <w:pPr>
+              <w:pStyle w:val="Compact"/>
+              <w:jc w:val="center"/>
+            </w:pPr>
+            <w:r>
+              <w:t xml:space="preserve">0.62 / 0.17</w:t>
             </w:r>
           </w:p>
         </w:tc>
@@ -4761,7 +5334,19 @@
               <w:jc w:val="center"/>
             </w:pPr>
             <w:r>
-              <w:t xml:space="preserve">0.63 / 0.16</w:t>
+              <w:t xml:space="preserve">0.036</w:t>
+            </w:r>
+          </w:p>
+        </w:tc>
+        <w:tc>
+          <w:tcPr/>
+          <w:p>
+            <w:pPr>
+              <w:pStyle w:val="Compact"/>
+              <w:jc w:val="center"/>
+            </w:pPr>
+            <w:r>
+              <w:t xml:space="preserve">0.62 / 0.12</w:t>
             </w:r>
           </w:p>
         </w:tc>
@@ -4873,7 +5458,19 @@
               <w:jc w:val="center"/>
             </w:pPr>
             <w:r>
-              <w:t xml:space="preserve">0.75 / 0.31</w:t>
+              <w:t xml:space="preserve">0.000</w:t>
+            </w:r>
+          </w:p>
+        </w:tc>
+        <w:tc>
+          <w:tcPr/>
+          <w:p>
+            <w:pPr>
+              <w:pStyle w:val="Compact"/>
+              <w:jc w:val="center"/>
+            </w:pPr>
+            <w:r>
+              <w:t xml:space="preserve">0.94 / 0.32</w:t>
             </w:r>
           </w:p>
         </w:tc>
@@ -4886,6 +5483,116 @@
             </w:pPr>
             <w:r>
               <w:t xml:space="preserve">54 (7)</w:t>
+            </w:r>
+          </w:p>
+        </w:tc>
+      </w:tr>
+      <w:tr>
+        <w:tc>
+          <w:tcPr/>
+          <w:p>
+            <w:pPr>
+              <w:pStyle w:val="Compact"/>
+              <w:jc w:val="left"/>
+            </w:pPr>
+            <w:r>
+              <w:t xml:space="preserve">Exclusion; Canada from 2004</w:t>
+            </w:r>
+          </w:p>
+        </w:tc>
+        <w:tc>
+          <w:tcPr/>
+          <w:p>
+            <w:pPr>
+              <w:pStyle w:val="Compact"/>
+              <w:jc w:val="center"/>
+            </w:pPr>
+            <w:r>
+              <w:t xml:space="preserve">346</w:t>
+            </w:r>
+          </w:p>
+        </w:tc>
+        <w:tc>
+          <w:tcPr/>
+          <w:p>
+            <w:pPr>
+              <w:pStyle w:val="Compact"/>
+              <w:jc w:val="center"/>
+            </w:pPr>
+            <w:r>
+              <w:t xml:space="preserve">0.776</w:t>
+            </w:r>
+          </w:p>
+        </w:tc>
+        <w:tc>
+          <w:tcPr/>
+          <w:p>
+            <w:pPr>
+              <w:pStyle w:val="Compact"/>
+              <w:jc w:val="center"/>
+            </w:pPr>
+            <w:r>
+              <w:t xml:space="preserve">41/81 (51%)</w:t>
+            </w:r>
+          </w:p>
+        </w:tc>
+        <w:tc>
+          <w:tcPr/>
+          <w:p>
+            <w:pPr>
+              <w:pStyle w:val="Compact"/>
+              <w:jc w:val="center"/>
+            </w:pPr>
+            <w:r>
+              <w:t xml:space="preserve">14/44 (32%)</w:t>
+            </w:r>
+          </w:p>
+        </w:tc>
+        <w:tc>
+          <w:tcPr/>
+          <w:p>
+            <w:pPr>
+              <w:pStyle w:val="Compact"/>
+              <w:jc w:val="center"/>
+            </w:pPr>
+            <w:r>
+              <w:t xml:space="preserve">8/111 (7%)</w:t>
+            </w:r>
+          </w:p>
+        </w:tc>
+        <w:tc>
+          <w:tcPr/>
+          <w:p>
+            <w:pPr>
+              <w:pStyle w:val="Compact"/>
+              <w:jc w:val="center"/>
+            </w:pPr>
+            <w:r>
+              <w:t xml:space="preserve">0.000</w:t>
+            </w:r>
+          </w:p>
+        </w:tc>
+        <w:tc>
+          <w:tcPr/>
+          <w:p>
+            <w:pPr>
+              <w:pStyle w:val="Compact"/>
+              <w:jc w:val="center"/>
+            </w:pPr>
+            <w:r>
+              <w:t xml:space="preserve">0.72 / 0.29</w:t>
+            </w:r>
+          </w:p>
+        </w:tc>
+        <w:tc>
+          <w:tcPr/>
+          <w:p>
+            <w:pPr>
+              <w:pStyle w:val="Compact"/>
+              <w:jc w:val="center"/>
+            </w:pPr>
+            <w:r>
+              <w:t xml:space="preserve">55 (14)</w:t>
             </w:r>
           </w:p>
         </w:tc>
@@ -5989,7 +6696,7 @@
               <w:jc w:val="left"/>
             </w:pPr>
             <w:r>
-              <w:t xml:space="preserve">Tofacitinib</w:t>
+              <w:t xml:space="preserve">Insulin Aspart</w:t>
             </w:r>
           </w:p>
         </w:tc>
@@ -6013,31 +6720,31 @@
               <w:jc w:val="right"/>
             </w:pPr>
             <w:r>
-              <w:t xml:space="preserve">1728</w:t>
-            </w:r>
-          </w:p>
-        </w:tc>
-        <w:tc>
-          <w:tcPr/>
-          <w:p>
-            <w:pPr>
-              <w:pStyle w:val="Compact"/>
-              <w:jc w:val="center"/>
-            </w:pPr>
-            <w:r>
-              <w:t xml:space="preserve">3.27 (3.11–3.45)</w:t>
-            </w:r>
-          </w:p>
-        </w:tc>
-        <w:tc>
-          <w:tcPr/>
-          <w:p>
-            <w:pPr>
-              <w:pStyle w:val="Compact"/>
-              <w:jc w:val="center"/>
-            </w:pPr>
-            <w:r>
-              <w:t xml:space="preserve">1.39 (1.05–1.84)</w:t>
+              <w:t xml:space="preserve">250</w:t>
+            </w:r>
+          </w:p>
+        </w:tc>
+        <w:tc>
+          <w:tcPr/>
+          <w:p>
+            <w:pPr>
+              <w:pStyle w:val="Compact"/>
+              <w:jc w:val="center"/>
+            </w:pPr>
+            <w:r>
+              <w:t xml:space="preserve">2.27 (2.00–2.58)</w:t>
+            </w:r>
+          </w:p>
+        </w:tc>
+        <w:tc>
+          <w:tcPr/>
+          <w:p>
+            <w:pPr>
+              <w:pStyle w:val="Compact"/>
+              <w:jc w:val="center"/>
+            </w:pPr>
+            <w:r>
+              <w:t xml:space="preserve">2.69 (1.11–6.50)</w:t>
             </w:r>
           </w:p>
         </w:tc>
@@ -6061,7 +6768,7 @@
               <w:jc w:val="center"/>
             </w:pPr>
             <w:r>
-              <w:t xml:space="preserve">4%</w:t>
+              <w:t xml:space="preserve">5%</w:t>
             </w:r>
           </w:p>
         </w:tc>
@@ -6087,7 +6794,11 @@
               <w:jc w:val="left"/>
             </w:pPr>
             <w:r>
-              <w:t xml:space="preserve">Glycopyrrolate</w:t>
+              <w:rPr>
+                <w:b/>
+                <w:bCs/>
+              </w:rPr>
+              <w:t xml:space="preserve">Tofacitinib</w:t>
             </w:r>
           </w:p>
         </w:tc>
@@ -6111,129 +6822,31 @@
               <w:jc w:val="right"/>
             </w:pPr>
             <w:r>
-              <w:t xml:space="preserve">315</w:t>
-            </w:r>
-          </w:p>
-        </w:tc>
-        <w:tc>
-          <w:tcPr/>
-          <w:p>
-            <w:pPr>
-              <w:pStyle w:val="Compact"/>
-              <w:jc w:val="center"/>
-            </w:pPr>
-            <w:r>
-              <w:t xml:space="preserve">3.08 (2.74–3.45)</w:t>
-            </w:r>
-          </w:p>
-        </w:tc>
-        <w:tc>
-          <w:tcPr/>
-          <w:p>
-            <w:pPr>
-              <w:pStyle w:val="Compact"/>
-              <w:jc w:val="center"/>
-            </w:pPr>
-            <w:r>
-              <w:t xml:space="preserve">4.40 (1.82–10.67)</w:t>
-            </w:r>
-          </w:p>
-        </w:tc>
-        <w:tc>
-          <w:tcPr/>
-          <w:p>
-            <w:pPr>
-              <w:pStyle w:val="Compact"/>
-              <w:jc w:val="center"/>
-            </w:pPr>
-            <w:r>
-              <w:t xml:space="preserve">50%</w:t>
-            </w:r>
-          </w:p>
-        </w:tc>
-        <w:tc>
-          <w:tcPr/>
-          <w:p>
-            <w:pPr>
-              <w:pStyle w:val="Compact"/>
-              <w:jc w:val="center"/>
-            </w:pPr>
-            <w:r>
-              <w:t xml:space="preserve">3%</w:t>
-            </w:r>
-          </w:p>
-        </w:tc>
-        <w:tc>
-          <w:tcPr/>
-          <w:p>
-            <w:pPr>
-              <w:pStyle w:val="Compact"/>
-              <w:jc w:val="center"/>
-            </w:pPr>
-            <w:r>
-              <w:t xml:space="preserve">D</w:t>
-            </w:r>
-          </w:p>
-        </w:tc>
-      </w:tr>
-      <w:tr>
-        <w:tc>
-          <w:tcPr/>
-          <w:p>
-            <w:pPr>
-              <w:pStyle w:val="Compact"/>
-              <w:jc w:val="left"/>
-            </w:pPr>
-            <w:r>
-              <w:t xml:space="preserve">Insulin Aspart</w:t>
-            </w:r>
-          </w:p>
-        </w:tc>
-        <w:tc>
-          <w:tcPr/>
-          <w:p>
-            <w:pPr>
-              <w:pStyle w:val="Compact"/>
-              <w:jc w:val="left"/>
-            </w:pPr>
-            <w:r>
-              <w:t xml:space="preserve">HL</w:t>
-            </w:r>
-          </w:p>
-        </w:tc>
-        <w:tc>
-          <w:tcPr/>
-          <w:p>
-            <w:pPr>
-              <w:pStyle w:val="Compact"/>
-              <w:jc w:val="right"/>
-            </w:pPr>
-            <w:r>
-              <w:t xml:space="preserve">250</w:t>
-            </w:r>
-          </w:p>
-        </w:tc>
-        <w:tc>
-          <w:tcPr/>
-          <w:p>
-            <w:pPr>
-              <w:pStyle w:val="Compact"/>
-              <w:jc w:val="center"/>
-            </w:pPr>
-            <w:r>
-              <w:t xml:space="preserve">2.27 (2.00–2.58)</w:t>
-            </w:r>
-          </w:p>
-        </w:tc>
-        <w:tc>
-          <w:tcPr/>
-          <w:p>
-            <w:pPr>
-              <w:pStyle w:val="Compact"/>
-              <w:jc w:val="center"/>
-            </w:pPr>
-            <w:r>
-              <w:t xml:space="preserve">2.69 (1.11–6.50)</w:t>
+              <w:t xml:space="preserve">1728</w:t>
+            </w:r>
+          </w:p>
+        </w:tc>
+        <w:tc>
+          <w:tcPr/>
+          <w:p>
+            <w:pPr>
+              <w:pStyle w:val="Compact"/>
+              <w:jc w:val="center"/>
+            </w:pPr>
+            <w:r>
+              <w:t xml:space="preserve">3.27 (3.11–3.45)</w:t>
+            </w:r>
+          </w:p>
+        </w:tc>
+        <w:tc>
+          <w:tcPr/>
+          <w:p>
+            <w:pPr>
+              <w:pStyle w:val="Compact"/>
+              <w:jc w:val="center"/>
+            </w:pPr>
+            <w:r>
+              <w:t xml:space="preserve">1.39 (1.05–1.84)</w:t>
             </w:r>
           </w:p>
         </w:tc>
@@ -6257,117 +6870,19 @@
               <w:jc w:val="center"/>
             </w:pPr>
             <w:r>
-              <w:t xml:space="preserve">5%</w:t>
-            </w:r>
-          </w:p>
-        </w:tc>
-        <w:tc>
-          <w:tcPr/>
-          <w:p>
-            <w:pPr>
-              <w:pStyle w:val="Compact"/>
-              <w:jc w:val="center"/>
-            </w:pPr>
-            <w:r>
-              <w:t xml:space="preserve">D</w:t>
-            </w:r>
-          </w:p>
-        </w:tc>
-      </w:tr>
-      <w:tr>
-        <w:tc>
-          <w:tcPr/>
-          <w:p>
-            <w:pPr>
-              <w:pStyle w:val="Compact"/>
-              <w:jc w:val="left"/>
-            </w:pPr>
-            <w:r>
-              <w:t xml:space="preserve">Travoprost</w:t>
-            </w:r>
-          </w:p>
-        </w:tc>
-        <w:tc>
-          <w:tcPr/>
-          <w:p>
-            <w:pPr>
-              <w:pStyle w:val="Compact"/>
-              <w:jc w:val="left"/>
-            </w:pPr>
-            <w:r>
-              <w:t xml:space="preserve">HL</w:t>
-            </w:r>
-          </w:p>
-        </w:tc>
-        <w:tc>
-          <w:tcPr/>
-          <w:p>
-            <w:pPr>
-              <w:pStyle w:val="Compact"/>
-              <w:jc w:val="right"/>
-            </w:pPr>
-            <w:r>
-              <w:t xml:space="preserve">140</w:t>
-            </w:r>
-          </w:p>
-        </w:tc>
-        <w:tc>
-          <w:tcPr/>
-          <w:p>
-            <w:pPr>
-              <w:pStyle w:val="Compact"/>
-              <w:jc w:val="center"/>
-            </w:pPr>
-            <w:r>
-              <w:t xml:space="preserve">3.71 (3.13–4.40)</w:t>
-            </w:r>
-          </w:p>
-        </w:tc>
-        <w:tc>
-          <w:tcPr/>
-          <w:p>
-            <w:pPr>
-              <w:pStyle w:val="Compact"/>
-              <w:jc w:val="center"/>
-            </w:pPr>
-            <w:r>
-              <w:t xml:space="preserve">4.96 (1.58–15.54)</w:t>
-            </w:r>
-          </w:p>
-        </w:tc>
-        <w:tc>
-          <w:tcPr/>
-          <w:p>
-            <w:pPr>
-              <w:pStyle w:val="Compact"/>
-              <w:jc w:val="center"/>
-            </w:pPr>
-            <w:r>
-              <w:t xml:space="preserve">75%</w:t>
-            </w:r>
-          </w:p>
-        </w:tc>
-        <w:tc>
-          <w:tcPr/>
-          <w:p>
-            <w:pPr>
-              <w:pStyle w:val="Compact"/>
-              <w:jc w:val="center"/>
-            </w:pPr>
-            <w:r>
-              <w:t xml:space="preserve">0%</w:t>
-            </w:r>
-          </w:p>
-        </w:tc>
-        <w:tc>
-          <w:tcPr/>
-          <w:p>
-            <w:pPr>
-              <w:pStyle w:val="Compact"/>
-              <w:jc w:val="center"/>
-            </w:pPr>
-            <w:r>
-              <w:t xml:space="preserve">D</w:t>
+              <w:t xml:space="preserve">4%</w:t>
+            </w:r>
+          </w:p>
+        </w:tc>
+        <w:tc>
+          <w:tcPr/>
+          <w:p>
+            <w:pPr>
+              <w:pStyle w:val="Compact"/>
+              <w:jc w:val="center"/>
+            </w:pPr>
+            <w:r>
+              <w:t xml:space="preserve">E</w:t>
             </w:r>
           </w:p>
         </w:tc>
@@ -6585,7 +7100,11 @@
               <w:jc w:val="left"/>
             </w:pPr>
             <w:r>
-              <w:t xml:space="preserve">Candesartan</w:t>
+              <w:rPr>
+                <w:b/>
+                <w:bCs/>
+              </w:rPr>
+              <w:t xml:space="preserve">Glycopyrrolate</w:t>
             </w:r>
           </w:p>
         </w:tc>
@@ -6597,7 +7116,7 @@
               <w:jc w:val="left"/>
             </w:pPr>
             <w:r>
-              <w:t xml:space="preserve">Tin</w:t>
+              <w:t xml:space="preserve">HL</w:t>
             </w:r>
           </w:p>
         </w:tc>
@@ -6609,67 +7128,67 @@
               <w:jc w:val="right"/>
             </w:pPr>
             <w:r>
-              <w:t xml:space="preserve">422</w:t>
-            </w:r>
-          </w:p>
-        </w:tc>
-        <w:tc>
-          <w:tcPr/>
-          <w:p>
-            <w:pPr>
-              <w:pStyle w:val="Compact"/>
-              <w:jc w:val="center"/>
-            </w:pPr>
-            <w:r>
-              <w:t xml:space="preserve">11.72 (10.40–13.22)</w:t>
-            </w:r>
-          </w:p>
-        </w:tc>
-        <w:tc>
-          <w:tcPr/>
-          <w:p>
-            <w:pPr>
-              <w:pStyle w:val="Compact"/>
-              <w:jc w:val="center"/>
-            </w:pPr>
-            <w:r>
-              <w:t xml:space="preserve">2.80 (1.68–4.68)</w:t>
-            </w:r>
-          </w:p>
-        </w:tc>
-        <w:tc>
-          <w:tcPr/>
-          <w:p>
-            <w:pPr>
-              <w:pStyle w:val="Compact"/>
-              <w:jc w:val="center"/>
-            </w:pPr>
-            <w:r>
-              <w:t xml:space="preserve">38%</w:t>
-            </w:r>
-          </w:p>
-        </w:tc>
-        <w:tc>
-          <w:tcPr/>
-          <w:p>
-            <w:pPr>
-              <w:pStyle w:val="Compact"/>
-              <w:jc w:val="center"/>
-            </w:pPr>
-            <w:r>
-              <w:t xml:space="preserve">83%</w:t>
-            </w:r>
-          </w:p>
-        </w:tc>
-        <w:tc>
-          <w:tcPr/>
-          <w:p>
-            <w:pPr>
-              <w:pStyle w:val="Compact"/>
-              <w:jc w:val="center"/>
-            </w:pPr>
-            <w:r>
-              <w:t xml:space="preserve">A</w:t>
+              <w:t xml:space="preserve">315</w:t>
+            </w:r>
+          </w:p>
+        </w:tc>
+        <w:tc>
+          <w:tcPr/>
+          <w:p>
+            <w:pPr>
+              <w:pStyle w:val="Compact"/>
+              <w:jc w:val="center"/>
+            </w:pPr>
+            <w:r>
+              <w:t xml:space="preserve">3.08 (2.74–3.45)</w:t>
+            </w:r>
+          </w:p>
+        </w:tc>
+        <w:tc>
+          <w:tcPr/>
+          <w:p>
+            <w:pPr>
+              <w:pStyle w:val="Compact"/>
+              <w:jc w:val="center"/>
+            </w:pPr>
+            <w:r>
+              <w:t xml:space="preserve">4.40 (1.82–10.67)</w:t>
+            </w:r>
+          </w:p>
+        </w:tc>
+        <w:tc>
+          <w:tcPr/>
+          <w:p>
+            <w:pPr>
+              <w:pStyle w:val="Compact"/>
+              <w:jc w:val="center"/>
+            </w:pPr>
+            <w:r>
+              <w:t xml:space="preserve">50%</w:t>
+            </w:r>
+          </w:p>
+        </w:tc>
+        <w:tc>
+          <w:tcPr/>
+          <w:p>
+            <w:pPr>
+              <w:pStyle w:val="Compact"/>
+              <w:jc w:val="center"/>
+            </w:pPr>
+            <w:r>
+              <w:t xml:space="preserve">3%</w:t>
+            </w:r>
+          </w:p>
+        </w:tc>
+        <w:tc>
+          <w:tcPr/>
+          <w:p>
+            <w:pPr>
+              <w:pStyle w:val="Compact"/>
+              <w:jc w:val="center"/>
+            </w:pPr>
+            <w:r>
+              <w:t xml:space="preserve">E</w:t>
             </w:r>
           </w:p>
         </w:tc>
@@ -6683,7 +7202,11 @@
               <w:jc w:val="left"/>
             </w:pPr>
             <w:r>
-              <w:t xml:space="preserve">Propranolol</w:t>
+              <w:rPr>
+                <w:b/>
+                <w:bCs/>
+              </w:rPr>
+              <w:t xml:space="preserve">Travoprost</w:t>
             </w:r>
           </w:p>
         </w:tc>
@@ -6695,7 +7218,7 @@
               <w:jc w:val="left"/>
             </w:pPr>
             <w:r>
-              <w:t xml:space="preserve">Tin</w:t>
+              <w:t xml:space="preserve">HL</w:t>
             </w:r>
           </w:p>
         </w:tc>
@@ -6707,67 +7230,67 @@
               <w:jc w:val="right"/>
             </w:pPr>
             <w:r>
-              <w:t xml:space="preserve">189</w:t>
-            </w:r>
-          </w:p>
-        </w:tc>
-        <w:tc>
-          <w:tcPr/>
-          <w:p>
-            <w:pPr>
-              <w:pStyle w:val="Compact"/>
-              <w:jc w:val="center"/>
-            </w:pPr>
-            <w:r>
-              <w:t xml:space="preserve">1.79 (1.40–2.28)</w:t>
-            </w:r>
-          </w:p>
-        </w:tc>
-        <w:tc>
-          <w:tcPr/>
-          <w:p>
-            <w:pPr>
-              <w:pStyle w:val="Compact"/>
-              <w:jc w:val="center"/>
-            </w:pPr>
-            <w:r>
-              <w:t xml:space="preserve">2.31 (1.03–5.17)</w:t>
-            </w:r>
-          </w:p>
-        </w:tc>
-        <w:tc>
-          <w:tcPr/>
-          <w:p>
-            <w:pPr>
-              <w:pStyle w:val="Compact"/>
-              <w:jc w:val="center"/>
-            </w:pPr>
-            <w:r>
-              <w:t xml:space="preserve">24%</w:t>
-            </w:r>
-          </w:p>
-        </w:tc>
-        <w:tc>
-          <w:tcPr/>
-          <w:p>
-            <w:pPr>
-              <w:pStyle w:val="Compact"/>
-              <w:jc w:val="center"/>
-            </w:pPr>
-            <w:r>
-              <w:t xml:space="preserve">66%</w:t>
-            </w:r>
-          </w:p>
-        </w:tc>
-        <w:tc>
-          <w:tcPr/>
-          <w:p>
-            <w:pPr>
-              <w:pStyle w:val="Compact"/>
-              <w:jc w:val="center"/>
-            </w:pPr>
-            <w:r>
-              <w:t xml:space="preserve">A</w:t>
+              <w:t xml:space="preserve">140</w:t>
+            </w:r>
+          </w:p>
+        </w:tc>
+        <w:tc>
+          <w:tcPr/>
+          <w:p>
+            <w:pPr>
+              <w:pStyle w:val="Compact"/>
+              <w:jc w:val="center"/>
+            </w:pPr>
+            <w:r>
+              <w:t xml:space="preserve">3.71 (3.13–4.40)</w:t>
+            </w:r>
+          </w:p>
+        </w:tc>
+        <w:tc>
+          <w:tcPr/>
+          <w:p>
+            <w:pPr>
+              <w:pStyle w:val="Compact"/>
+              <w:jc w:val="center"/>
+            </w:pPr>
+            <w:r>
+              <w:t xml:space="preserve">4.96 (1.58–15.54)</w:t>
+            </w:r>
+          </w:p>
+        </w:tc>
+        <w:tc>
+          <w:tcPr/>
+          <w:p>
+            <w:pPr>
+              <w:pStyle w:val="Compact"/>
+              <w:jc w:val="center"/>
+            </w:pPr>
+            <w:r>
+              <w:t xml:space="preserve">75%</w:t>
+            </w:r>
+          </w:p>
+        </w:tc>
+        <w:tc>
+          <w:tcPr/>
+          <w:p>
+            <w:pPr>
+              <w:pStyle w:val="Compact"/>
+              <w:jc w:val="center"/>
+            </w:pPr>
+            <w:r>
+              <w:t xml:space="preserve">0%</w:t>
+            </w:r>
+          </w:p>
+        </w:tc>
+        <w:tc>
+          <w:tcPr/>
+          <w:p>
+            <w:pPr>
+              <w:pStyle w:val="Compact"/>
+              <w:jc w:val="center"/>
+            </w:pPr>
+            <w:r>
+              <w:t xml:space="preserve">E</w:t>
             </w:r>
           </w:p>
         </w:tc>
@@ -6781,7 +7304,7 @@
               <w:jc w:val="left"/>
             </w:pPr>
             <w:r>
-              <w:t xml:space="preserve">Tozinameran</w:t>
+              <w:t xml:space="preserve">Candesartan</w:t>
             </w:r>
           </w:p>
         </w:tc>
@@ -6805,55 +7328,55 @@
               <w:jc w:val="right"/>
             </w:pPr>
             <w:r>
-              <w:t xml:space="preserve">109</w:t>
-            </w:r>
-          </w:p>
-        </w:tc>
-        <w:tc>
-          <w:tcPr/>
-          <w:p>
-            <w:pPr>
-              <w:pStyle w:val="Compact"/>
-              <w:jc w:val="center"/>
-            </w:pPr>
-            <w:r>
-              <w:t xml:space="preserve">6.53 (5.01–8.50)</w:t>
-            </w:r>
-          </w:p>
-        </w:tc>
-        <w:tc>
-          <w:tcPr/>
-          <w:p>
-            <w:pPr>
-              <w:pStyle w:val="Compact"/>
-              <w:jc w:val="center"/>
-            </w:pPr>
-            <w:r>
-              <w:t xml:space="preserve">10.11 (8.46–12.07)</w:t>
-            </w:r>
-          </w:p>
-        </w:tc>
-        <w:tc>
-          <w:tcPr/>
-          <w:p>
-            <w:pPr>
-              <w:pStyle w:val="Compact"/>
-              <w:jc w:val="center"/>
-            </w:pPr>
-            <w:r>
-              <w:t xml:space="preserve">46%</w:t>
-            </w:r>
-          </w:p>
-        </w:tc>
-        <w:tc>
-          <w:tcPr/>
-          <w:p>
-            <w:pPr>
-              <w:pStyle w:val="Compact"/>
-              <w:jc w:val="center"/>
-            </w:pPr>
-            <w:r>
-              <w:t xml:space="preserve">51%</w:t>
+              <w:t xml:space="preserve">422</w:t>
+            </w:r>
+          </w:p>
+        </w:tc>
+        <w:tc>
+          <w:tcPr/>
+          <w:p>
+            <w:pPr>
+              <w:pStyle w:val="Compact"/>
+              <w:jc w:val="center"/>
+            </w:pPr>
+            <w:r>
+              <w:t xml:space="preserve">11.72 (10.40–13.22)</w:t>
+            </w:r>
+          </w:p>
+        </w:tc>
+        <w:tc>
+          <w:tcPr/>
+          <w:p>
+            <w:pPr>
+              <w:pStyle w:val="Compact"/>
+              <w:jc w:val="center"/>
+            </w:pPr>
+            <w:r>
+              <w:t xml:space="preserve">2.80 (1.68–4.68)</w:t>
+            </w:r>
+          </w:p>
+        </w:tc>
+        <w:tc>
+          <w:tcPr/>
+          <w:p>
+            <w:pPr>
+              <w:pStyle w:val="Compact"/>
+              <w:jc w:val="center"/>
+            </w:pPr>
+            <w:r>
+              <w:t xml:space="preserve">38%</w:t>
+            </w:r>
+          </w:p>
+        </w:tc>
+        <w:tc>
+          <w:tcPr/>
+          <w:p>
+            <w:pPr>
+              <w:pStyle w:val="Compact"/>
+              <w:jc w:val="center"/>
+            </w:pPr>
+            <w:r>
+              <w:t xml:space="preserve">83%</w:t>
             </w:r>
           </w:p>
         </w:tc>
@@ -6879,7 +7402,7 @@
               <w:jc w:val="left"/>
             </w:pPr>
             <w:r>
-              <w:t xml:space="preserve">Indapamide</w:t>
+              <w:t xml:space="preserve">Propranolol</w:t>
             </w:r>
           </w:p>
         </w:tc>
@@ -6903,55 +7426,55 @@
               <w:jc w:val="right"/>
             </w:pPr>
             <w:r>
-              <w:t xml:space="preserve">44</w:t>
-            </w:r>
-          </w:p>
-        </w:tc>
-        <w:tc>
-          <w:tcPr/>
-          <w:p>
-            <w:pPr>
-              <w:pStyle w:val="Compact"/>
-              <w:jc w:val="center"/>
-            </w:pPr>
-            <w:r>
-              <w:t xml:space="preserve">2.05 (1.29–3.26)</w:t>
-            </w:r>
-          </w:p>
-        </w:tc>
-        <w:tc>
-          <w:tcPr/>
-          <w:p>
-            <w:pPr>
-              <w:pStyle w:val="Compact"/>
-              <w:jc w:val="center"/>
-            </w:pPr>
-            <w:r>
-              <w:t xml:space="preserve">3.44 (1.53–7.71)</w:t>
-            </w:r>
-          </w:p>
-        </w:tc>
-        <w:tc>
-          <w:tcPr/>
-          <w:p>
-            <w:pPr>
-              <w:pStyle w:val="Compact"/>
-              <w:jc w:val="center"/>
-            </w:pPr>
-            <w:r>
-              <w:t xml:space="preserve">18%</w:t>
-            </w:r>
-          </w:p>
-        </w:tc>
-        <w:tc>
-          <w:tcPr/>
-          <w:p>
-            <w:pPr>
-              <w:pStyle w:val="Compact"/>
-              <w:jc w:val="center"/>
-            </w:pPr>
-            <w:r>
-              <w:t xml:space="preserve">55%</w:t>
+              <w:t xml:space="preserve">189</w:t>
+            </w:r>
+          </w:p>
+        </w:tc>
+        <w:tc>
+          <w:tcPr/>
+          <w:p>
+            <w:pPr>
+              <w:pStyle w:val="Compact"/>
+              <w:jc w:val="center"/>
+            </w:pPr>
+            <w:r>
+              <w:t xml:space="preserve">1.79 (1.40–2.28)</w:t>
+            </w:r>
+          </w:p>
+        </w:tc>
+        <w:tc>
+          <w:tcPr/>
+          <w:p>
+            <w:pPr>
+              <w:pStyle w:val="Compact"/>
+              <w:jc w:val="center"/>
+            </w:pPr>
+            <w:r>
+              <w:t xml:space="preserve">2.31 (1.03–5.17)</w:t>
+            </w:r>
+          </w:p>
+        </w:tc>
+        <w:tc>
+          <w:tcPr/>
+          <w:p>
+            <w:pPr>
+              <w:pStyle w:val="Compact"/>
+              <w:jc w:val="center"/>
+            </w:pPr>
+            <w:r>
+              <w:t xml:space="preserve">24%</w:t>
+            </w:r>
+          </w:p>
+        </w:tc>
+        <w:tc>
+          <w:tcPr/>
+          <w:p>
+            <w:pPr>
+              <w:pStyle w:val="Compact"/>
+              <w:jc w:val="center"/>
+            </w:pPr>
+            <w:r>
+              <w:t xml:space="preserve">66%</w:t>
             </w:r>
           </w:p>
         </w:tc>
@@ -6977,7 +7500,7 @@
               <w:jc w:val="left"/>
             </w:pPr>
             <w:r>
-              <w:t xml:space="preserve">Finasteride</w:t>
+              <w:t xml:space="preserve">Tozinameran</w:t>
             </w:r>
           </w:p>
         </w:tc>
@@ -7001,67 +7524,67 @@
               <w:jc w:val="right"/>
             </w:pPr>
             <w:r>
-              <w:t xml:space="preserve">293</w:t>
-            </w:r>
-          </w:p>
-        </w:tc>
-        <w:tc>
-          <w:tcPr/>
-          <w:p>
-            <w:pPr>
-              <w:pStyle w:val="Compact"/>
-              <w:jc w:val="center"/>
-            </w:pPr>
-            <w:r>
-              <w:t xml:space="preserve">9.73 (8.63–10.95)</w:t>
-            </w:r>
-          </w:p>
-        </w:tc>
-        <w:tc>
-          <w:tcPr/>
-          <w:p>
-            <w:pPr>
-              <w:pStyle w:val="Compact"/>
-              <w:jc w:val="center"/>
-            </w:pPr>
-            <w:r>
-              <w:t xml:space="preserve">3.04 (1.26–7.37)</w:t>
-            </w:r>
-          </w:p>
-        </w:tc>
-        <w:tc>
-          <w:tcPr/>
-          <w:p>
-            <w:pPr>
-              <w:pStyle w:val="Compact"/>
-              <w:jc w:val="center"/>
-            </w:pPr>
-            <w:r>
-              <w:t xml:space="preserve">60%</w:t>
-            </w:r>
-          </w:p>
-        </w:tc>
-        <w:tc>
-          <w:tcPr/>
-          <w:p>
-            <w:pPr>
-              <w:pStyle w:val="Compact"/>
-              <w:jc w:val="center"/>
-            </w:pPr>
-            <w:r>
-              <w:t xml:space="preserve">0%</w:t>
-            </w:r>
-          </w:p>
-        </w:tc>
-        <w:tc>
-          <w:tcPr/>
-          <w:p>
-            <w:pPr>
-              <w:pStyle w:val="Compact"/>
-              <w:jc w:val="center"/>
-            </w:pPr>
-            <w:r>
-              <w:t xml:space="preserve">C</w:t>
+              <w:t xml:space="preserve">109</w:t>
+            </w:r>
+          </w:p>
+        </w:tc>
+        <w:tc>
+          <w:tcPr/>
+          <w:p>
+            <w:pPr>
+              <w:pStyle w:val="Compact"/>
+              <w:jc w:val="center"/>
+            </w:pPr>
+            <w:r>
+              <w:t xml:space="preserve">6.53 (5.01–8.50)</w:t>
+            </w:r>
+          </w:p>
+        </w:tc>
+        <w:tc>
+          <w:tcPr/>
+          <w:p>
+            <w:pPr>
+              <w:pStyle w:val="Compact"/>
+              <w:jc w:val="center"/>
+            </w:pPr>
+            <w:r>
+              <w:t xml:space="preserve">10.11 (8.46–12.07)</w:t>
+            </w:r>
+          </w:p>
+        </w:tc>
+        <w:tc>
+          <w:tcPr/>
+          <w:p>
+            <w:pPr>
+              <w:pStyle w:val="Compact"/>
+              <w:jc w:val="center"/>
+            </w:pPr>
+            <w:r>
+              <w:t xml:space="preserve">46%</w:t>
+            </w:r>
+          </w:p>
+        </w:tc>
+        <w:tc>
+          <w:tcPr/>
+          <w:p>
+            <w:pPr>
+              <w:pStyle w:val="Compact"/>
+              <w:jc w:val="center"/>
+            </w:pPr>
+            <w:r>
+              <w:t xml:space="preserve">51%</w:t>
+            </w:r>
+          </w:p>
+        </w:tc>
+        <w:tc>
+          <w:tcPr/>
+          <w:p>
+            <w:pPr>
+              <w:pStyle w:val="Compact"/>
+              <w:jc w:val="center"/>
+            </w:pPr>
+            <w:r>
+              <w:t xml:space="preserve">A</w:t>
             </w:r>
           </w:p>
         </w:tc>
@@ -7075,7 +7598,7 @@
               <w:jc w:val="left"/>
             </w:pPr>
             <w:r>
-              <w:t xml:space="preserve">Rofecoxib</w:t>
+              <w:t xml:space="preserve">Indapamide</w:t>
             </w:r>
           </w:p>
         </w:tc>
@@ -7099,67 +7622,67 @@
               <w:jc w:val="right"/>
             </w:pPr>
             <w:r>
-              <w:t xml:space="preserve">189</w:t>
-            </w:r>
-          </w:p>
-        </w:tc>
-        <w:tc>
-          <w:tcPr/>
-          <w:p>
-            <w:pPr>
-              <w:pStyle w:val="Compact"/>
-              <w:jc w:val="center"/>
-            </w:pPr>
-            <w:r>
-              <w:t xml:space="preserve">2.53 (2.13–3.02)</w:t>
-            </w:r>
-          </w:p>
-        </w:tc>
-        <w:tc>
-          <w:tcPr/>
-          <w:p>
-            <w:pPr>
-              <w:pStyle w:val="Compact"/>
-              <w:jc w:val="center"/>
-            </w:pPr>
-            <w:r>
-              <w:t xml:space="preserve">2.26 (1.12–4.54)</w:t>
-            </w:r>
-          </w:p>
-        </w:tc>
-        <w:tc>
-          <w:tcPr/>
-          <w:p>
-            <w:pPr>
-              <w:pStyle w:val="Compact"/>
-              <w:jc w:val="center"/>
-            </w:pPr>
-            <w:r>
-              <w:t xml:space="preserve">8%</w:t>
-            </w:r>
-          </w:p>
-        </w:tc>
-        <w:tc>
-          <w:tcPr/>
-          <w:p>
-            <w:pPr>
-              <w:pStyle w:val="Compact"/>
-              <w:jc w:val="center"/>
-            </w:pPr>
-            <w:r>
-              <w:t xml:space="preserve">21%</w:t>
-            </w:r>
-          </w:p>
-        </w:tc>
-        <w:tc>
-          <w:tcPr/>
-          <w:p>
-            <w:pPr>
-              <w:pStyle w:val="Compact"/>
-              <w:jc w:val="center"/>
-            </w:pPr>
-            <w:r>
-              <w:t xml:space="preserve">C</w:t>
+              <w:t xml:space="preserve">44</w:t>
+            </w:r>
+          </w:p>
+        </w:tc>
+        <w:tc>
+          <w:tcPr/>
+          <w:p>
+            <w:pPr>
+              <w:pStyle w:val="Compact"/>
+              <w:jc w:val="center"/>
+            </w:pPr>
+            <w:r>
+              <w:t xml:space="preserve">2.05 (1.29–3.26)</w:t>
+            </w:r>
+          </w:p>
+        </w:tc>
+        <w:tc>
+          <w:tcPr/>
+          <w:p>
+            <w:pPr>
+              <w:pStyle w:val="Compact"/>
+              <w:jc w:val="center"/>
+            </w:pPr>
+            <w:r>
+              <w:t xml:space="preserve">3.44 (1.53–7.71)</w:t>
+            </w:r>
+          </w:p>
+        </w:tc>
+        <w:tc>
+          <w:tcPr/>
+          <w:p>
+            <w:pPr>
+              <w:pStyle w:val="Compact"/>
+              <w:jc w:val="center"/>
+            </w:pPr>
+            <w:r>
+              <w:t xml:space="preserve">18%</w:t>
+            </w:r>
+          </w:p>
+        </w:tc>
+        <w:tc>
+          <w:tcPr/>
+          <w:p>
+            <w:pPr>
+              <w:pStyle w:val="Compact"/>
+              <w:jc w:val="center"/>
+            </w:pPr>
+            <w:r>
+              <w:t xml:space="preserve">55%</w:t>
+            </w:r>
+          </w:p>
+        </w:tc>
+        <w:tc>
+          <w:tcPr/>
+          <w:p>
+            <w:pPr>
+              <w:pStyle w:val="Compact"/>
+              <w:jc w:val="center"/>
+            </w:pPr>
+            <w:r>
+              <w:t xml:space="preserve">A</w:t>
             </w:r>
           </w:p>
         </w:tc>
@@ -7173,7 +7696,7 @@
               <w:jc w:val="left"/>
             </w:pPr>
             <w:r>
-              <w:t xml:space="preserve">Elasomeran</w:t>
+              <w:t xml:space="preserve">Finasteride</w:t>
             </w:r>
           </w:p>
         </w:tc>
@@ -7197,55 +7720,55 @@
               <w:jc w:val="right"/>
             </w:pPr>
             <w:r>
-              <w:t xml:space="preserve">13</w:t>
-            </w:r>
-          </w:p>
-        </w:tc>
-        <w:tc>
-          <w:tcPr/>
-          <w:p>
-            <w:pPr>
-              <w:pStyle w:val="Compact"/>
-              <w:jc w:val="center"/>
-            </w:pPr>
-            <w:r>
-              <w:t xml:space="preserve">3.62 (1.94–6.74)</w:t>
-            </w:r>
-          </w:p>
-        </w:tc>
-        <w:tc>
-          <w:tcPr/>
-          <w:p>
-            <w:pPr>
-              <w:pStyle w:val="Compact"/>
-              <w:jc w:val="center"/>
-            </w:pPr>
-            <w:r>
-              <w:t xml:space="preserve">3.50 (2.26–5.43)</w:t>
-            </w:r>
-          </w:p>
-        </w:tc>
-        <w:tc>
-          <w:tcPr/>
-          <w:p>
-            <w:pPr>
-              <w:pStyle w:val="Compact"/>
-              <w:jc w:val="center"/>
-            </w:pPr>
-            <w:r>
-              <w:t xml:space="preserve">69%</w:t>
-            </w:r>
-          </w:p>
-        </w:tc>
-        <w:tc>
-          <w:tcPr/>
-          <w:p>
-            <w:pPr>
-              <w:pStyle w:val="Compact"/>
-              <w:jc w:val="center"/>
-            </w:pPr>
-            <w:r>
-              <w:t xml:space="preserve">31%</w:t>
+              <w:t xml:space="preserve">293</w:t>
+            </w:r>
+          </w:p>
+        </w:tc>
+        <w:tc>
+          <w:tcPr/>
+          <w:p>
+            <w:pPr>
+              <w:pStyle w:val="Compact"/>
+              <w:jc w:val="center"/>
+            </w:pPr>
+            <w:r>
+              <w:t xml:space="preserve">9.73 (8.63–10.95)</w:t>
+            </w:r>
+          </w:p>
+        </w:tc>
+        <w:tc>
+          <w:tcPr/>
+          <w:p>
+            <w:pPr>
+              <w:pStyle w:val="Compact"/>
+              <w:jc w:val="center"/>
+            </w:pPr>
+            <w:r>
+              <w:t xml:space="preserve">3.04 (1.26–7.37)</w:t>
+            </w:r>
+          </w:p>
+        </w:tc>
+        <w:tc>
+          <w:tcPr/>
+          <w:p>
+            <w:pPr>
+              <w:pStyle w:val="Compact"/>
+              <w:jc w:val="center"/>
+            </w:pPr>
+            <w:r>
+              <w:t xml:space="preserve">60%</w:t>
+            </w:r>
+          </w:p>
+        </w:tc>
+        <w:tc>
+          <w:tcPr/>
+          <w:p>
+            <w:pPr>
+              <w:pStyle w:val="Compact"/>
+              <w:jc w:val="center"/>
+            </w:pPr>
+            <w:r>
+              <w:t xml:space="preserve">0%</w:t>
             </w:r>
           </w:p>
         </w:tc>
@@ -7271,7 +7794,7 @@
               <w:jc w:val="left"/>
             </w:pPr>
             <w:r>
-              <w:t xml:space="preserve">Galcanezumab</w:t>
+              <w:t xml:space="preserve">Rofecoxib</w:t>
             </w:r>
           </w:p>
         </w:tc>
@@ -7295,67 +7818,67 @@
               <w:jc w:val="right"/>
             </w:pPr>
             <w:r>
-              <w:t xml:space="preserve">96</w:t>
-            </w:r>
-          </w:p>
-        </w:tc>
-        <w:tc>
-          <w:tcPr/>
-          <w:p>
-            <w:pPr>
-              <w:pStyle w:val="Compact"/>
-              <w:jc w:val="center"/>
-            </w:pPr>
-            <w:r>
-              <w:t xml:space="preserve">1.86 (1.52–2.28)</w:t>
-            </w:r>
-          </w:p>
-        </w:tc>
-        <w:tc>
-          <w:tcPr/>
-          <w:p>
-            <w:pPr>
-              <w:pStyle w:val="Compact"/>
-              <w:jc w:val="center"/>
-            </w:pPr>
-            <w:r>
-              <w:t xml:space="preserve">16.70 (6.73–41.48)</w:t>
-            </w:r>
-          </w:p>
-        </w:tc>
-        <w:tc>
-          <w:tcPr/>
-          <w:p>
-            <w:pPr>
-              <w:pStyle w:val="Compact"/>
-              <w:jc w:val="center"/>
-            </w:pPr>
-            <w:r>
-              <w:t xml:space="preserve">88%</w:t>
-            </w:r>
-          </w:p>
-        </w:tc>
-        <w:tc>
-          <w:tcPr/>
-          <w:p>
-            <w:pPr>
-              <w:pStyle w:val="Compact"/>
-              <w:jc w:val="center"/>
-            </w:pPr>
-            <w:r>
-              <w:t xml:space="preserve">0%</w:t>
-            </w:r>
-          </w:p>
-        </w:tc>
-        <w:tc>
-          <w:tcPr/>
-          <w:p>
-            <w:pPr>
-              <w:pStyle w:val="Compact"/>
-              <w:jc w:val="center"/>
-            </w:pPr>
-            <w:r>
-              <w:t xml:space="preserve">D</w:t>
+              <w:t xml:space="preserve">189</w:t>
+            </w:r>
+          </w:p>
+        </w:tc>
+        <w:tc>
+          <w:tcPr/>
+          <w:p>
+            <w:pPr>
+              <w:pStyle w:val="Compact"/>
+              <w:jc w:val="center"/>
+            </w:pPr>
+            <w:r>
+              <w:t xml:space="preserve">2.53 (2.13–3.02)</w:t>
+            </w:r>
+          </w:p>
+        </w:tc>
+        <w:tc>
+          <w:tcPr/>
+          <w:p>
+            <w:pPr>
+              <w:pStyle w:val="Compact"/>
+              <w:jc w:val="center"/>
+            </w:pPr>
+            <w:r>
+              <w:t xml:space="preserve">2.26 (1.12–4.54)</w:t>
+            </w:r>
+          </w:p>
+        </w:tc>
+        <w:tc>
+          <w:tcPr/>
+          <w:p>
+            <w:pPr>
+              <w:pStyle w:val="Compact"/>
+              <w:jc w:val="center"/>
+            </w:pPr>
+            <w:r>
+              <w:t xml:space="preserve">8%</w:t>
+            </w:r>
+          </w:p>
+        </w:tc>
+        <w:tc>
+          <w:tcPr/>
+          <w:p>
+            <w:pPr>
+              <w:pStyle w:val="Compact"/>
+              <w:jc w:val="center"/>
+            </w:pPr>
+            <w:r>
+              <w:t xml:space="preserve">21%</w:t>
+            </w:r>
+          </w:p>
+        </w:tc>
+        <w:tc>
+          <w:tcPr/>
+          <w:p>
+            <w:pPr>
+              <w:pStyle w:val="Compact"/>
+              <w:jc w:val="center"/>
+            </w:pPr>
+            <w:r>
+              <w:t xml:space="preserve">C</w:t>
             </w:r>
           </w:p>
         </w:tc>
@@ -7369,7 +7892,7 @@
               <w:jc w:val="left"/>
             </w:pPr>
             <w:r>
-              <w:t xml:space="preserve">Liothyronine</w:t>
+              <w:t xml:space="preserve">Elasomeran</w:t>
             </w:r>
           </w:p>
         </w:tc>
@@ -7393,55 +7916,251 @@
               <w:jc w:val="right"/>
             </w:pPr>
             <w:r>
-              <w:t xml:space="preserve">40</w:t>
-            </w:r>
-          </w:p>
-        </w:tc>
-        <w:tc>
-          <w:tcPr/>
-          <w:p>
-            <w:pPr>
-              <w:pStyle w:val="Compact"/>
-              <w:jc w:val="center"/>
-            </w:pPr>
-            <w:r>
-              <w:t xml:space="preserve">4.90 (3.56–6.75)</w:t>
-            </w:r>
-          </w:p>
-        </w:tc>
-        <w:tc>
-          <w:tcPr/>
-          <w:p>
-            <w:pPr>
-              <w:pStyle w:val="Compact"/>
-              <w:jc w:val="center"/>
-            </w:pPr>
-            <w:r>
-              <w:t xml:space="preserve">16.73 (5.22–53.59)</w:t>
-            </w:r>
-          </w:p>
-        </w:tc>
-        <w:tc>
-          <w:tcPr/>
-          <w:p>
-            <w:pPr>
-              <w:pStyle w:val="Compact"/>
-              <w:jc w:val="center"/>
-            </w:pPr>
-            <w:r>
-              <w:t xml:space="preserve">78%</w:t>
-            </w:r>
-          </w:p>
-        </w:tc>
-        <w:tc>
-          <w:tcPr/>
-          <w:p>
-            <w:pPr>
-              <w:pStyle w:val="Compact"/>
-              <w:jc w:val="center"/>
-            </w:pPr>
-            <w:r>
-              <w:t xml:space="preserve">32%</w:t>
+              <w:t xml:space="preserve">13</w:t>
+            </w:r>
+          </w:p>
+        </w:tc>
+        <w:tc>
+          <w:tcPr/>
+          <w:p>
+            <w:pPr>
+              <w:pStyle w:val="Compact"/>
+              <w:jc w:val="center"/>
+            </w:pPr>
+            <w:r>
+              <w:t xml:space="preserve">3.62 (1.94–6.74)</w:t>
+            </w:r>
+          </w:p>
+        </w:tc>
+        <w:tc>
+          <w:tcPr/>
+          <w:p>
+            <w:pPr>
+              <w:pStyle w:val="Compact"/>
+              <w:jc w:val="center"/>
+            </w:pPr>
+            <w:r>
+              <w:t xml:space="preserve">3.50 (2.26–5.43)</w:t>
+            </w:r>
+          </w:p>
+        </w:tc>
+        <w:tc>
+          <w:tcPr/>
+          <w:p>
+            <w:pPr>
+              <w:pStyle w:val="Compact"/>
+              <w:jc w:val="center"/>
+            </w:pPr>
+            <w:r>
+              <w:t xml:space="preserve">69%</w:t>
+            </w:r>
+          </w:p>
+        </w:tc>
+        <w:tc>
+          <w:tcPr/>
+          <w:p>
+            <w:pPr>
+              <w:pStyle w:val="Compact"/>
+              <w:jc w:val="center"/>
+            </w:pPr>
+            <w:r>
+              <w:t xml:space="preserve">31%</w:t>
+            </w:r>
+          </w:p>
+        </w:tc>
+        <w:tc>
+          <w:tcPr/>
+          <w:p>
+            <w:pPr>
+              <w:pStyle w:val="Compact"/>
+              <w:jc w:val="center"/>
+            </w:pPr>
+            <w:r>
+              <w:t xml:space="preserve">C</w:t>
+            </w:r>
+          </w:p>
+        </w:tc>
+      </w:tr>
+      <w:tr>
+        <w:tc>
+          <w:tcPr/>
+          <w:p>
+            <w:pPr>
+              <w:pStyle w:val="Compact"/>
+              <w:jc w:val="left"/>
+            </w:pPr>
+            <w:r>
+              <w:t xml:space="preserve">Galcanezumab</w:t>
+            </w:r>
+          </w:p>
+        </w:tc>
+        <w:tc>
+          <w:tcPr/>
+          <w:p>
+            <w:pPr>
+              <w:pStyle w:val="Compact"/>
+              <w:jc w:val="left"/>
+            </w:pPr>
+            <w:r>
+              <w:t xml:space="preserve">Tin</w:t>
+            </w:r>
+          </w:p>
+        </w:tc>
+        <w:tc>
+          <w:tcPr/>
+          <w:p>
+            <w:pPr>
+              <w:pStyle w:val="Compact"/>
+              <w:jc w:val="right"/>
+            </w:pPr>
+            <w:r>
+              <w:t xml:space="preserve">96</w:t>
+            </w:r>
+          </w:p>
+        </w:tc>
+        <w:tc>
+          <w:tcPr/>
+          <w:p>
+            <w:pPr>
+              <w:pStyle w:val="Compact"/>
+              <w:jc w:val="center"/>
+            </w:pPr>
+            <w:r>
+              <w:t xml:space="preserve">1.86 (1.52–2.28)</w:t>
+            </w:r>
+          </w:p>
+        </w:tc>
+        <w:tc>
+          <w:tcPr/>
+          <w:p>
+            <w:pPr>
+              <w:pStyle w:val="Compact"/>
+              <w:jc w:val="center"/>
+            </w:pPr>
+            <w:r>
+              <w:t xml:space="preserve">16.70 (6.73–41.48)</w:t>
+            </w:r>
+          </w:p>
+        </w:tc>
+        <w:tc>
+          <w:tcPr/>
+          <w:p>
+            <w:pPr>
+              <w:pStyle w:val="Compact"/>
+              <w:jc w:val="center"/>
+            </w:pPr>
+            <w:r>
+              <w:t xml:space="preserve">88%</w:t>
+            </w:r>
+          </w:p>
+        </w:tc>
+        <w:tc>
+          <w:tcPr/>
+          <w:p>
+            <w:pPr>
+              <w:pStyle w:val="Compact"/>
+              <w:jc w:val="center"/>
+            </w:pPr>
+            <w:r>
+              <w:t xml:space="preserve">0%</w:t>
+            </w:r>
+          </w:p>
+        </w:tc>
+        <w:tc>
+          <w:tcPr/>
+          <w:p>
+            <w:pPr>
+              <w:pStyle w:val="Compact"/>
+              <w:jc w:val="center"/>
+            </w:pPr>
+            <w:r>
+              <w:t xml:space="preserve">D</w:t>
+            </w:r>
+          </w:p>
+        </w:tc>
+      </w:tr>
+      <w:tr>
+        <w:tc>
+          <w:tcPr/>
+          <w:p>
+            <w:pPr>
+              <w:pStyle w:val="Compact"/>
+              <w:jc w:val="left"/>
+            </w:pPr>
+            <w:r>
+              <w:t xml:space="preserve">Chlorthalidone</w:t>
+            </w:r>
+          </w:p>
+        </w:tc>
+        <w:tc>
+          <w:tcPr/>
+          <w:p>
+            <w:pPr>
+              <w:pStyle w:val="Compact"/>
+              <w:jc w:val="left"/>
+            </w:pPr>
+            <w:r>
+              <w:t xml:space="preserve">Tin</w:t>
+            </w:r>
+          </w:p>
+        </w:tc>
+        <w:tc>
+          <w:tcPr/>
+          <w:p>
+            <w:pPr>
+              <w:pStyle w:val="Compact"/>
+              <w:jc w:val="right"/>
+            </w:pPr>
+            <w:r>
+              <w:t xml:space="preserve">10</w:t>
+            </w:r>
+          </w:p>
+        </w:tc>
+        <w:tc>
+          <w:tcPr/>
+          <w:p>
+            <w:pPr>
+              <w:pStyle w:val="Compact"/>
+              <w:jc w:val="center"/>
+            </w:pPr>
+            <w:r>
+              <w:t xml:space="preserve">1.94 (1.04–3.62)</w:t>
+            </w:r>
+          </w:p>
+        </w:tc>
+        <w:tc>
+          <w:tcPr/>
+          <w:p>
+            <w:pPr>
+              <w:pStyle w:val="Compact"/>
+              <w:jc w:val="center"/>
+            </w:pPr>
+            <w:r>
+              <w:t xml:space="preserve">4.57 (1.70–12.29)</w:t>
+            </w:r>
+          </w:p>
+        </w:tc>
+        <w:tc>
+          <w:tcPr/>
+          <w:p>
+            <w:pPr>
+              <w:pStyle w:val="Compact"/>
+              <w:jc w:val="center"/>
+            </w:pPr>
+            <w:r>
+              <w:t xml:space="preserve">90%</w:t>
+            </w:r>
+          </w:p>
+        </w:tc>
+        <w:tc>
+          <w:tcPr/>
+          <w:p>
+            <w:pPr>
+              <w:pStyle w:val="Compact"/>
+              <w:jc w:val="center"/>
+            </w:pPr>
+            <w:r>
+              <w:t xml:space="preserve">0%</w:t>
             </w:r>
           </w:p>
         </w:tc>
@@ -7573,7 +8292,7 @@
                 <w:b/>
                 <w:bCs/>
               </w:rPr>
-              <w:t xml:space="preserve">Chlorthalidone</w:t>
+              <w:t xml:space="preserve">Liothyronine</w:t>
             </w:r>
           </w:p>
         </w:tc>
@@ -7597,55 +8316,55 @@
               <w:jc w:val="right"/>
             </w:pPr>
             <w:r>
-              <w:t xml:space="preserve">10</w:t>
-            </w:r>
-          </w:p>
-        </w:tc>
-        <w:tc>
-          <w:tcPr/>
-          <w:p>
-            <w:pPr>
-              <w:pStyle w:val="Compact"/>
-              <w:jc w:val="center"/>
-            </w:pPr>
-            <w:r>
-              <w:t xml:space="preserve">1.94 (1.04–3.62)</w:t>
-            </w:r>
-          </w:p>
-        </w:tc>
-        <w:tc>
-          <w:tcPr/>
-          <w:p>
-            <w:pPr>
-              <w:pStyle w:val="Compact"/>
-              <w:jc w:val="center"/>
-            </w:pPr>
-            <w:r>
-              <w:t xml:space="preserve">4.57 (1.70–12.29)</w:t>
-            </w:r>
-          </w:p>
-        </w:tc>
-        <w:tc>
-          <w:tcPr/>
-          <w:p>
-            <w:pPr>
-              <w:pStyle w:val="Compact"/>
-              <w:jc w:val="center"/>
-            </w:pPr>
-            <w:r>
-              <w:t xml:space="preserve">90%</w:t>
-            </w:r>
-          </w:p>
-        </w:tc>
-        <w:tc>
-          <w:tcPr/>
-          <w:p>
-            <w:pPr>
-              <w:pStyle w:val="Compact"/>
-              <w:jc w:val="center"/>
-            </w:pPr>
-            <w:r>
-              <w:t xml:space="preserve">0%</w:t>
+              <w:t xml:space="preserve">40</w:t>
+            </w:r>
+          </w:p>
+        </w:tc>
+        <w:tc>
+          <w:tcPr/>
+          <w:p>
+            <w:pPr>
+              <w:pStyle w:val="Compact"/>
+              <w:jc w:val="center"/>
+            </w:pPr>
+            <w:r>
+              <w:t xml:space="preserve">4.90 (3.56–6.75)</w:t>
+            </w:r>
+          </w:p>
+        </w:tc>
+        <w:tc>
+          <w:tcPr/>
+          <w:p>
+            <w:pPr>
+              <w:pStyle w:val="Compact"/>
+              <w:jc w:val="center"/>
+            </w:pPr>
+            <w:r>
+              <w:t xml:space="preserve">16.73 (5.22–53.59)</w:t>
+            </w:r>
+          </w:p>
+        </w:tc>
+        <w:tc>
+          <w:tcPr/>
+          <w:p>
+            <w:pPr>
+              <w:pStyle w:val="Compact"/>
+              <w:jc w:val="center"/>
+            </w:pPr>
+            <w:r>
+              <w:t xml:space="preserve">78%</w:t>
+            </w:r>
+          </w:p>
+        </w:tc>
+        <w:tc>
+          <w:tcPr/>
+          <w:p>
+            <w:pPr>
+              <w:pStyle w:val="Compact"/>
+              <w:jc w:val="center"/>
+            </w:pPr>
+            <w:r>
+              <w:t xml:space="preserve">32%</w:t>
             </w:r>
           </w:p>
         </w:tc>
@@ -7939,19 +8658,19 @@
         <w:t xml:space="preserve"> </w:t>
       </w:r>
       <w:r>
-        <w:t xml:space="preserve">for labelled associations—they replicated as often as their strength predicted—but unlabelled signals replicated less</w:t>
-      </w:r>
-      <w:r>
-        <w:t xml:space="preserve"> </w:t>
-      </w:r>
-      <w:r>
-        <w:t xml:space="preserve">than half as often as predicted, about as often as signals for drugs whose labels are silent on hearing. Third, replication is</w:t>
-      </w:r>
-      <w:r>
-        <w:t xml:space="preserve"> </w:t>
-      </w:r>
-      <w:r>
-        <w:t xml:space="preserve">not a clean validator on its own: solicited patient-support-programme reports produced</w:t>
+        <w:t xml:space="preserve">for labelled associations—they replicated about as often as their strength predicted—but unlabelled signals replicated</w:t>
+      </w:r>
+      <w:r>
+        <w:t xml:space="preserve"> </w:t>
+      </w:r>
+      <w:r>
+        <w:t xml:space="preserve">less than half as often as predicted, about as often as signals for drugs whose labels are silent on hearing. Third,</w:t>
+      </w:r>
+      <w:r>
+        <w:t xml:space="preserve"> </w:t>
+      </w:r>
+      <w:r>
+        <w:t xml:space="preserve">replication is not a clean validator on its own: solicited patient-support-programme reports and report clusters produced</w:t>
       </w:r>
       <w:r>
         <w:t xml:space="preserve"> </w:t>
@@ -7963,19 +8682,19 @@
         <w:t xml:space="preserve"> </w:t>
       </w:r>
       <w:r>
-        <w:t xml:space="preserve">for drugs with no</w:t>
-      </w:r>
-      <w:r>
-        <w:t xml:space="preserve"> </w:t>
-      </w:r>
-      <w:r>
-        <w:t xml:space="preserve">known association, and co-medication bias replicated whenever crude estimates were compared. After adjusted replication and</w:t>
-      </w:r>
-      <w:r>
-        <w:t xml:space="preserve"> </w:t>
-      </w:r>
-      <w:r>
-        <w:t xml:space="preserve">a review of report provenance, 4 of 22 robust unlabelled signals remained.</w:t>
+        <w:t xml:space="preserve">for drugs with no known association, and co-medication bias can replicate when crude estimates are compared.</w:t>
+      </w:r>
+      <w:r>
+        <w:t xml:space="preserve"> </w:t>
+      </w:r>
+      <w:r>
+        <w:t xml:space="preserve">After adjusted replication, a review of report provenance and an active-comparator check, 7 of 22 robust unlabelled</w:t>
+      </w:r>
+      <w:r>
+        <w:t xml:space="preserve"> </w:t>
+      </w:r>
+      <w:r>
+        <w:t xml:space="preserve">signals remained.</w:t>
       </w:r>
     </w:p>
     <w:p>
@@ -8007,13 +8726,13 @@
         <w:t xml:space="preserve"> </w:t>
       </w:r>
       <w:r>
-        <w:t xml:space="preserve">reports were collected rather than with pharmacology. Tafamidis and sacubitril/valsartan are examples: thousands of consumer</w:t>
-      </w:r>
-      <w:r>
-        <w:t xml:space="preserve"> </w:t>
-      </w:r>
-      <w:r>
-        <w:t xml:space="preserve">reports in FAERS, consistent with manufacturer programmes in the United States, and none in Canada. The same mechanism</w:t>
+        <w:t xml:space="preserve">reports were collected rather than with pharmacology. Tafamidis and sacubitril/valsartan are examples: hundreds to thousands</w:t>
+      </w:r>
+      <w:r>
+        <w:t xml:space="preserve"> </w:t>
+      </w:r>
+      <w:r>
+        <w:t xml:space="preserve">of FAERS reports, consistent with manufacturer programmes in the United States, and none in Canada. The same mechanism</w:t>
       </w:r>
       <w:r>
         <w:t xml:space="preserve"> </w:t>
@@ -8040,19 +8759,13 @@
         <w:t xml:space="preserve">[20]</w:t>
       </w:r>
       <w:r>
-        <w:t xml:space="preserve">, and their share differs between databases, so report provenance can manufacture both a signal and</w:t>
-      </w:r>
-      <w:r>
-        <w:t xml:space="preserve"> </w:t>
-      </w:r>
-      <w:r>
-        <w:t xml:space="preserve">its replication. Bias that is shared between databases—co-prescription in standard regimens—also replicates; etoposide</w:t>
-      </w:r>
-      <w:r>
-        <w:t xml:space="preserve"> </w:t>
-      </w:r>
-      <w:r>
-        <w:t xml:space="preserve">is the clearest example here.</w:t>
+        <w:t xml:space="preserve">, and their share differs between databases, so report provenance can manufacture both a signal and its</w:t>
+      </w:r>
+      <w:r>
+        <w:t xml:space="preserve"> </w:t>
+      </w:r>
+      <w:r>
+        <w:t xml:space="preserve">replication.</w:t>
       </w:r>
     </w:p>
     <w:p>
@@ -8060,7 +8773,7 @@
         <w:pStyle w:val="BodyText"/>
       </w:pPr>
       <w:r>
-        <w:t xml:space="preserve">Two inexpensive steps addressed most of what we found: comparing</w:t>
+        <w:t xml:space="preserve">Several steps flagged most of the artefacts identified in this study: comparing</w:t>
       </w:r>
       <w:r>
         <w:t xml:space="preserve"> </w:t>
@@ -8076,7 +8789,7 @@
         <w:t xml:space="preserve"> </w:t>
       </w:r>
       <w:r>
-        <w:t xml:space="preserve">estimates in both databases, and</w:t>
+        <w:t xml:space="preserve">estimates in both databases;</w:t>
       </w:r>
       <w:r>
         <w:t xml:space="preserve"> </w:t>
@@ -8088,13 +8801,19 @@
         <w:t xml:space="preserve"> </w:t>
       </w:r>
       <w:r>
-        <w:t xml:space="preserve">reports. The power-calibrated comparison is also simple and avoids the outcome-dependent testability of rules based on</w:t>
-      </w:r>
-      <w:r>
-        <w:t xml:space="preserve"> </w:t>
-      </w:r>
-      <w:r>
-        <w:t xml:space="preserve">observed counts; it could be extended with empirical calibration against negative controls</w:t>
+        <w:t xml:space="preserve">reports; and comparing the drug with others used for the same indication. The power-calibrated comparison is simple and avoids</w:t>
+      </w:r>
+      <w:r>
+        <w:t xml:space="preserve"> </w:t>
+      </w:r>
+      <w:r>
+        <w:t xml:space="preserve">the outcome-dependent testability of rules based on observed counts; it remains sensitive to overdispersion, and empirical</w:t>
+      </w:r>
+      <w:r>
+        <w:t xml:space="preserve"> </w:t>
+      </w:r>
+      <w:r>
+        <w:t xml:space="preserve">calibration against negative controls</w:t>
       </w:r>
       <w:r>
         <w:t xml:space="preserve"> </w:t>
@@ -8106,13 +8825,7 @@
         <w:t xml:space="preserve"> </w:t>
       </w:r>
       <w:r>
-        <w:t xml:space="preserve">or with</w:t>
-      </w:r>
-      <w:r>
-        <w:t xml:space="preserve"> </w:t>
-      </w:r>
-      <w:r>
-        <w:t xml:space="preserve">regression-based adjustment for co-reported drugs</w:t>
+        <w:t xml:space="preserve">or regression-based adjustment for co-reported drugs</w:t>
       </w:r>
       <w:r>
         <w:t xml:space="preserve"> </w:t>
@@ -8121,13 +8834,16 @@
         <w:t xml:space="preserve">[22]</w:t>
       </w:r>
       <w:r>
-        <w:t xml:space="preserve">. We suggest that screens for hearing outcomes report</w:t>
-      </w:r>
-      <w:r>
-        <w:t xml:space="preserve"> </w:t>
-      </w:r>
-      <w:r>
-        <w:t xml:space="preserve">these provenance indicators for every signal, in line with the case-by-case item of READUS-PV</w:t>
+        <w:t xml:space="preserve"> </w:t>
+      </w:r>
+      <w:r>
+        <w:t xml:space="preserve">would be natural extensions. We suggest that screens for hearing outcomes report these provenance</w:t>
+      </w:r>
+      <w:r>
+        <w:t xml:space="preserve"> </w:t>
+      </w:r>
+      <w:r>
+        <w:t xml:space="preserve">indicators for every signal, in line with the case-by-case item of READUS-PV</w:t>
       </w:r>
       <w:r>
         <w:t xml:space="preserve"> </w:t>
@@ -8144,7 +8860,7 @@
         <w:pStyle w:val="BodyText"/>
       </w:pPr>
       <w:r>
-        <w:t xml:space="preserve">The remaining candidates are hypotheses with plausible alternative explanations. Pregabalin, an</w:t>
+        <w:t xml:space="preserve">The remaining candidates are hypotheses. Pregabalin, an</w:t>
       </w:r>
       <w:r>
         <w:t xml:space="preserve"> </w:t>
@@ -8170,19 +8886,19 @@
         <w:t xml:space="preserve"> </w:t>
       </w:r>
       <w:r>
-        <w:t xml:space="preserve">ligand,</w:t>
-      </w:r>
-      <w:r>
-        <w:t xml:space="preserve"> </w:t>
-      </w:r>
-      <w:r>
-        <w:t xml:space="preserve">had 1</w:t>
+        <w:t xml:space="preserve">ligand, had 1</w:t>
       </w:r>
       <w:r>
         <w:t xml:space="preserve">,</w:t>
       </w:r>
       <w:r>
-        <w:t xml:space="preserve">703 FAERS hearing-loss reports (adjusted OR</w:t>
+        <w:t xml:space="preserve">703</w:t>
+      </w:r>
+      <w:r>
+        <w:t xml:space="preserve"> </w:t>
+      </w:r>
+      <w:r>
+        <w:t xml:space="preserve">FAERS hearing-loss reports (adjusted OR</w:t>
       </w:r>
       <w:r>
         <w:t xml:space="preserve"> </w:t>
@@ -8194,7 +8910,13 @@
         <w:t xml:space="preserve"> </w:t>
       </w:r>
       <w:r>
-        <w:t xml:space="preserve">that replicated in Canada; a case of reversible, dose-related hearing loss has been described</w:t>
+        <w:t xml:space="preserve">that replicated in Canada and persisted against other drugs for pain and neuropathy; a case of reversible, dose-related hearing</w:t>
+      </w:r>
+      <w:r>
+        <w:t xml:space="preserve"> </w:t>
+      </w:r>
+      <w:r>
+        <w:t xml:space="preserve">loss has been described</w:t>
       </w:r>
       <w:r>
         <w:t xml:space="preserve"> </w:t>
@@ -8203,13 +8925,7 @@
         <w:t xml:space="preserve">[23]</w:t>
       </w:r>
       <w:r>
-        <w:t xml:space="preserve">, but</w:t>
-      </w:r>
-      <w:r>
-        <w:t xml:space="preserve"> </w:t>
-      </w:r>
-      <w:r>
-        <w:t xml:space="preserve">diabetes, neuropathy and age confound</w:t>
+        <w:t xml:space="preserve">, but age and diabetes confound</w:t>
       </w:r>
       <w:r>
         <w:t xml:space="preserve"> </w:t>
@@ -8218,13 +8934,28 @@
         <w:t xml:space="preserve">[24]</w:t>
       </w:r>
       <w:r>
-        <w:t xml:space="preserve">, and its labels list tinnitus and hyperacusis. For amlodipine,</w:t>
-      </w:r>
-      <w:r>
-        <w:t xml:space="preserve"> </w:t>
-      </w:r>
-      <w:r>
-        <w:t xml:space="preserve">whose labels mention tinnitus, a large cohort found a</w:t>
+        <w:t xml:space="preserve">, and its labels list</w:t>
+      </w:r>
+      <w:r>
+        <w:t xml:space="preserve"> </w:t>
+      </w:r>
+      <w:r>
+        <w:t xml:space="preserve">tinnitus and hyperacusis. For amlodipine, hypertension is associated with hearing loss</w:t>
+      </w:r>
+      <w:r>
+        <w:t xml:space="preserve"> </w:t>
+      </w:r>
+      <w:r>
+        <w:t xml:space="preserve">[25]</w:t>
+      </w:r>
+      <w:r>
+        <w:t xml:space="preserve">, yet the signal</w:t>
+      </w:r>
+      <w:r>
+        <w:t xml:space="preserve"> </w:t>
+      </w:r>
+      <w:r>
+        <w:t xml:space="preserve">persisted against other antihypertensives, while a large cohort found a</w:t>
       </w:r>
       <w:r>
         <w:t xml:space="preserve"> </w:t>
@@ -8240,28 +8971,13 @@
         <w:t xml:space="preserve"> </w:t>
       </w:r>
       <w:r>
-        <w:t xml:space="preserve">risk of sensorineural hearing loss with calcium-channel</w:t>
-      </w:r>
-      <w:r>
-        <w:t xml:space="preserve"> </w:t>
-      </w:r>
-      <w:r>
-        <w:t xml:space="preserve">blockers</w:t>
-      </w:r>
-      <w:r>
-        <w:t xml:space="preserve"> </w:t>
-      </w:r>
-      <w:r>
-        <w:t xml:space="preserve">[25]</w:t>
-      </w:r>
-      <w:r>
-        <w:t xml:space="preserve">, which argues against a causal effect. Doxycycline–tinnitus may reflect pulsatile tinnitus from</w:t>
-      </w:r>
-      <w:r>
-        <w:t xml:space="preserve"> </w:t>
-      </w:r>
-      <w:r>
-        <w:t xml:space="preserve">drug-induced intracranial hypertension, which is labelled</w:t>
+        <w:t xml:space="preserve">risk of sensorineural hearing loss with</w:t>
+      </w:r>
+      <w:r>
+        <w:t xml:space="preserve"> </w:t>
+      </w:r>
+      <w:r>
+        <w:t xml:space="preserve">calcium-channel blockers</w:t>
       </w:r>
       <w:r>
         <w:t xml:space="preserve"> </w:t>
@@ -8270,13 +8986,43 @@
         <w:t xml:space="preserve">[26]</w:t>
       </w:r>
       <w:r>
-        <w:t xml:space="preserve">, or the infections it treats. None of these should</w:t>
-      </w:r>
-      <w:r>
-        <w:t xml:space="preserve"> </w:t>
-      </w:r>
-      <w:r>
-        <w:t xml:space="preserve">change practice without studies that have exposure data.</w:t>
+        <w:t xml:space="preserve">, which argues against a causal effect. Tofacitinib, travoprost and glycopyrrolate</w:t>
+      </w:r>
+      <w:r>
+        <w:t xml:space="preserve"> </w:t>
+      </w:r>
+      <w:r>
+        <w:t xml:space="preserve">persisted within rheumatoid arthritis, glaucoma and COPD, diseases themselves linked to hearing loss</w:t>
+      </w:r>
+      <w:r>
+        <w:t xml:space="preserve"> </w:t>
+      </w:r>
+      <w:r>
+        <w:t xml:space="preserve">[27–29]</w:t>
+      </w:r>
+      <w:r>
+        <w:t xml:space="preserve">, so residual confounding by disease severity remains possible. Doxycycline</w:t>
+      </w:r>
+      <w:r>
+        <w:t xml:space="preserve"> </w:t>
+      </w:r>
+      <w:r>
+        <w:t xml:space="preserve">can cause intracranial hypertension, of which pulsatile tinnitus is a symptom</w:t>
+      </w:r>
+      <w:r>
+        <w:t xml:space="preserve"> </w:t>
+      </w:r>
+      <w:r>
+        <w:t xml:space="preserve">[30]</w:t>
+      </w:r>
+      <w:r>
+        <w:t xml:space="preserve">, although few cases reported</w:t>
+      </w:r>
+      <w:r>
+        <w:t xml:space="preserve"> </w:t>
+      </w:r>
+      <w:r>
+        <w:t xml:space="preserve">it. None of these should change practice without studies that have exposure data.</w:t>
       </w:r>
     </w:p>
     <w:p>
@@ -8306,37 +9052,55 @@
         <w:t xml:space="preserve"> </w:t>
       </w:r>
       <w:r>
-        <w:t xml:space="preserve">without causal assessment, and route-specific labels (for example topical gentamicin) blur ingredient-level status; we used</w:t>
-      </w:r>
-      <w:r>
-        <w:t xml:space="preserve"> </w:t>
-      </w:r>
-      <w:r>
-        <w:t xml:space="preserve">it only to compare methods. Excluding reports with an ototoxic co-medication conditions on a variable that reporters may add</w:t>
-      </w:r>
-      <w:r>
-        <w:t xml:space="preserve"> </w:t>
-      </w:r>
-      <w:r>
-        <w:t xml:space="preserve">after observing the event; stratifying on it instead gave the same conclusions. Indications are often missing, unreported</w:t>
-      </w:r>
-      <w:r>
-        <w:t xml:space="preserve"> </w:t>
-      </w:r>
-      <w:r>
-        <w:t xml:space="preserve">co-treatment (for example aminoglycosides in mycobacterial disease) remains, and content deduplication cannot catch</w:t>
-      </w:r>
-      <w:r>
-        <w:t xml:space="preserve"> </w:t>
-      </w:r>
-      <w:r>
-        <w:t xml:space="preserve">near-duplicate series, which the report-cluster indicator only partly addresses. The Canada Vigilance documentation does not</w:t>
-      </w:r>
-      <w:r>
-        <w:t xml:space="preserve"> </w:t>
-      </w:r>
-      <w:r>
-        <w:t xml:space="preserve">state that the extract is domestic; restricting it to reports sent directly to Health Canada gave similar results</w:t>
+        <w:t xml:space="preserve">without causal assessment, and route-specific labels (for example topical gentamicin) blur ingredient-level status; we used it</w:t>
+      </w:r>
+      <w:r>
+        <w:t xml:space="preserve"> </w:t>
+      </w:r>
+      <w:r>
+        <w:t xml:space="preserve">only to compare methods. Excluding reports with an ototoxic co-medication conditions on a variable that reporters may add</w:t>
+      </w:r>
+      <w:r>
+        <w:t xml:space="preserve"> </w:t>
+      </w:r>
+      <w:r>
+        <w:t xml:space="preserve">after observing the event, which pushed some label-positive drugs below 1; stratifying instead removed that artefact but left</w:t>
+      </w:r>
+      <w:r>
+        <w:t xml:space="preserve"> </w:t>
+      </w:r>
+      <w:r>
+        <w:t xml:space="preserve">residual co-medication bias, and both gave the same replication contrast. Indications are often missing; unreported</w:t>
+      </w:r>
+      <w:r>
+        <w:t xml:space="preserve"> </w:t>
+      </w:r>
+      <w:r>
+        <w:t xml:space="preserve">co-treatment (for example aminoglycosides in mycobacterial disease) remains; content deduplication was not applied to Canada</w:t>
+      </w:r>
+      <w:r>
+        <w:t xml:space="preserve"> </w:t>
+      </w:r>
+      <w:r>
+        <w:t xml:space="preserve">Vigilance and cannot catch near-duplicate series, which the report-cluster indicator only partly addresses; and combination</w:t>
+      </w:r>
+      <w:r>
+        <w:t xml:space="preserve"> </w:t>
+      </w:r>
+      <w:r>
+        <w:t xml:space="preserve">products contribute to each ingredient (valsartan inherits sacubitril/valsartan reports). Canadian reports were removed from</w:t>
+      </w:r>
+      <w:r>
+        <w:t xml:space="preserve"> </w:t>
+      </w:r>
+      <w:r>
+        <w:t xml:space="preserve">FAERS by occurrence country, or reporter country when missing. The Canada Vigilance documentation does not state that the</w:t>
+      </w:r>
+      <w:r>
+        <w:t xml:space="preserve"> </w:t>
+      </w:r>
+      <w:r>
+        <w:t xml:space="preserve">extract is domestic; restricting it to reports sent directly to Health Canada gave similar results</w:t>
       </w:r>
       <w:r>
         <w:t xml:space="preserve"> </w:t>
@@ -8354,13 +9118,13 @@
         <w:t xml:space="preserve">,</w:t>
       </w:r>
       <w:r>
-        <w:t xml:space="preserve">400 ingredients were screened without multiplicity</w:t>
-      </w:r>
-      <w:r>
-        <w:t xml:space="preserve"> </w:t>
-      </w:r>
-      <w:r>
-        <w:t xml:space="preserve">correction; the replication and calibration analyses, rather than individual</w:t>
+        <w:t xml:space="preserve">100 ingredients were screened without</w:t>
+      </w:r>
+      <w:r>
+        <w:t xml:space="preserve"> </w:t>
+      </w:r>
+      <w:r>
+        <w:t xml:space="preserve">multiplicity correction; the replication and calibration analyses, rather than individual</w:t>
       </w:r>
       <w:r>
         <w:t xml:space="preserve"> </w:t>
@@ -8371,31 +9135,49 @@
         </m:r>
       </m:oMath>
       <w:r>
-        <w:t xml:space="preserve">-values, carry the conclusions. Several</w:t>
-      </w:r>
-      <w:r>
-        <w:t xml:space="preserve"> </w:t>
-      </w:r>
-      <w:r>
-        <w:t xml:space="preserve">analyses—the solicited-report exclusion, the extended indication filter, adjusted-to-adjusted and calibrated replication,</w:t>
-      </w:r>
-      <w:r>
-        <w:t xml:space="preserve"> </w:t>
-      </w:r>
-      <w:r>
-        <w:t xml:space="preserve">the co-medication variants and the case-level review—were added after the primary results were seen, partly in response</w:t>
-      </w:r>
-      <w:r>
-        <w:t xml:space="preserve"> </w:t>
-      </w:r>
-      <w:r>
-        <w:t xml:space="preserve">to internal review; they are labelled post hoc and the pre-specified results are reported unchanged. The case-level review</w:t>
-      </w:r>
-      <w:r>
-        <w:t xml:space="preserve"> </w:t>
-      </w:r>
-      <w:r>
-        <w:t xml:space="preserve">used a written rubric applied by the author and by an AI assessor, not by independent clinicians.</w:t>
+        <w:t xml:space="preserve">-values, carry the conclusions,</w:t>
+      </w:r>
+      <w:r>
+        <w:t xml:space="preserve"> </w:t>
+      </w:r>
+      <w:r>
+        <w:t xml:space="preserve">and the calibration’s expected counts depend on Poisson assumptions that the background shows to be optimistic. Corrections</w:t>
+      </w:r>
+      <w:r>
+        <w:t xml:space="preserve"> </w:t>
+      </w:r>
+      <w:r>
+        <w:t xml:space="preserve">made after the first results (ingredient synonyms, comparator handling for listed drugs, label sections) changed the primary</w:t>
+      </w:r>
+      <w:r>
+        <w:t xml:space="preserve"> </w:t>
+      </w:r>
+      <w:r>
+        <w:t xml:space="preserve">numbers slightly; they are listed in the protocol file. The solicited-report exclusion, the extended indication filter,</w:t>
+      </w:r>
+      <w:r>
+        <w:t xml:space="preserve"> </w:t>
+      </w:r>
+      <w:r>
+        <w:t xml:space="preserve">adjusted-to-adjusted and calibrated replication, the co-medication variants, the active-comparator check and the case-level</w:t>
+      </w:r>
+      <w:r>
+        <w:t xml:space="preserve"> </w:t>
+      </w:r>
+      <w:r>
+        <w:t xml:space="preserve">review were added after the primary results were seen, partly in response to internal review, and are labelled post hoc. The</w:t>
+      </w:r>
+      <w:r>
+        <w:t xml:space="preserve"> </w:t>
+      </w:r>
+      <w:r>
+        <w:t xml:space="preserve">case-level review was applied by the author and by an AI assessor that used the same profiles and search tools, not by</w:t>
+      </w:r>
+      <w:r>
+        <w:t xml:space="preserve"> </w:t>
+      </w:r>
+      <w:r>
+        <w:t xml:space="preserve">independent clinicians; the two assessments are therefore not fully independent.</w:t>
       </w:r>
     </w:p>
     <w:p>
@@ -8425,19 +9207,19 @@
         <w:t xml:space="preserve"> </w:t>
       </w:r>
       <w:r>
-        <w:t xml:space="preserve">hypothesis-generating tool. Replication in a second spontaneous-reporting database is informative only when both estimates</w:t>
-      </w:r>
-      <w:r>
-        <w:t xml:space="preserve"> </w:t>
-      </w:r>
-      <w:r>
-        <w:t xml:space="preserve">are adjusted and solicited reports are handled explicitly. The few remaining candidates, led by pregabalin, merit study with</w:t>
-      </w:r>
-      <w:r>
-        <w:t xml:space="preserve"> </w:t>
-      </w:r>
-      <w:r>
-        <w:t xml:space="preserve">exposure-based designs.</w:t>
+        <w:t xml:space="preserve">hypothesis-generating tool. Replication in a second spontaneous-reporting database is informative only when both estimates are</w:t>
+      </w:r>
+      <w:r>
+        <w:t xml:space="preserve"> </w:t>
+      </w:r>
+      <w:r>
+        <w:t xml:space="preserve">adjusted and solicited reports and report clusters are handled explicitly. The few remaining candidates, led by pregabalin,</w:t>
+      </w:r>
+      <w:r>
+        <w:t xml:space="preserve"> </w:t>
+      </w:r>
+      <w:r>
+        <w:t xml:space="preserve">merit study with exposure-based designs.</w:t>
       </w:r>
     </w:p>
     <w:p>
@@ -8579,7 +9361,7 @@
         <w:t xml:space="preserve">the manuscript.</w:t>
       </w:r>
     </w:p>
-    <w:bookmarkStart w:id="96" w:name="_refs"/>
+    <w:bookmarkStart w:id="104" w:name="_refs"/>
     <w:bookmarkStart w:id="45" w:name="_84053f0725d171dd2bc6aa3b5185bf9f8bf2c68"/>
     <w:p>
       <w:pPr>
@@ -9297,18 +10079,39 @@
       </w:hyperlink>
     </w:p>
     <w:bookmarkEnd w:id="91"/>
-    <w:bookmarkStart w:id="93" w:name="_22b8669257583e60fc4613cd9bf0682ec3fbb25"/>
+    <w:bookmarkStart w:id="93" w:name="_90035051e9cb6e0d4a9b4d996a14af53650eae4"/>
     <w:p>
       <w:pPr>
         <w:pStyle w:val="Bibliography"/>
       </w:pPr>
       <w:r>
-        <w:t xml:space="preserve">25. Sutton SS, Magagnoli J, Cummings TH, Hardin JW. Calcium channel blockers and the risk of sensorineural hearing loss. Otology &amp; Neurotology. 2022;43:e140–7.</w:t>
+        <w:t xml:space="preserve">25. Jin X, Xu X, Wang J, Liu X, Deng X, Xie H. Association between hypertension and hearing loss: A systemic review and meta-analysis. Frontiers in neurology. 2024;15:1470997.</w:t>
       </w:r>
       <w:r>
         <w:t xml:space="preserve"> </w:t>
       </w:r>
       <w:hyperlink r:id="rId92">
+        <w:r>
+          <w:rPr>
+            <w:rStyle w:val="Hyperlink"/>
+          </w:rPr>
+          <w:t xml:space="preserve">https://doi.org/10.3389/fneur.2024.1470997</w:t>
+        </w:r>
+      </w:hyperlink>
+    </w:p>
+    <w:bookmarkEnd w:id="93"/>
+    <w:bookmarkStart w:id="95" w:name="_22b8669257583e60fc4613cd9bf0682ec3fbb25"/>
+    <w:p>
+      <w:pPr>
+        <w:pStyle w:val="Bibliography"/>
+      </w:pPr>
+      <w:r>
+        <w:t xml:space="preserve">26. Sutton SS, Magagnoli J, Cummings TH, Hardin JW. Calcium channel blockers and the risk of sensorineural hearing loss. Otology &amp; Neurotology. 2022;43:e140–7.</w:t>
+      </w:r>
+      <w:r>
+        <w:t xml:space="preserve"> </w:t>
+      </w:r>
+      <w:hyperlink r:id="rId94">
         <w:r>
           <w:rPr>
             <w:rStyle w:val="Hyperlink"/>
@@ -9317,19 +10120,106 @@
         </w:r>
       </w:hyperlink>
     </w:p>
-    <w:bookmarkEnd w:id="93"/>
-    <w:bookmarkStart w:id="95" w:name="_816983a1b4f88f3b0231ac3f28316885953f087"/>
+    <w:bookmarkEnd w:id="95"/>
+    <w:bookmarkStart w:id="97" w:name="_a75653ffaf987313fa99474d7ab4895d708e5a4"/>
     <w:p>
       <w:pPr>
         <w:pStyle w:val="Bibliography"/>
       </w:pPr>
       <w:r>
-        <w:t xml:space="preserve">26. Ali NS, Long BD, Manzoor NF, Sismanis A, Coelho DH. Doxycycline-induced intracranial hypertension presenting as unilateral pulsatile tinnitus. Otology &amp; neurotology open. 2023;3:e043.</w:t>
-      </w:r>
-      <w:r>
-        <w:t xml:space="preserve"> </w:t>
-      </w:r>
-      <w:hyperlink r:id="rId94">
+        <w:t xml:space="preserve">27. Chaitidis N, Theocharis P, Festas C, Aritzi I. Association of rheumatoid arthritis with hearing loss: A systematic review and meta-analysis. Rheumatology International. 2020;40:1771–9.</w:t>
+      </w:r>
+      <w:r>
+        <w:t xml:space="preserve"> </w:t>
+      </w:r>
+      <w:hyperlink r:id="rId96">
+        <w:r>
+          <w:rPr>
+            <w:rStyle w:val="Hyperlink"/>
+          </w:rPr>
+          <w:t xml:space="preserve">https://doi.org/10.1007/s00296-020-04609-1</w:t>
+        </w:r>
+      </w:hyperlink>
+    </w:p>
+    <w:bookmarkEnd w:id="97"/>
+    <w:bookmarkStart w:id="99" w:name="_11593371a69f66357e86220b227297cc20dc733"/>
+    <w:p>
+      <w:pPr>
+        <w:pStyle w:val="Bibliography"/>
+      </w:pPr>
+      <w:r>
+        <w:t xml:space="preserve">28. Kim JM, Lee MY, Kim JW, Lee J, Kim HJ, Cha SC, et al. Open-angle glaucoma and sensorineural hearing impairment in the</w:t>
+      </w:r>
+      <w:r>
+        <w:t xml:space="preserve"> </w:t>
+      </w:r>
+      <w:r>
+        <w:t xml:space="preserve">Korean</w:t>
+      </w:r>
+      <w:r>
+        <w:t xml:space="preserve"> </w:t>
+      </w:r>
+      <w:r>
+        <w:t xml:space="preserve">population. Current Eye Research. 2020;45:992–9.</w:t>
+      </w:r>
+      <w:r>
+        <w:t xml:space="preserve"> </w:t>
+      </w:r>
+      <w:hyperlink r:id="rId98">
+        <w:r>
+          <w:rPr>
+            <w:rStyle w:val="Hyperlink"/>
+          </w:rPr>
+          <w:t xml:space="preserve">https://doi.org/10.1080/02713683.2020.1712424</w:t>
+        </w:r>
+      </w:hyperlink>
+    </w:p>
+    <w:bookmarkEnd w:id="99"/>
+    <w:bookmarkStart w:id="101" w:name="_1994c31b65db315423021af066b563f5c10707d"/>
+    <w:p>
+      <w:pPr>
+        <w:pStyle w:val="Bibliography"/>
+      </w:pPr>
+      <w:r>
+        <w:t xml:space="preserve">29. Choi HG, Kwon MJ, Kim JH, Kim J-H, Kim Y, Kim SY. Association between</w:t>
+      </w:r>
+      <w:r>
+        <w:t xml:space="preserve"> </w:t>
+      </w:r>
+      <w:r>
+        <w:t xml:space="preserve">COPD</w:t>
+      </w:r>
+      <w:r>
+        <w:t xml:space="preserve"> </w:t>
+      </w:r>
+      <w:r>
+        <w:t xml:space="preserve">and hearing loss. The Laryngoscope. 2024;134:4716–22.</w:t>
+      </w:r>
+      <w:r>
+        <w:t xml:space="preserve"> </w:t>
+      </w:r>
+      <w:hyperlink r:id="rId100">
+        <w:r>
+          <w:rPr>
+            <w:rStyle w:val="Hyperlink"/>
+          </w:rPr>
+          <w:t xml:space="preserve">https://doi.org/10.1002/lary.31548</w:t>
+        </w:r>
+      </w:hyperlink>
+    </w:p>
+    <w:bookmarkEnd w:id="101"/>
+    <w:bookmarkStart w:id="103" w:name="_816983a1b4f88f3b0231ac3f28316885953f087"/>
+    <w:p>
+      <w:pPr>
+        <w:pStyle w:val="Bibliography"/>
+      </w:pPr>
+      <w:r>
+        <w:t xml:space="preserve">30. Ali NS, Long BD, Manzoor NF, Sismanis A, Coelho DH. Doxycycline-induced intracranial hypertension presenting as unilateral pulsatile tinnitus. Otology &amp; neurotology open. 2023;3:e043.</w:t>
+      </w:r>
+      <w:r>
+        <w:t xml:space="preserve"> </w:t>
+      </w:r>
+      <w:hyperlink r:id="rId102">
         <w:r>
           <w:rPr>
             <w:rStyle w:val="Hyperlink"/>
@@ -9338,8 +10228,8 @@
         </w:r>
       </w:hyperlink>
     </w:p>
-    <w:bookmarkEnd w:id="95"/>
-    <w:bookmarkEnd w:id="96"/>
+    <w:bookmarkEnd w:id="103"/>
+    <w:bookmarkEnd w:id="104"/>
     <w:sectPr>
       <w:footnotePr>
         <w:numRestart w:val="eachSect"/>

</xml_diff>

<commit_message>
Final-Review Revisions: Provenance Strata, Pooled Estimates, O/E Ratio, Residual Range
Co-Authored-By: Claude Opus 5.5 (1M context) <noreply@anthropic.com>
</commit_message>
<xml_diff>
--- a/paper/manuscript.docx
+++ b/paper/manuscript.docx
@@ -153,13 +153,13 @@
         <w:t xml:space="preserve"> </w:t>
       </w:r>
       <w:r>
-        <w:t xml:space="preserve">receiver operating characteristic curve, AUC) and by replication in Canada Vigilance, observed and power-calibrated; robust</w:t>
-      </w:r>
-      <w:r>
-        <w:t xml:space="preserve"> </w:t>
-      </w:r>
-      <w:r>
-        <w:t xml:space="preserve">unlabelled signals underwent case-by-case review.</w:t>
+        <w:t xml:space="preserve">receiver operating characteristic curve, AUC) and by replication in Canada Vigilance; robust unlabelled signals underwent</w:t>
+      </w:r>
+      <w:r>
+        <w:t xml:space="preserve"> </w:t>
+      </w:r>
+      <w:r>
+        <w:t xml:space="preserve">case-by-case review.</w:t>
       </w:r>
     </w:p>
     <w:p>
@@ -189,43 +189,49 @@
         <w:t xml:space="preserve"> </w:t>
       </w:r>
       <w:r>
-        <w:t xml:space="preserve">0.723). Labelled signals replicated in Canada as often as predicted (observed/expected</w:t>
-      </w:r>
-      <w:r>
-        <w:t xml:space="preserve"> </w:t>
-      </w:r>
-      <w:r>
-        <w:t xml:space="preserve">1.02, 95% CI 0.77–1.32);</w:t>
-      </w:r>
-      <w:r>
-        <w:t xml:space="preserve"> </w:t>
-      </w:r>
-      <w:r>
-        <w:t xml:space="preserve">unlabelled signals did not (0.44, 0.29–0.62;</w:t>
-      </w:r>
-      <w:r>
-        <w:t xml:space="preserve"> </w:t>
-      </w:r>
-      <w:r>
-        <w:t xml:space="preserve">post hoc, both databases adjusted: 0.26). Solicited patient-support-programme</w:t>
-      </w:r>
-      <w:r>
-        <w:t xml:space="preserve"> </w:t>
-      </w:r>
-      <w:r>
-        <w:t xml:space="preserve">reports, report clusters and shared co-medication produced spurious replications. Of 22 robust unlabelled signals (post</w:t>
-      </w:r>
-      <w:r>
-        <w:t xml:space="preserve"> </w:t>
-      </w:r>
-      <w:r>
-        <w:t xml:space="preserve">hoc), 15 were attributed to report clusters, stimulated reporting, indication or an established class; 7 remained,</w:t>
-      </w:r>
-      <w:r>
-        <w:t xml:space="preserve"> </w:t>
-      </w:r>
-      <w:r>
-        <w:t xml:space="preserve">led by pregabalin.</w:t>
+        <w:t xml:space="preserve">0.723). Unlabelled signals replicated in Canada more often than background but less often than</w:t>
+      </w:r>
+      <w:r>
+        <w:t xml:space="preserve"> </w:t>
+      </w:r>
+      <w:r>
+        <w:t xml:space="preserve">labelled ones; power-calibrated (post hoc), labelled signals replicated as predicted (observed/expected</w:t>
+      </w:r>
+      <w:r>
+        <w:t xml:space="preserve"> </w:t>
+      </w:r>
+      <w:r>
+        <w:t xml:space="preserve">1.02, 95% CI 0.77–1.32)</w:t>
+      </w:r>
+      <w:r>
+        <w:t xml:space="preserve"> </w:t>
+      </w:r>
+      <w:r>
+        <w:t xml:space="preserve">and unlabelled ones did not (0.44, 0.29–0.62),</w:t>
+      </w:r>
+      <w:r>
+        <w:t xml:space="preserve"> </w:t>
+      </w:r>
+      <w:r>
+        <w:t xml:space="preserve">also within strata of consumer reporting. Solicited reports, report clusters and shared</w:t>
+      </w:r>
+      <w:r>
+        <w:t xml:space="preserve"> </w:t>
+      </w:r>
+      <w:r>
+        <w:t xml:space="preserve">co-medication produced spurious replications. Of 22 robust unlabelled signals (post hoc), 15 had artefactual or known</w:t>
+      </w:r>
+      <w:r>
+        <w:t xml:space="preserve"> </w:t>
+      </w:r>
+      <w:r>
+        <w:t xml:space="preserve">explanations; 7 remained (2–9 under</w:t>
+      </w:r>
+      <w:r>
+        <w:t xml:space="preserve"> </w:t>
+      </w:r>
+      <w:r>
+        <w:t xml:space="preserve">alternative choices), led by pregabalin.</w:t>
       </w:r>
     </w:p>
     <w:p>
@@ -243,13 +249,13 @@
         <w:t xml:space="preserve"> </w:t>
       </w:r>
       <w:r>
-        <w:t xml:space="preserve">Most unlabelled FAERS hearing-loss signals do not survive adjustment, adjusted replication and</w:t>
-      </w:r>
-      <w:r>
-        <w:t xml:space="preserve"> </w:t>
-      </w:r>
-      <w:r>
-        <w:t xml:space="preserve">provenance review. These findings are hypothesis-generating; cross-database replication needs adjusted estimates and explicit</w:t>
+        <w:t xml:space="preserve">Most unlabelled FAERS hearing-loss signals do not survive adjusted replication and provenance</w:t>
+      </w:r>
+      <w:r>
+        <w:t xml:space="preserve"> </w:t>
+      </w:r>
+      <w:r>
+        <w:t xml:space="preserve">review. These findings are hypothesis-generating; cross-database replication needs adjusted estimates and explicit</w:t>
       </w:r>
       <w:r>
         <w:t xml:space="preserve"> </w:t>
@@ -295,13 +301,19 @@
         </w:numPr>
       </w:pPr>
       <w:r>
-        <w:t xml:space="preserve">In Canada Vigilance, labelled hearing-loss signals replicated about as often as predicted, unlabelled ones less than half</w:t>
-      </w:r>
-      <w:r>
-        <w:t xml:space="preserve"> </w:t>
-      </w:r>
-      <w:r>
-        <w:t xml:space="preserve">as often; solicited patient-support-programme reports and shared co-medication produced spurious replications.</w:t>
+        <w:t xml:space="preserve">In Canada Vigilance, labelled hearing-loss signals replicated about as often as predicted and unlabelled ones less than half</w:t>
+      </w:r>
+      <w:r>
+        <w:t xml:space="preserve"> </w:t>
+      </w:r>
+      <w:r>
+        <w:t xml:space="preserve">as often, also among drugs with similar consumer reporting; solicited reports and shared co-medication produced spurious</w:t>
+      </w:r>
+      <w:r>
+        <w:t xml:space="preserve"> </w:t>
+      </w:r>
+      <w:r>
+        <w:t xml:space="preserve">replications.</w:t>
       </w:r>
     </w:p>
     <w:p>
@@ -629,7 +641,13 @@
         <w:t xml:space="preserve"> </w:t>
       </w:r>
       <w:r>
-        <w:t xml:space="preserve">committed to a version-controlled repository (git commit ff77c40, 26 October 2026, 02:05 UTC+5) before the first result was computed; every later change is dated and</w:t>
+        <w:t xml:space="preserve">committed to a version-controlled repository (git commit ff77c40, 26 October 2026, 02:05 UTC+5) before the first result was</w:t>
+      </w:r>
+      <w:r>
+        <w:t xml:space="preserve"> </w:t>
+      </w:r>
+      <w:r>
+        <w:t xml:space="preserve">computed; it is time-stamped, not registered with a third party; every later change is dated and</w:t>
       </w:r>
       <w:r>
         <w:t xml:space="preserve"> </w:t>
@@ -695,7 +713,13 @@
         <w:t xml:space="preserve"> </w:t>
       </w:r>
       <w:r>
-        <w:t xml:space="preserve">quarter was released (FAERS) and version 29.0 (Canada Vigilance). All data are public and de-identified.</w:t>
+        <w:t xml:space="preserve">quarter was released (FAERS) and version 29.0 (Canada Vigilance); outcome terms were matched by preferred-term name, which</w:t>
+      </w:r>
+      <w:r>
+        <w:t xml:space="preserve"> </w:t>
+      </w:r>
+      <w:r>
+        <w:t xml:space="preserve">is stable across these versions for the terms used. All data are public and de-identified.</w:t>
       </w:r>
     </w:p>
     <w:p>
@@ -1122,7 +1146,7 @@
         <w:t xml:space="preserve"> </w:t>
       </w:r>
       <w:r>
-        <w:t xml:space="preserve">four reporting periods) with the Robins–Breslow–Greenland variance</w:t>
+        <w:t xml:space="preserve">four periods of report receipt: before 2004, 2004–2012, 2013–2018, 2019–2026) with the Robins–Breslow–Greenland variance</w:t>
       </w:r>
       <w:r>
         <w:t xml:space="preserve"> </w:t>
@@ -1260,7 +1284,7 @@
         <w:t xml:space="preserve"> </w:t>
       </w:r>
       <w:r>
-        <w:t xml:space="preserve">(the like-for-like pair) and, secondarily, the IC</w:t>
+        <w:t xml:space="preserve">(the like-for-like pair; the protocol pre-specified the crude IC</w:t>
       </w:r>
       <m:oMath>
         <m:sSub>
@@ -1277,10 +1301,7 @@
         </m:sSub>
       </m:oMath>
       <w:r>
-        <w:t xml:space="preserve"> </w:t>
-      </w:r>
-      <w:r>
-        <w:t xml:space="preserve">and point estimates; the difference was bootstrapped (2</w:t>
+        <w:t xml:space="preserve">, which is also reported) and point estimates; the difference was bootstrapped (2</w:t>
       </w:r>
       <w:r>
         <w:t xml:space="preserve">,</w:t>
@@ -1882,13 +1903,89 @@
         <w:t xml:space="preserve"> </w:t>
       </w:r>
       <w:r>
-        <w:t xml:space="preserve">without solicited reports. Robust signals whose event appears on no US label of any product containing the drug</w:t>
-      </w:r>
-      <w:r>
-        <w:t xml:space="preserve"> </w:t>
-      </w:r>
-      <w:r>
-        <w:t xml:space="preserve">(single-ingredient or combination) were reviewed. For each we profiled the FAERS case series (without Canadian reports):</w:t>
+        <w:t xml:space="preserve">without solicited reports. Throughout, a signal is</w:t>
+      </w:r>
+      <w:r>
+        <w:t xml:space="preserve"> </w:t>
+      </w:r>
+      <w:r>
+        <w:rPr>
+          <w:i/>
+          <w:iCs/>
+        </w:rPr>
+        <w:t xml:space="preserve">labelled</w:t>
+      </w:r>
+      <w:r>
+        <w:t xml:space="preserve"> </w:t>
+      </w:r>
+      <w:r>
+        <w:t xml:space="preserve">when the event is mentioned in any safety section of any US label of a product</w:t>
+      </w:r>
+      <w:r>
+        <w:t xml:space="preserve"> </w:t>
+      </w:r>
+      <w:r>
+        <w:t xml:space="preserve">containing the drug (single-ingredient or combination) and</w:t>
+      </w:r>
+      <w:r>
+        <w:t xml:space="preserve"> </w:t>
+      </w:r>
+      <w:r>
+        <w:rPr>
+          <w:i/>
+          <w:iCs/>
+        </w:rPr>
+        <w:t xml:space="preserve">unlabelled</w:t>
+      </w:r>
+      <w:r>
+        <w:t xml:space="preserve"> </w:t>
+      </w:r>
+      <w:r>
+        <w:t xml:space="preserve">otherwise, including drugs with no US label in the</w:t>
+      </w:r>
+      <w:r>
+        <w:t xml:space="preserve"> </w:t>
+      </w:r>
+      <w:r>
+        <w:t xml:space="preserve">export;</w:t>
+      </w:r>
+      <w:r>
+        <w:t xml:space="preserve"> </w:t>
+      </w:r>
+      <w:r>
+        <w:rPr>
+          <w:i/>
+          <w:iCs/>
+        </w:rPr>
+        <w:t xml:space="preserve">label-positive</w:t>
+      </w:r>
+      <w:r>
+        <w:t xml:space="preserve"> </w:t>
+      </w:r>
+      <w:r>
+        <w:t xml:space="preserve">and</w:t>
+      </w:r>
+      <w:r>
+        <w:t xml:space="preserve"> </w:t>
+      </w:r>
+      <w:r>
+        <w:rPr>
+          <w:i/>
+          <w:iCs/>
+        </w:rPr>
+        <w:t xml:space="preserve">label-negative</w:t>
+      </w:r>
+      <w:r>
+        <w:t xml:space="preserve"> </w:t>
+      </w:r>
+      <w:r>
+        <w:t xml:space="preserve">refer to the stricter reference-set classes. Robust unlabelled signals</w:t>
+      </w:r>
+      <w:r>
+        <w:t xml:space="preserve"> </w:t>
+      </w:r>
+      <w:r>
+        <w:t xml:space="preserve">were reviewed. For each we profiled the FAERS case series (without Canadian reports):</w:t>
       </w:r>
       <w:r>
         <w:t xml:space="preserve"> </w:t>
@@ -2478,25 +2575,7 @@
         <w:t xml:space="preserve">,</w:t>
       </w:r>
       <w:r>
-        <w:t xml:space="preserve">000 suspect reports), discrimination was moderate and practically identical for the crude and</w:t>
-      </w:r>
-      <w:r>
-        <w:t xml:space="preserve"> </w:t>
-      </w:r>
-      <w:r>
-        <w:t xml:space="preserve">adjusted lower bounds (AUC 0.718 and 0.723; difference</w:t>
-      </w:r>
-      <w:r>
-        <w:t xml:space="preserve"> </w:t>
-      </w:r>
-      <w:r>
-        <w:t xml:space="preserve">0.005, 95% CI -0.023 to 0.030). The same held for point</w:t>
-      </w:r>
-      <w:r>
-        <w:t xml:space="preserve"> </w:t>
-      </w:r>
-      <w:r>
-        <w:t xml:space="preserve">estimates (0.700 vs 0.705), for the IC</w:t>
+        <w:t xml:space="preserve">000 suspect reports), discrimination was moderate and practically identical: crude IC</w:t>
       </w:r>
       <m:oMath>
         <m:sSub>
@@ -2516,7 +2595,31 @@
         <w:t xml:space="preserve"> </w:t>
       </w:r>
       <w:r>
-        <w:t xml:space="preserve">(0.720), after excluding the 83 ingredients without an estimable</w:t>
+        <w:t xml:space="preserve">versus adjusted lower bound, as pre-specified, AUC 0.720 vs 0.723;</w:t>
+      </w:r>
+      <w:r>
+        <w:t xml:space="preserve"> </w:t>
+      </w:r>
+      <w:r>
+        <w:t xml:space="preserve">crude versus adjusted lower bound, the like-for-like pair, 0.718 vs</w:t>
+      </w:r>
+      <w:r>
+        <w:t xml:space="preserve"> </w:t>
+      </w:r>
+      <w:r>
+        <w:t xml:space="preserve">0.723 (difference 0.005, 95% CI -0.023 to</w:t>
+      </w:r>
+      <w:r>
+        <w:t xml:space="preserve"> </w:t>
+      </w:r>
+      <w:r>
+        <w:t xml:space="preserve">0.030). The same held for point estimates (0.700 vs</w:t>
+      </w:r>
+      <w:r>
+        <w:t xml:space="preserve"> </w:t>
+      </w:r>
+      <w:r>
+        <w:t xml:space="preserve">0.705), after excluding the 83 ingredients without an estimable</w:t>
       </w:r>
       <w:r>
         <w:t xml:space="preserve"> </w:t>
@@ -2599,13 +2702,45 @@
         </w:r>
       </w:hyperlink>
       <w:r>
-        <w:t xml:space="preserve">). The power-calibrated comparison</w:t>
-      </w:r>
-      <w:r>
-        <w:t xml:space="preserve"> </w:t>
-      </w:r>
-      <w:r>
-        <w:t xml:space="preserve">separated the groups more clearly (Figure </w:t>
+        <w:t xml:space="preserve">). In this pre-specified</w:t>
+      </w:r>
+      <w:r>
+        <w:t xml:space="preserve"> </w:t>
+      </w:r>
+      <w:r>
+        <w:t xml:space="preserve">comparison unlabelled signals replicated more often than the background (odds ratio</w:t>
+      </w:r>
+      <w:r>
+        <w:t xml:space="preserve"> </w:t>
+      </w:r>
+      <w:r>
+        <w:t xml:space="preserve">2.74, Fisher</w:t>
+      </w:r>
+      <w:r>
+        <w:t xml:space="preserve"> </w:t>
+      </w:r>
+      <m:oMath>
+        <m:r>
+          <m:t>p</m:t>
+        </m:r>
+        <m:r>
+          <m:rPr>
+            <m:sty m:val="p"/>
+          </m:rPr>
+          <m:t>&lt;</m:t>
+        </m:r>
+        <m:r>
+          <m:t>0.001</m:t>
+        </m:r>
+      </m:oMath>
+      <w:r>
+        <w:t xml:space="preserve">) but less often than labelled signals. The</w:t>
+      </w:r>
+      <w:r>
+        <w:t xml:space="preserve"> </w:t>
+      </w:r>
+      <w:r>
+        <w:t xml:space="preserve">power-calibrated comparison (post hoc) placed this contrast on a common scale (Figure </w:t>
       </w:r>
       <w:hyperlink w:anchor="_576b9bd78d0890981a1f156b59228419fd8f27c">
         <w:r>
@@ -2616,31 +2751,123 @@
         </w:r>
       </w:hyperlink>
       <w:r>
-        <w:t xml:space="preserve">): labelled signals replicated as often as their shrunken FAERS</w:t>
-      </w:r>
-      <w:r>
-        <w:t xml:space="preserve"> </w:t>
-      </w:r>
-      <w:r>
-        <w:t xml:space="preserve">estimates predicted (31 observed vs 30.5 expected; O/E 1.02, 95% CI 0.77–1.32), whereas unlabelled signals replicated less than half as often</w:t>
-      </w:r>
-      <w:r>
-        <w:t xml:space="preserve"> </w:t>
-      </w:r>
-      <w:r>
-        <w:t xml:space="preserve">(25 observed vs 56.8 expected; O/E 0.44, 95% CI 0.29–0.62), like label-negative signals (18 observed vs 37.5 expected; O/E 0.48, 95% CI 0.27–0.72). Results were the same</w:t>
-      </w:r>
-      <w:r>
-        <w:t xml:space="preserve"> </w:t>
-      </w:r>
-      <w:r>
-        <w:t xml:space="preserve">with unshrunken estimates and with the pre-specified label definition, and for tinnitus (60 observed vs 63.2 expected; O/E 0.95, 95% CI 0.79–1.13</w:t>
-      </w:r>
-      <w:r>
-        <w:t xml:space="preserve"> </w:t>
-      </w:r>
-      <w:r>
-        <w:t xml:space="preserve">for labelled and 22 observed vs 46.4 expected; O/E 0.47, 95% CI 0.30–0.66 for unlabelled signals).</w:t>
+        <w:t xml:space="preserve">): labelled signals</w:t>
+      </w:r>
+      <w:r>
+        <w:t xml:space="preserve"> </w:t>
+      </w:r>
+      <w:r>
+        <w:t xml:space="preserve">(n=70 ingredients) replicated about as often as their shrunken FAERS estimates predicted</w:t>
+      </w:r>
+      <w:r>
+        <w:t xml:space="preserve"> </w:t>
+      </w:r>
+      <w:r>
+        <w:t xml:space="preserve">(31 observed vs 30.5 expected; O/E 1.02, 95% CI 0.77–1.32), whereas unlabelled signals (n=201) replicated less than half</w:t>
+      </w:r>
+      <w:r>
+        <w:t xml:space="preserve"> </w:t>
+      </w:r>
+      <w:r>
+        <w:t xml:space="preserve">as often (25 observed vs 56.8 expected; O/E 0.44, 95% CI 0.29–0.62); the ratio of the two was 0.43</w:t>
+      </w:r>
+      <w:r>
+        <w:t xml:space="preserve"> </w:t>
+      </w:r>
+      <w:r>
+        <w:t xml:space="preserve">(95% CI 0.26–0.66). The</w:t>
+      </w:r>
+      <w:r>
+        <w:t xml:space="preserve"> </w:t>
+      </w:r>
+      <w:r>
+        <w:t xml:space="preserve">label-negative signals, a subset of the unlabelled group, behaved alike (18 observed vs 37.5 expected; O/E 0.48, 95% CI 0.27–0.72). Results were the</w:t>
+      </w:r>
+      <w:r>
+        <w:t xml:space="preserve"> </w:t>
+      </w:r>
+      <w:r>
+        <w:t xml:space="preserve">same with unshrunken estimates, with the pre-specified label definition, and for tinnitus (60 observed vs 63.2 expected; O/E 0.95, 95% CI 0.79–1.14 for</w:t>
+      </w:r>
+      <w:r>
+        <w:t xml:space="preserve"> </w:t>
+      </w:r>
+      <w:r>
+        <w:t xml:space="preserve">labelled and 22 observed vs 46.4 expected; O/E 0.47, 95% CI 0.29–0.66 for unlabelled signals).</w:t>
+      </w:r>
+    </w:p>
+    <w:p>
+      <w:pPr>
+        <w:pStyle w:val="BodyText"/>
+      </w:pPr>
+      <w:r>
+        <w:t xml:space="preserve">Unlabelled signals were more often reported by consumers (median share of FAERS cases</w:t>
+      </w:r>
+      <w:r>
+        <w:t xml:space="preserve"> </w:t>
+      </w:r>
+      <w:r>
+        <w:t xml:space="preserve">58% vs 39% for labelled signals) and</w:t>
+      </w:r>
+      <w:r>
+        <w:t xml:space="preserve"> </w:t>
+      </w:r>
+      <w:r>
+        <w:t xml:space="preserve">more often from the United States (67% vs 50%), so</w:t>
+      </w:r>
+      <w:r>
+        <w:t xml:space="preserve"> </w:t>
+      </w:r>
+      <w:r>
+        <w:t xml:space="preserve">provenance could explain the contrast. It did not: among signals with a consumer share at or below the median, O/E was</w:t>
+      </w:r>
+      <w:r>
+        <w:t xml:space="preserve"> </w:t>
+      </w:r>
+      <w:r>
+        <w:t xml:space="preserve">1.01 for labelled and</w:t>
+      </w:r>
+      <w:r>
+        <w:t xml:space="preserve"> </w:t>
+      </w:r>
+      <w:r>
+        <w:t xml:space="preserve">0.57 (95% CI</w:t>
+      </w:r>
+      <w:r>
+        <w:t xml:space="preserve"> </w:t>
+      </w:r>
+      <w:r>
+        <w:t xml:space="preserve">0.27–0.93) for</w:t>
+      </w:r>
+      <w:r>
+        <w:t xml:space="preserve"> </w:t>
+      </w:r>
+      <w:r>
+        <w:t xml:space="preserve">unlabelled signals, and above the median 1.04 and</w:t>
+      </w:r>
+      <w:r>
+        <w:t xml:space="preserve"> </w:t>
+      </w:r>
+      <w:r>
+        <w:t xml:space="preserve">0.36. Pooled across ingredients (random effects), the Canadian ROR</w:t>
+      </w:r>
+      <w:r>
+        <w:t xml:space="preserve"> </w:t>
+      </w:r>
+      <w:r>
+        <w:t xml:space="preserve">was 3.60 (2.47–5.26)</w:t>
+      </w:r>
+      <w:r>
+        <w:t xml:space="preserve"> </w:t>
+      </w:r>
+      <w:r>
+        <w:t xml:space="preserve">for labelled and 1.59 (1.28–1.96)</w:t>
+      </w:r>
+      <w:r>
+        <w:t xml:space="preserve"> </w:t>
+      </w:r>
+      <w:r>
+        <w:t xml:space="preserve">for unlabelled signals: as a group, unlabelled signals were attenuated rather than absent.</w:t>
       </w:r>
     </w:p>
     <w:p>
@@ -2706,7 +2933,13 @@
         <w:t xml:space="preserve"> </w:t>
       </w:r>
       <w:r>
-        <w:t xml:space="preserve">361 hearing-loss reports in FAERS but none in Canada Vigilance against 3.4 expected, and</w:t>
+        <w:t xml:space="preserve">361 hearing-loss reports in FAERS (86% from consumers,</w:t>
+      </w:r>
+      <w:r>
+        <w:t xml:space="preserve"> </w:t>
+      </w:r>
+      <w:r>
+        <w:t xml:space="preserve">97% from the United States) but none in Canada Vigilance against 3.4 expected, and</w:t>
       </w:r>
       <w:r>
         <w:t xml:space="preserve"> </w:t>
@@ -2718,7 +2951,13 @@
         <w:t xml:space="preserve">,</w:t>
       </w:r>
       <w:r>
-        <w:t xml:space="preserve">801 FAERS reports) none against 1.9 expected (too few to be testable).</w:t>
+        <w:t xml:space="preserve">801 FAERS hearing-loss reports; 88% from consumers) none against</w:t>
+      </w:r>
+      <w:r>
+        <w:t xml:space="preserve"> </w:t>
+      </w:r>
+      <w:r>
+        <w:t xml:space="preserve">1.9 expected (too few to be testable).</w:t>
       </w:r>
     </w:p>
     <w:p>
@@ -2756,19 +2995,25 @@
         <w:t xml:space="preserve"> </w:t>
       </w:r>
       <w:r>
-        <w:t xml:space="preserve">did not separate crude-only from adjusted hearing-loss signals (early adjusted signals recurred after 2014 in</w:t>
-      </w:r>
-      <w:r>
-        <w:t xml:space="preserve"> </w:t>
-      </w:r>
-      <w:r>
-        <w:t xml:space="preserve">81/155 (52%), crude-only signals in 18/28 (64%), background 137/938 (15%)); for</w:t>
-      </w:r>
-      <w:r>
-        <w:t xml:space="preserve"> </w:t>
-      </w:r>
-      <w:r>
-        <w:t xml:space="preserve">tinnitus adjusted signals recurred more often (100/121 (83%) vs 9/15 (60%)).</w:t>
+        <w:t xml:space="preserve">did not favour adjustment for hearing loss: early crude-only signals recurred after 2014 at least as often</w:t>
+      </w:r>
+      <w:r>
+        <w:t xml:space="preserve"> </w:t>
+      </w:r>
+      <w:r>
+        <w:t xml:space="preserve">(18/28 (64%)) as early adjusted signals (81/155 (52%); background 137/938 (15%)),</w:t>
+      </w:r>
+      <w:r>
+        <w:t xml:space="preserve"> </w:t>
+      </w:r>
+      <w:r>
+        <w:t xml:space="preserve">consistent with biases that persist within one database; for tinnitus adjusted signals recurred more often</w:t>
+      </w:r>
+      <w:r>
+        <w:t xml:space="preserve"> </w:t>
+      </w:r>
+      <w:r>
+        <w:t xml:space="preserve">(100/121 (83%) vs 9/15 (60%)).</w:t>
       </w:r>
     </w:p>
     <w:p>
@@ -2841,7 +3086,7 @@
         <w:t xml:space="preserve"> </w:t>
       </w:r>
       <w:r>
-        <w:t xml:space="preserve">0.76–1.49) for labelled and</w:t>
+        <w:t xml:space="preserve">0.79–1.48) for labelled and</w:t>
       </w:r>
       <w:r>
         <w:t xml:space="preserve"> </w:t>
@@ -2853,7 +3098,49 @@
         <w:t xml:space="preserve"> </w:t>
       </w:r>
       <w:r>
-        <w:t xml:space="preserve">for unlabelled signals. Across the co-medication variants and the restriction of Canada Vigilance to reports from 2004,</w:t>
+        <w:t xml:space="preserve">for unlabelled signals (ratio 0.24, 95% CI</w:t>
+      </w:r>
+      <w:r>
+        <w:t xml:space="preserve"> </w:t>
+      </w:r>
+      <w:r>
+        <w:t xml:space="preserve">0.09–0.44); the pooled</w:t>
+      </w:r>
+      <w:r>
+        <w:t xml:space="preserve"> </w:t>
+      </w:r>
+      <w:r>
+        <w:t xml:space="preserve">Canadian adjusted OR was 4.25 (2.73–6.64)</w:t>
+      </w:r>
+      <w:r>
+        <w:t xml:space="preserve"> </w:t>
+      </w:r>
+      <w:r>
+        <w:t xml:space="preserve">for labelled, 1.37 (1.03–1.83)</w:t>
+      </w:r>
+      <w:r>
+        <w:t xml:space="preserve"> </w:t>
+      </w:r>
+      <w:r>
+        <w:t xml:space="preserve">for unlabelled and 1.29 (1.00–1.66)</w:t>
+      </w:r>
+      <w:r>
+        <w:t xml:space="preserve"> </w:t>
+      </w:r>
+      <w:r>
+        <w:t xml:space="preserve">for label-negative signals. For tinnitus, labelled signals replicated less fully in this framework (O/E</w:t>
+      </w:r>
+      <w:r>
+        <w:t xml:space="preserve"> </w:t>
+      </w:r>
+      <w:r>
+        <w:t xml:space="preserve">0.70, 95% CI 0.54–0.88),</w:t>
+      </w:r>
+      <w:r>
+        <w:t xml:space="preserve"> </w:t>
+      </w:r>
+      <w:r>
+        <w:t xml:space="preserve">with unlabelled signals lower still (0.21). Across the co-medication variants and the restriction of Canada Vigilance to reports from 2004,</w:t>
       </w:r>
       <w:r>
         <w:t xml:space="preserve"> </w:t>
@@ -3109,13 +3396,13 @@
         <w:t xml:space="preserve"> </w:t>
       </w:r>
       <w:r>
-        <w:t xml:space="preserve">1 to an established ototoxic class (oral paromomycin) and 4 to an indication whose</w:t>
-      </w:r>
-      <w:r>
-        <w:t xml:space="preserve"> </w:t>
-      </w:r>
-      <w:r>
-        <w:t xml:space="preserve">association with the event was confirmed by the active-comparator check (etanercept against other rheumatoid-arthritis drugs,</w:t>
+        <w:t xml:space="preserve">1 to an established ototoxic class (oral paromomycin) and 4 to an indication, with an</w:t>
+      </w:r>
+      <w:r>
+        <w:t xml:space="preserve"> </w:t>
+      </w:r>
+      <w:r>
+        <w:t xml:space="preserve">active-comparator estimate consistent with it (etanercept against other rheumatoid-arthritis drugs,</w:t>
       </w:r>
       <w:r>
         <w:t xml:space="preserve"> </w:t>
@@ -3127,7 +3414,13 @@
         <w:t xml:space="preserve"> </w:t>
       </w:r>
       <w:r>
-        <w:t xml:space="preserve">0.82 (0.63–1.06); chlorthalidone within hypertension, 1.04 (0.43–2.51)). For seven signals the</w:t>
+        <w:t xml:space="preserve">0.82 (0.63–1.06); and chlorthalidone within hypertension, 1.04 (0.43–2.51), which is indeterminate with</w:t>
+      </w:r>
+      <w:r>
+        <w:t xml:space="preserve"> </w:t>
+      </w:r>
+      <w:r>
+        <w:t xml:space="preserve">5 cases). For seven signals the</w:t>
       </w:r>
       <w:r>
         <w:t xml:space="preserve"> </w:t>
@@ -3206,7 +3499,13 @@
         <w:t xml:space="preserve"> </w:t>
       </w:r>
       <w:r>
-        <w:t xml:space="preserve">(Supplementary Table S3).</w:t>
+        <w:t xml:space="preserve">(Supplementary Table S3). Before the post-hoc active-comparator rule, only two (pregabalin and doxycycline)</w:t>
+      </w:r>
+      <w:r>
+        <w:t xml:space="preserve"> </w:t>
+      </w:r>
+      <w:r>
+        <w:t xml:space="preserve">were unexplained; the residual count therefore ranges from 2 to 9 depending on post-hoc choices and assessor.</w:t>
       </w:r>
     </w:p>
     <w:bookmarkStart w:id="28" w:name="_01d9fd756df68368595dee6b7688533f3c9fbbd"/>
@@ -4158,7 +4457,7 @@
               <w:jc w:val="center"/>
             </w:pPr>
             <w:r>
-              <w:t xml:space="preserve">60/63.2 = 0.95 (0.79–1.13)</w:t>
+              <w:t xml:space="preserve">60/63.2 = 0.95 (0.79–1.14)</w:t>
             </w:r>
           </w:p>
         </w:tc>
@@ -4186,7 +4485,7 @@
               <w:jc w:val="center"/>
             </w:pPr>
             <w:r>
-              <w:t xml:space="preserve">22/46.4 = 0.47 (0.30–0.66)</w:t>
+              <w:t xml:space="preserve">22/46.4 = 0.47 (0.29–0.66)</w:t>
             </w:r>
           </w:p>
         </w:tc>
@@ -4214,7 +4513,7 @@
               <w:jc w:val="center"/>
             </w:pPr>
             <w:r>
-              <w:t xml:space="preserve">16/33.8 = 0.47 (0.28–0.71)</w:t>
+              <w:t xml:space="preserve">16/33.8 = 0.47 (0.27–0.72)</w:t>
             </w:r>
           </w:p>
         </w:tc>
@@ -8707,13 +9006,19 @@
         <w:t xml:space="preserve"> </w:t>
       </w:r>
       <w:r>
-        <w:t xml:space="preserve">for labelled associations—they replicated about as often as their strength predicted—but unlabelled signals replicated</w:t>
-      </w:r>
-      <w:r>
-        <w:t xml:space="preserve"> </w:t>
-      </w:r>
-      <w:r>
-        <w:t xml:space="preserve">less than half as often as predicted, about as often as signals for drugs whose labels are silent on hearing. Third,</w:t>
+        <w:t xml:space="preserve">for labelled hearing-loss associations—they replicated about as often as their strength predicted—whereas unlabelled</w:t>
+      </w:r>
+      <w:r>
+        <w:t xml:space="preserve"> </w:t>
+      </w:r>
+      <w:r>
+        <w:t xml:space="preserve">signals replicated less than half as often, a contrast that held within strata of consumer reporting and whose pooled</w:t>
+      </w:r>
+      <w:r>
+        <w:t xml:space="preserve"> </w:t>
+      </w:r>
+      <w:r>
+        <w:t xml:space="preserve">Canadian estimate (attenuated, not absent) was close to that of signals for drugs whose labels are silent on hearing. Third,</w:t>
       </w:r>
       <w:r>
         <w:t xml:space="preserve"> </w:t>
@@ -8743,7 +9048,13 @@
         <w:t xml:space="preserve"> </w:t>
       </w:r>
       <w:r>
-        <w:t xml:space="preserve">signals remained.</w:t>
+        <w:t xml:space="preserve">signals remained (2 to 9 under alternative post-hoc choices and assessors). For tinnitus the same pattern held,</w:t>
+      </w:r>
+      <w:r>
+        <w:t xml:space="preserve"> </w:t>
+      </w:r>
+      <w:r>
+        <w:t xml:space="preserve">but labelled signals also replicated less fully once both databases were adjusted, so the evidence there is weaker.</w:t>
       </w:r>
     </w:p>
     <w:p>
@@ -8781,7 +9092,7 @@
         <w:t xml:space="preserve"> </w:t>
       </w:r>
       <w:r>
-        <w:t xml:space="preserve">of FAERS reports, consistent with manufacturer programmes in the United States, and none in Canada. The same mechanism</w:t>
+        <w:t xml:space="preserve">of FAERS hearing-loss reports, mostly from US consumers and consistent with manufacturer programmes, and none in Canada. The same mechanism</w:t>
       </w:r>
       <w:r>
         <w:t xml:space="preserve"> </w:t>
@@ -8822,7 +9133,7 @@
         <w:pStyle w:val="BodyText"/>
       </w:pPr>
       <w:r>
-        <w:t xml:space="preserve">Several steps flagged most of the artefacts identified in this study: comparing</w:t>
+        <w:t xml:space="preserve">In this study three steps did most of the work: comparing</w:t>
       </w:r>
       <w:r>
         <w:t xml:space="preserve"> </w:t>
@@ -9226,7 +9537,19 @@
         <w:t xml:space="preserve"> </w:t>
       </w:r>
       <w:r>
-        <w:t xml:space="preserve">independent clinicians; the two assessments are therefore not fully independent.</w:t>
+        <w:t xml:space="preserve">independent clinicians; the two assessments are therefore not fully independent, and the agreement statistic should be read</w:t>
+      </w:r>
+      <w:r>
+        <w:t xml:space="preserve"> </w:t>
+      </w:r>
+      <w:r>
+        <w:t xml:space="preserve">in that light. Within-indication comparisons can be affected by channelling (for example tofacitinib as a second-line drug).</w:t>
+      </w:r>
+      <w:r>
+        <w:t xml:space="preserve"> </w:t>
+      </w:r>
+      <w:r>
+        <w:t xml:space="preserve">FAERS report-source codes that would identify solicited reports directly were not used.</w:t>
       </w:r>
     </w:p>
     <w:p>
@@ -9244,13 +9567,13 @@
         <w:pStyle w:val="FirstParagraph"/>
       </w:pPr>
       <w:r>
-        <w:t xml:space="preserve">In FAERS, most drug–hearing-loss signals that are not already on a label do not survive adjustment,</w:t>
-      </w:r>
-      <w:r>
-        <w:t xml:space="preserve"> </w:t>
-      </w:r>
-      <w:r>
-        <w:t xml:space="preserve">adjusted replication in Canada Vigilance and a review of report provenance; disproportionality analysis remains a</w:t>
+        <w:t xml:space="preserve">In FAERS, most drug–hearing-loss signals that are not already on a label do not survive adjusted</w:t>
+      </w:r>
+      <w:r>
+        <w:t xml:space="preserve"> </w:t>
+      </w:r>
+      <w:r>
+        <w:t xml:space="preserve">replication in Canada Vigilance and a review of report provenance; disproportionality analysis remains a</w:t>
       </w:r>
       <w:r>
         <w:t xml:space="preserve"> </w:t>

</xml_diff>

<commit_message>
Prepare Public Release: Past-Tense Competing Interest, Repository URL, Citation File
Co-Authored-By: Claude Opus 5.5 (1M context) <noreply@anthropic.com>
</commit_message>
<xml_diff>
--- a/paper/manuscript.docx
+++ b/paper/manuscript.docx
@@ -9635,7 +9635,7 @@
         <w:t xml:space="preserve"> </w:t>
       </w:r>
       <w:r>
-        <w:t xml:space="preserve">the author is employed as a software engineer at Suno, a company that develops practice-management software for hearing clinics; the company had no role in the design, analysis or reporting of this study, and the author has no financial relationship with manufacturers of the drugs studied.</w:t>
+        <w:t xml:space="preserve">until October 2026 the author was employed as a software engineer at Suno, a company that develops practice-management software for hearing clinics; the company had no role in the design, analysis or reporting of this study, and the author has no financial relationship with manufacturers of the drugs studied.</w:t>
       </w:r>
       <w:r>
         <w:t xml:space="preserve"> </w:t>
@@ -9714,7 +9714,7 @@
         <w:t xml:space="preserve">PROTOCOL.md</w:t>
       </w:r>
       <w:r>
-        <w:t xml:space="preserve">, with commit history) and results:</w:t>
+        <w:t xml:space="preserve">, with commit history) and results: https://github.com/olegtropinin/faers-ototoxicity.</w:t>
       </w:r>
       <w:r>
         <w:t xml:space="preserve"> </w:t>

</xml_diff>

<commit_message>
External Review Fixes: Table S4 Overlap Note, Supplement Title, Abstract AUC Wording, Protocol Timing
Co-Authored-By: Claude Opus 5.5 (1M context) <noreply@anthropic.com>
</commit_message>
<xml_diff>
--- a/paper/manuscript.docx
+++ b/paper/manuscript.docx
@@ -79,7 +79,7 @@
         <w:t xml:space="preserve"> </w:t>
       </w:r>
       <w:r>
-        <w:t xml:space="preserve">Recent disproportionality analyses of the US Food and Drug Administration Adverse Event</w:t>
+        <w:t xml:space="preserve">Recent analyses of the US Food and Drug Administration Adverse Event</w:t>
       </w:r>
       <w:r>
         <w:t xml:space="preserve"> </w:t>
@@ -194,25 +194,19 @@
         <w:t xml:space="preserve"> </w:t>
       </w:r>
       <w:r>
-        <w:t xml:space="preserve">Adjustment changed the hearing-loss signal list (300 crude, 310</w:t>
-      </w:r>
-      <w:r>
-        <w:t xml:space="preserve"> </w:t>
-      </w:r>
-      <w:r>
-        <w:t xml:space="preserve">adjusted, 63 lost) but not agreement with labels (AUC 0.718 vs</w:t>
-      </w:r>
-      <w:r>
-        <w:t xml:space="preserve"> </w:t>
-      </w:r>
-      <w:r>
-        <w:t xml:space="preserve">0.723). Unlabelled signals replicated in Canada more often than background but less often than</w:t>
-      </w:r>
-      <w:r>
-        <w:t xml:space="preserve"> </w:t>
-      </w:r>
-      <w:r>
-        <w:t xml:space="preserve">labelled ones; power-calibrated (post hoc), labelled signals replicated as predicted (observed/expected</w:t>
+        <w:t xml:space="preserve">Adjustment changed the hearing-loss signal list (63 of</w:t>
+      </w:r>
+      <w:r>
+        <w:t xml:space="preserve"> </w:t>
+      </w:r>
+      <w:r>
+        <w:t xml:space="preserve">300 crude signals lost) but not agreement with labels (AUC, crude vs adjusted lower bound:</w:t>
+      </w:r>
+      <w:r>
+        <w:t xml:space="preserve"> </w:t>
+      </w:r>
+      <w:r>
+        <w:t xml:space="preserve">0.718 vs 0.723). Unlabelled signals replicated in Canada more than background but less than labelled ones; power-calibrated (post hoc), labelled signals replicated as predicted (observed/expected</w:t>
       </w:r>
       <w:r>
         <w:t xml:space="preserve"> </w:t>
@@ -272,7 +266,7 @@
         <w:t xml:space="preserve"> </w:t>
       </w:r>
       <w:r>
-        <w:t xml:space="preserve">review. These findings are hypothesis-generating; cross-database replication needs adjusted estimates and explicit</w:t>
+        <w:t xml:space="preserve">review. Findings are hypothesis-generating; cross-database replication needs adjusted estimates and explicit</w:t>
       </w:r>
       <w:r>
         <w:t xml:space="preserve"> </w:t>
@@ -664,7 +658,19 @@
         <w:t xml:space="preserve"> </w:t>
       </w:r>
       <w:r>
-        <w:t xml:space="preserve">computed; it is time-stamped, not registered with a third party; every later change is dated and</w:t>
+        <w:t xml:space="preserve">computed (the first disproportionality estimates were produced at 02:47–02:49 the same night, after only data preparation,</w:t>
+      </w:r>
+      <w:r>
+        <w:t xml:space="preserve"> </w:t>
+      </w:r>
+      <w:r>
+        <w:t xml:space="preserve">construction of the label reference set and tests on simulated data); it is time-stamped in a repository controlled by the</w:t>
+      </w:r>
+      <w:r>
+        <w:t xml:space="preserve"> </w:t>
+      </w:r>
+      <w:r>
+        <w:t xml:space="preserve">author, not registered with a third party; every later change is dated and</w:t>
       </w:r>
       <w:r>
         <w:t xml:space="preserve"> </w:t>

</xml_diff>

<commit_message>
Review Revisions: Study Workflow Figure, Protocol Statement, Active-Comparator Rationale, AUC Interpretation, Hypothesis Framing
Co-Authored-By: Claude Opus 5.5 <noreply@anthropic.com>
</commit_message>
<xml_diff>
--- a/paper/manuscript.docx
+++ b/paper/manuscript.docx
@@ -194,19 +194,25 @@
         <w:t xml:space="preserve"> </w:t>
       </w:r>
       <w:r>
-        <w:t xml:space="preserve">Adjustment changed the hearing-loss signal list (63 of</w:t>
-      </w:r>
-      <w:r>
-        <w:t xml:space="preserve"> </w:t>
-      </w:r>
-      <w:r>
-        <w:t xml:space="preserve">300 crude signals lost) but not agreement with labels (AUC, crude vs adjusted lower bound:</w:t>
-      </w:r>
-      <w:r>
-        <w:t xml:space="preserve"> </w:t>
-      </w:r>
-      <w:r>
-        <w:t xml:space="preserve">0.718 vs 0.723). Unlabelled signals replicated in Canada more than background but less than labelled ones; power-calibrated (post hoc), labelled signals replicated as predicted (observed/expected</w:t>
+        <w:t xml:space="preserve">Adjustment substantially changed the hearing-loss signal list</w:t>
+      </w:r>
+      <w:r>
+        <w:t xml:space="preserve"> </w:t>
+      </w:r>
+      <w:r>
+        <w:t xml:space="preserve">(63 of 300 crude signals lost, 73 gained) but not agreement</w:t>
+      </w:r>
+      <w:r>
+        <w:t xml:space="preserve"> </w:t>
+      </w:r>
+      <w:r>
+        <w:t xml:space="preserve">with labels (AUC, crude vs adjusted lower bound: 0.718 vs</w:t>
+      </w:r>
+      <w:r>
+        <w:t xml:space="preserve"> </w:t>
+      </w:r>
+      <w:r>
+        <w:t xml:space="preserve">0.723). Unlabelled signals replicated in Canada more than background but less than labelled ones; power-calibrated (post hoc), labelled signals replicated as predicted (observed/expected</w:t>
       </w:r>
       <w:r>
         <w:t xml:space="preserve"> </w:t>
@@ -242,7 +248,7 @@
         <w:t xml:space="preserve"> </w:t>
       </w:r>
       <w:r>
-        <w:t xml:space="preserve">alternative choices), led by pregabalin.</w:t>
+        <w:t xml:space="preserve">alternative choices).</w:t>
       </w:r>
     </w:p>
     <w:p>
@@ -342,7 +348,7 @@
         <w:t xml:space="preserve"> </w:t>
       </w:r>
       <w:r>
-        <w:t xml:space="preserve">remained, led by pregabalin; they are hypotheses for exposure-based studies.</w:t>
+        <w:t xml:space="preserve">remained; they are hypotheses for exposure-based studies, not established adverse effects.</w:t>
       </w:r>
     </w:p>
     <w:p>
@@ -360,19 +366,13 @@
         <w:pStyle w:val="FirstParagraph"/>
       </w:pPr>
       <w:r>
-        <w:t xml:space="preserve">Drug-induced hearing loss ranges from reversible (salicylates, loop diuretics, quinine, macrolides) to permanent</w:t>
-      </w:r>
-      <w:r>
-        <w:t xml:space="preserve"> </w:t>
-      </w:r>
-      <w:r>
-        <w:t xml:space="preserve">(aminoglycosides, platinum agents), and the classical ototoxic drug classes were identified mainly through clinical</w:t>
-      </w:r>
-      <w:r>
-        <w:t xml:space="preserve"> </w:t>
-      </w:r>
-      <w:r>
-        <w:t xml:space="preserve">observation and case series</w:t>
+        <w:t xml:space="preserve">The classical ototoxic drugs—aminoglycosides, platinum agents, loop diuretics, quinine, salicylates—were identified</w:t>
+      </w:r>
+      <w:r>
+        <w:t xml:space="preserve"> </w:t>
+      </w:r>
+      <w:r>
+        <w:t xml:space="preserve">mainly through clinical observation and case series</w:t>
       </w:r>
       <w:r>
         <w:t xml:space="preserve"> </w:t>
@@ -381,19 +381,19 @@
         <w:t xml:space="preserve">[1]</w:t>
       </w:r>
       <w:r>
-        <w:t xml:space="preserve">. For newer drugs, post-marketing spontaneous reports</w:t>
-      </w:r>
-      <w:r>
-        <w:t xml:space="preserve"> </w:t>
-      </w:r>
-      <w:r>
-        <w:t xml:space="preserve">are often the first source of evidence, and recent studies have screened the FDA Adverse Event Reporting System (FAERS)</w:t>
-      </w:r>
-      <w:r>
-        <w:t xml:space="preserve"> </w:t>
-      </w:r>
-      <w:r>
-        <w:t xml:space="preserve">across all drugs for hearing-loss signals</w:t>
+        <w:t xml:space="preserve">. For newer drugs, spontaneous reports are often the</w:t>
+      </w:r>
+      <w:r>
+        <w:t xml:space="preserve"> </w:t>
+      </w:r>
+      <w:r>
+        <w:t xml:space="preserve">first evidence, and recent studies have screened the FDA Adverse Event Reporting System (FAERS) across all drugs for</w:t>
+      </w:r>
+      <w:r>
+        <w:t xml:space="preserve"> </w:t>
+      </w:r>
+      <w:r>
+        <w:t xml:space="preserve">hearing-loss signals</w:t>
       </w:r>
       <w:r>
         <w:t xml:space="preserve"> </w:t>
@@ -414,13 +414,13 @@
         <w:t xml:space="preserve">[5,6]</w:t>
       </w:r>
       <w:r>
-        <w:t xml:space="preserve">;</w:t>
-      </w:r>
-      <w:r>
-        <w:t xml:space="preserve"> </w:t>
-      </w:r>
-      <w:r>
-        <w:t xml:space="preserve">national databases in Japan and France have been used for the same purpose</w:t>
+        <w:t xml:space="preserve">, as have national</w:t>
+      </w:r>
+      <w:r>
+        <w:t xml:space="preserve"> </w:t>
+      </w:r>
+      <w:r>
+        <w:t xml:space="preserve">databases in Japan and France</w:t>
       </w:r>
       <w:r>
         <w:t xml:space="preserve"> </w:t>
@@ -429,7 +429,13 @@
         <w:t xml:space="preserve">[7,8]</w:t>
       </w:r>
       <w:r>
-        <w:t xml:space="preserve">.</w:t>
+        <w:t xml:space="preserve">. These screens identify many unlabelled signals, but few</w:t>
+      </w:r>
+      <w:r>
+        <w:t xml:space="preserve"> </w:t>
+      </w:r>
+      <w:r>
+        <w:t xml:space="preserve">evaluate whether those signals survive adjustment and independent replication.</w:t>
       </w:r>
     </w:p>
     <w:p>
@@ -443,13 +449,13 @@
         <w:t xml:space="preserve"> </w:t>
       </w:r>
       <w:r>
-        <w:t xml:space="preserve">label. In this setting crude disproportionality is open to biases specific to hearing outcomes. Corticosteroids,</w:t>
-      </w:r>
-      <w:r>
-        <w:t xml:space="preserve"> </w:t>
-      </w:r>
-      <w:r>
-        <w:t xml:space="preserve">vasodilators and antivirals are prescribed</w:t>
+        <w:t xml:space="preserve">label. This design is open to biases specific to hearing outcomes. Corticosteroids, vasodilators and antivirals are</w:t>
+      </w:r>
+      <w:r>
+        <w:t xml:space="preserve"> </w:t>
+      </w:r>
+      <w:r>
+        <w:t xml:space="preserve">prescribed</w:t>
       </w:r>
       <w:r>
         <w:t xml:space="preserve"> </w:t>
@@ -465,43 +471,25 @@
         <w:t xml:space="preserve"> </w:t>
       </w:r>
       <w:r>
-        <w:t xml:space="preserve">sudden hearing loss and tinnitus, and several diseases cause hearing</w:t>
-      </w:r>
-      <w:r>
-        <w:t xml:space="preserve"> </w:t>
-      </w:r>
-      <w:r>
-        <w:t xml:space="preserve">loss themselves, so their treatments co-occur with the event (confounding by indication). A drug routinely given with a</w:t>
-      </w:r>
-      <w:r>
-        <w:t xml:space="preserve"> </w:t>
-      </w:r>
-      <w:r>
-        <w:t xml:space="preserve">strongly ototoxic one—an antiemetic with cisplatin, an antibiotic with an aminoglycoside—inherits part of the</w:t>
-      </w:r>
-      <w:r>
-        <w:t xml:space="preserve"> </w:t>
-      </w:r>
-      <w:r>
-        <w:t xml:space="preserve">association (co-medication or</w:t>
-      </w:r>
-      <w:r>
-        <w:t xml:space="preserve"> </w:t>
-      </w:r>
-      <w:r>
-        <w:t xml:space="preserve">“innocent bystander”</w:t>
-      </w:r>
-      <w:r>
-        <w:t xml:space="preserve"> </w:t>
-      </w:r>
-      <w:r>
-        <w:t xml:space="preserve">bias). Reporting can be stimulated by safety communications,</w:t>
-      </w:r>
-      <w:r>
-        <w:t xml:space="preserve"> </w:t>
-      </w:r>
-      <w:r>
-        <w:t xml:space="preserve">litigation or media attention</w:t>
+        <w:t xml:space="preserve">sudden hearing loss and tinnitus, and several diseases cause hearing loss themselves (confounding by</w:t>
+      </w:r>
+      <w:r>
+        <w:t xml:space="preserve"> </w:t>
+      </w:r>
+      <w:r>
+        <w:t xml:space="preserve">indication). A drug routinely given with a strongly ototoxic one—an antiemetic with cisplatin, an antibiotic with an</w:t>
+      </w:r>
+      <w:r>
+        <w:t xml:space="preserve"> </w:t>
+      </w:r>
+      <w:r>
+        <w:t xml:space="preserve">aminoglycoside—inherits part of the association (co-medication bias). Reporting can be stimulated by safety</w:t>
+      </w:r>
+      <w:r>
+        <w:t xml:space="preserve"> </w:t>
+      </w:r>
+      <w:r>
+        <w:t xml:space="preserve">communications, litigation or media attention</w:t>
       </w:r>
       <w:r>
         <w:t xml:space="preserve"> </w:t>
@@ -510,13 +498,13 @@
         <w:t xml:space="preserve">[9]</w:t>
       </w:r>
       <w:r>
-        <w:t xml:space="preserve">. Editorials have questioned the value of disproportionality analyses</w:t>
-      </w:r>
-      <w:r>
-        <w:t xml:space="preserve"> </w:t>
-      </w:r>
-      <w:r>
-        <w:t xml:space="preserve">that do not address such biases</w:t>
+        <w:t xml:space="preserve">. Editorials have questioned disproportionality analyses</w:t>
+      </w:r>
+      <w:r>
+        <w:t xml:space="preserve"> </w:t>
+      </w:r>
+      <w:r>
+        <w:t xml:space="preserve">that ignore such biases</w:t>
       </w:r>
       <w:r>
         <w:t xml:space="preserve"> </w:t>
@@ -525,13 +513,13 @@
         <w:t xml:space="preserve">[10]</w:t>
       </w:r>
       <w:r>
-        <w:t xml:space="preserve">, and few FAERS screens test their signal lists against an independent</w:t>
-      </w:r>
-      <w:r>
-        <w:t xml:space="preserve"> </w:t>
-      </w:r>
-      <w:r>
-        <w:t xml:space="preserve">data source or a reference set, as done in evaluations of signal-detection methods</w:t>
+        <w:t xml:space="preserve">, and signal lists are rarely tested against an independent data source or a</w:t>
+      </w:r>
+      <w:r>
+        <w:t xml:space="preserve"> </w:t>
+      </w:r>
+      <w:r>
+        <w:t xml:space="preserve">reference set, as is done in evaluations of signal-detection methods</w:t>
       </w:r>
       <w:r>
         <w:t xml:space="preserve"> </w:t>
@@ -646,37 +634,37 @@
         <w:t xml:space="preserve"> </w:t>
       </w:r>
       <w:r>
-        <w:t xml:space="preserve">Supplementary Table S1. The analysis protocol, with all definitions and thresholds of the primary analysis, was written and</w:t>
-      </w:r>
-      <w:r>
-        <w:t xml:space="preserve"> </w:t>
-      </w:r>
-      <w:r>
-        <w:t xml:space="preserve">committed to a version-controlled repository (git commit ff77c40, 26 October 2026, 02:05 UTC+5) before the first result was</w:t>
-      </w:r>
-      <w:r>
-        <w:t xml:space="preserve"> </w:t>
-      </w:r>
-      <w:r>
-        <w:t xml:space="preserve">computed (the first disproportionality estimates were produced at 02:47–02:49 the same night, after only data preparation,</w:t>
-      </w:r>
-      <w:r>
-        <w:t xml:space="preserve"> </w:t>
-      </w:r>
-      <w:r>
-        <w:t xml:space="preserve">construction of the label reference set and tests on simulated data); it is time-stamped in a repository controlled by the</w:t>
-      </w:r>
-      <w:r>
-        <w:t xml:space="preserve"> </w:t>
-      </w:r>
-      <w:r>
-        <w:t xml:space="preserve">author, not registered with a third party; every later change is dated and</w:t>
-      </w:r>
-      <w:r>
-        <w:t xml:space="preserve"> </w:t>
-      </w:r>
-      <w:r>
-        <w:t xml:space="preserve">labelled in that file (</w:t>
+        <w:t xml:space="preserve">Supplementary Table S1. Primary analysis decisions were committed before the first result was computed; all later analyses</w:t>
+      </w:r>
+      <w:r>
+        <w:t xml:space="preserve"> </w:t>
+      </w:r>
+      <w:r>
+        <w:t xml:space="preserve">are labelled post hoc. The protocol, with all definitions and thresholds of the primary analysis, was committed to a</w:t>
+      </w:r>
+      <w:r>
+        <w:t xml:space="preserve"> </w:t>
+      </w:r>
+      <w:r>
+        <w:t xml:space="preserve">version-controlled repository at 02:05 UTC+5 on 26 October 2026 (git commit ff77c40). The first disproportionality estimates</w:t>
+      </w:r>
+      <w:r>
+        <w:t xml:space="preserve"> </w:t>
+      </w:r>
+      <w:r>
+        <w:t xml:space="preserve">were produced at 02:47–02:49 the same night; before that, only data preparation, the label reference set and tests on</w:t>
+      </w:r>
+      <w:r>
+        <w:t xml:space="preserve"> </w:t>
+      </w:r>
+      <w:r>
+        <w:t xml:space="preserve">simulated data had been run. The repository is controlled by the author and the protocol was not registered with a third</w:t>
+      </w:r>
+      <w:r>
+        <w:t xml:space="preserve"> </w:t>
+      </w:r>
+      <w:r>
+        <w:t xml:space="preserve">party. Every later change is dated and labelled in the protocol file (</w:t>
       </w:r>
       <w:r>
         <w:rPr>
@@ -685,18 +673,95 @@
         <w:t xml:space="preserve">PROTOCOL.md</w:t>
       </w:r>
       <w:r>
-        <w:t xml:space="preserve">), and analyses added after results were seen are reported as post hoc.</w:t>
+        <w:t xml:space="preserve">). Figure </w:t>
+      </w:r>
+      <w:hyperlink w:anchor="_553a5bb8a650859a35268e72a6a3c6ec4ce77a8">
+        <w:r>
+          <w:rPr>
+            <w:rStyle w:val="Hyperlink"/>
+          </w:rPr>
+          <w:t xml:space="preserve">1</w:t>
+        </w:r>
+      </w:hyperlink>
+      <w:r>
+        <w:t xml:space="preserve"> </w:t>
+      </w:r>
+      <w:r>
+        <w:t xml:space="preserve">separates the pre-specified analyses from those added after the primary results were seen.</w:t>
+      </w:r>
+    </w:p>
+    <w:bookmarkStart w:id="16" w:name="_553a5bb8a650859a35268e72a6a3c6ec4ce77a8"/>
+    <w:p>
+      <w:pPr>
+        <w:pStyle w:val="CaptionedFigure"/>
+      </w:pPr>
+      <w:r>
+        <w:drawing>
+          <wp:inline>
+            <wp:extent cx="3840479" cy="3484511"/>
+            <wp:effectExtent b="0" l="0" r="0" t="0"/>
+            <wp:docPr descr="" title="" id="14" name="Picture"/>
+            <a:graphic>
+              <a:graphicData uri="http://schemas.openxmlformats.org/drawingml/2006/picture">
+                <pic:pic>
+                  <pic:nvPicPr>
+                    <pic:cNvPr descr="../figures/workflow.png" id="15" name="Picture"/>
+                    <pic:cNvPicPr>
+                      <a:picLocks noChangeArrowheads="1" noChangeAspect="1"/>
+                    </pic:cNvPicPr>
+                  </pic:nvPicPr>
+                  <pic:blipFill>
+                    <a:blip r:embed="rId13"/>
+                    <a:stretch>
+                      <a:fillRect/>
+                    </a:stretch>
+                  </pic:blipFill>
+                  <pic:spPr bwMode="auto">
+                    <a:xfrm>
+                      <a:off x="0" y="0"/>
+                      <a:ext cx="3840479" cy="3484511"/>
+                    </a:xfrm>
+                    <a:prstGeom prst="rect">
+                      <a:avLst/>
+                    </a:prstGeom>
+                    <a:noFill/>
+                    <a:ln w="9525">
+                      <a:noFill/>
+                      <a:headEnd/>
+                      <a:tailEnd/>
+                    </a:ln>
+                  </pic:spPr>
+                </pic:pic>
+              </a:graphicData>
+            </a:graphic>
+          </wp:inline>
+        </w:drawing>
       </w:r>
     </w:p>
     <w:p>
       <w:pPr>
+        <w:pStyle w:val="ImageCaption"/>
+      </w:pPr>
+      <w:r>
+        <w:t xml:space="preserve">Study workflow. Blue: pre-specified analyses (protocol committed before the first result). Orange: analyses added</w:t>
+      </w:r>
+      <w:r>
+        <w:t xml:space="preserve"> </w:t>
+      </w:r>
+      <w:r>
+        <w:t xml:space="preserve">after the primary results were seen (post hoc). The remaining signals are hypotheses, not evidence of causation.</w:t>
+      </w:r>
+    </w:p>
+    <w:bookmarkEnd w:id="16"/>
+    <w:p>
+      <w:pPr>
         <w:pStyle w:val="Heading2"/>
       </w:pPr>
-      <w:bookmarkStart w:id="13" w:name="_60ab88ea7c784c0820fe7a63c9fb74c6302d3a0"/>
+      <w:bookmarkStart w:id="17" w:name="_60ab88ea7c784c0820fe7a63c9fb74c6302d3a0"/>
       <w:r>
         <w:t xml:space="preserve">Data sources</w:t>
       </w:r>
-      <w:bookmarkEnd w:id="13"/>
+      <w:bookmarkEnd w:id="17"/>
     </w:p>
     <w:p>
       <w:pPr>
@@ -749,11 +814,11 @@
       <w:pPr>
         <w:pStyle w:val="Heading2"/>
       </w:pPr>
-      <w:bookmarkStart w:id="14" w:name="_c751b153c47986e3244e5a761476196ea4a5ffc"/>
+      <w:bookmarkStart w:id="18" w:name="_c751b153c47986e3244e5a761476196ea4a5ffc"/>
       <w:r>
         <w:t xml:space="preserve">Pre-processing and deduplication</w:t>
       </w:r>
-      <w:bookmarkEnd w:id="14"/>
+      <w:bookmarkEnd w:id="18"/>
     </w:p>
     <w:p>
       <w:pPr>
@@ -897,11 +962,11 @@
       <w:pPr>
         <w:pStyle w:val="Heading2"/>
       </w:pPr>
-      <w:bookmarkStart w:id="15" w:name="_41a40ce5571f028458004e399e8bf88c95f8185"/>
+      <w:bookmarkStart w:id="19" w:name="_41a40ce5571f028458004e399e8bf88c95f8185"/>
       <w:r>
         <w:t xml:space="preserve">Outcomes, exposure and comparator</w:t>
       </w:r>
-      <w:bookmarkEnd w:id="15"/>
+      <w:bookmarkEnd w:id="19"/>
     </w:p>
     <w:p>
       <w:pPr>
@@ -951,11 +1016,11 @@
       <w:pPr>
         <w:pStyle w:val="Heading2"/>
       </w:pPr>
-      <w:bookmarkStart w:id="16" w:name="_disproportionality"/>
+      <w:bookmarkStart w:id="20" w:name="_disproportionality"/>
       <w:r>
         <w:t xml:space="preserve">Disproportionality</w:t>
       </w:r>
-      <w:bookmarkEnd w:id="16"/>
+      <w:bookmarkEnd w:id="20"/>
     </w:p>
     <w:p>
       <w:pPr>
@@ -1222,11 +1287,11 @@
       <w:pPr>
         <w:pStyle w:val="Heading2"/>
       </w:pPr>
-      <w:bookmarkStart w:id="17" w:name="_142cd368ea85e8fddc952a4320432a4163793ac"/>
+      <w:bookmarkStart w:id="21" w:name="_142cd368ea85e8fddc952a4320432a4163793ac"/>
       <w:r>
         <w:t xml:space="preserve">Reference set</w:t>
       </w:r>
-      <w:bookmarkEnd w:id="17"/>
+      <w:bookmarkEnd w:id="21"/>
     </w:p>
     <w:p>
       <w:pPr>
@@ -1349,11 +1414,11 @@
       <w:pPr>
         <w:pStyle w:val="Heading2"/>
       </w:pPr>
-      <w:bookmarkStart w:id="18" w:name="_replication"/>
+      <w:bookmarkStart w:id="22" w:name="_replication"/>
       <w:r>
         <w:t xml:space="preserve">Replication</w:t>
       </w:r>
-      <w:bookmarkEnd w:id="18"/>
+      <w:bookmarkEnd w:id="22"/>
     </w:p>
     <w:p>
       <w:pPr>
@@ -1808,11 +1873,11 @@
       <w:pPr>
         <w:pStyle w:val="Heading2"/>
       </w:pPr>
-      <w:bookmarkStart w:id="19" w:name="_e4620e00135245931b16a0788d572999fd386c0"/>
+      <w:bookmarkStart w:id="23" w:name="_e4620e00135245931b16a0788d572999fd386c0"/>
       <w:r>
         <w:t xml:space="preserve">Post-hoc and sensitivity analyses</w:t>
       </w:r>
-      <w:bookmarkEnd w:id="19"/>
+      <w:bookmarkEnd w:id="23"/>
     </w:p>
     <w:p>
       <w:pPr>
@@ -1893,11 +1958,11 @@
       <w:pPr>
         <w:pStyle w:val="Heading2"/>
       </w:pPr>
-      <w:bookmarkStart w:id="20" w:name="_4fbb619f4cb7014e603bc4722c15e1d3db783b4"/>
+      <w:bookmarkStart w:id="24" w:name="_4fbb619f4cb7014e603bc4722c15e1d3db783b4"/>
       <w:r>
         <w:t xml:space="preserve">Robust signals and case-level review</w:t>
       </w:r>
-      <w:bookmarkEnd w:id="20"/>
+      <w:bookmarkEnd w:id="24"/>
     </w:p>
     <w:p>
       <w:pPr>
@@ -2094,13 +2159,19 @@
         <w:t xml:space="preserve"> </w:t>
       </w:r>
       <w:r>
-        <w:t xml:space="preserve">rubric distinguishes C from D only on documented evidence; a high consumer share alone does not make a signal C. For</w:t>
-      </w:r>
-      <w:r>
-        <w:t xml:space="preserve"> </w:t>
-      </w:r>
-      <w:r>
-        <w:t xml:space="preserve">category D we additionally required that the signal not persist against other drugs used for the same indication: within</w:t>
+        <w:t xml:space="preserve">rubric distinguishes C from D only on documented evidence; a high consumer share alone does not make a signal C. Because</w:t>
+      </w:r>
+      <w:r>
+        <w:t xml:space="preserve"> </w:t>
+      </w:r>
+      <w:r>
+        <w:t xml:space="preserve">confounding by indication remained plausible after the indication exclusions (reported indications are often missing or</w:t>
+      </w:r>
+      <w:r>
+        <w:t xml:space="preserve"> </w:t>
+      </w:r>
+      <w:r>
+        <w:t xml:space="preserve">non-specific), for category D we additionally required that the signal not persist against other drugs used for the same indication: within</w:t>
       </w:r>
       <w:r>
         <w:t xml:space="preserve"> </w:t>
@@ -2142,57 +2213,63 @@
       <w:pPr>
         <w:pStyle w:val="Heading2"/>
       </w:pPr>
-      <w:bookmarkStart w:id="21" w:name="_60422f0ac97f34e860c6d6c8d42a63ef1fce636"/>
+      <w:bookmarkStart w:id="25" w:name="_60422f0ac97f34e860c6d6c8d42a63ef1fce636"/>
       <w:r>
         <w:t xml:space="preserve">Software and use of AI tools</w:t>
       </w:r>
-      <w:bookmarkEnd w:id="21"/>
+      <w:bookmarkEnd w:id="25"/>
     </w:p>
     <w:p>
       <w:pPr>
         <w:pStyle w:val="FirstParagraph"/>
       </w:pPr>
       <w:r>
-        <w:t xml:space="preserve">Analyses used Python 3.10 (numpy 2.2.6, pandas 2.3.3, scipy 1.15.3, statsmodels 0.15.0, matplotlib 3.10.9). Data processing</w:t>
-      </w:r>
-      <w:r>
-        <w:t xml:space="preserve"> </w:t>
-      </w:r>
-      <w:r>
-        <w:t xml:space="preserve">code, analyses and the first draft of this manuscript were produced with an AI assistant (Claude, Anthropic) working under</w:t>
-      </w:r>
-      <w:r>
-        <w:t xml:space="preserve"> </w:t>
-      </w:r>
-      <w:r>
-        <w:t xml:space="preserve">the author’s direction; three AI reviewers (methods, clinical, editorial) critiqued the draft, and their findings were</w:t>
-      </w:r>
-      <w:r>
-        <w:t xml:space="preserve"> </w:t>
-      </w:r>
-      <w:r>
-        <w:t xml:space="preserve">addressed as described in the protocol file. The author reviewed the code, results and text and is responsible for them.</w:t>
+        <w:t xml:space="preserve">Analyses used Python 3.10 (numpy 2.2.6, pandas 2.3.3, scipy 1.15.3, statsmodels 0.15.0, matplotlib 3.10.9). An AI</w:t>
+      </w:r>
+      <w:r>
+        <w:t xml:space="preserve"> </w:t>
+      </w:r>
+      <w:r>
+        <w:t xml:space="preserve">assistant (Claude, Anthropic) wrote the code and the first draft of the manuscript under the author’s direction, and AI</w:t>
+      </w:r>
+      <w:r>
+        <w:t xml:space="preserve"> </w:t>
+      </w:r>
+      <w:r>
+        <w:t xml:space="preserve">reviewers critiqued the methods, clinical interpretation and text; changes made in response are recorded in the protocol</w:t>
+      </w:r>
+      <w:r>
+        <w:t xml:space="preserve"> </w:t>
+      </w:r>
+      <w:r>
+        <w:t xml:space="preserve">file. The second assessor of the case-level review was also AI-based. The author reviewed the code, results and text and is</w:t>
+      </w:r>
+      <w:r>
+        <w:t xml:space="preserve"> </w:t>
+      </w:r>
+      <w:r>
+        <w:t xml:space="preserve">responsible for them.</w:t>
       </w:r>
     </w:p>
     <w:p>
       <w:pPr>
         <w:pStyle w:val="Heading1"/>
       </w:pPr>
-      <w:bookmarkStart w:id="22" w:name="_results"/>
+      <w:bookmarkStart w:id="26" w:name="_results"/>
       <w:r>
         <w:t xml:space="preserve">Results</w:t>
       </w:r>
-      <w:bookmarkEnd w:id="22"/>
+      <w:bookmarkEnd w:id="26"/>
     </w:p>
     <w:p>
       <w:pPr>
         <w:pStyle w:val="Heading2"/>
       </w:pPr>
-      <w:bookmarkStart w:id="23" w:name="_data"/>
+      <w:bookmarkStart w:id="27" w:name="_data"/>
       <w:r>
         <w:t xml:space="preserve">Data</w:t>
       </w:r>
-      <w:bookmarkEnd w:id="23"/>
+      <w:bookmarkEnd w:id="27"/>
     </w:p>
     <w:p>
       <w:pPr>
@@ -2538,11 +2615,11 @@
       <w:pPr>
         <w:pStyle w:val="Heading2"/>
       </w:pPr>
-      <w:bookmarkStart w:id="24" w:name="_107f3c85ced1315e9f212c36f210ded9bb333bb"/>
+      <w:bookmarkStart w:id="28" w:name="_107f3c85ced1315e9f212c36f210ded9bb333bb"/>
       <w:r>
         <w:t xml:space="preserve">Adjustment changes the signal list but not its agreement with labels</w:t>
       </w:r>
-      <w:bookmarkEnd w:id="24"/>
+      <w:bookmarkEnd w:id="28"/>
     </w:p>
     <w:p>
       <w:pPr>
@@ -2598,7 +2675,25 @@
         <w:t xml:space="preserve">,</w:t>
       </w:r>
       <w:r>
-        <w:t xml:space="preserve">000 suspect reports), discrimination was moderate and practically identical: crude IC</w:t>
+        <w:t xml:space="preserve">000 suspect reports), discrimination was moderate and practically identical. For the</w:t>
+      </w:r>
+      <w:r>
+        <w:t xml:space="preserve"> </w:t>
+      </w:r>
+      <w:r>
+        <w:t xml:space="preserve">like-for-like pair, crude versus adjusted lower bound, the AUC was 0.718 vs</w:t>
+      </w:r>
+      <w:r>
+        <w:t xml:space="preserve"> </w:t>
+      </w:r>
+      <w:r>
+        <w:t xml:space="preserve">0.723 (difference 0.005, 95% CI -0.023 to</w:t>
+      </w:r>
+      <w:r>
+        <w:t xml:space="preserve"> </w:t>
+      </w:r>
+      <w:r>
+        <w:t xml:space="preserve">0.030); for the pre-specified pair, crude IC</w:t>
       </w:r>
       <m:oMath>
         <m:sSub>
@@ -2618,25 +2713,19 @@
         <w:t xml:space="preserve"> </w:t>
       </w:r>
       <w:r>
-        <w:t xml:space="preserve">versus adjusted lower bound, as pre-specified, AUC 0.720 vs 0.723;</w:t>
-      </w:r>
-      <w:r>
-        <w:t xml:space="preserve"> </w:t>
-      </w:r>
-      <w:r>
-        <w:t xml:space="preserve">crude versus adjusted lower bound, the like-for-like pair, 0.718 vs</w:t>
-      </w:r>
-      <w:r>
-        <w:t xml:space="preserve"> </w:t>
-      </w:r>
-      <w:r>
-        <w:t xml:space="preserve">0.723 (difference 0.005, 95% CI -0.023 to</w:t>
-      </w:r>
-      <w:r>
-        <w:t xml:space="preserve"> </w:t>
-      </w:r>
-      <w:r>
-        <w:t xml:space="preserve">0.030). The same held for point estimates (0.700 vs</w:t>
+        <w:t xml:space="preserve">versus adjusted lower bound, it was</w:t>
+      </w:r>
+      <w:r>
+        <w:t xml:space="preserve"> </w:t>
+      </w:r>
+      <w:r>
+        <w:t xml:space="preserve">0.720 vs 0.723. Adjustment thus changed which drugs were flagged</w:t>
+      </w:r>
+      <w:r>
+        <w:t xml:space="preserve"> </w:t>
+      </w:r>
+      <w:r>
+        <w:t xml:space="preserve">but brought almost no improvement in agreement with labels. The same held for point estimates (0.700 vs</w:t>
       </w:r>
       <w:r>
         <w:t xml:space="preserve"> </w:t>
@@ -2679,11 +2768,11 @@
       <w:pPr>
         <w:pStyle w:val="Heading2"/>
       </w:pPr>
-      <w:bookmarkStart w:id="25" w:name="_2ba7c5a9bf848498b9a7ba8a5df5dde68d81479"/>
+      <w:bookmarkStart w:id="29" w:name="_2ba7c5a9bf848498b9a7ba8a5df5dde68d81479"/>
       <w:r>
         <w:t xml:space="preserve">Replication in Canada Vigilance</w:t>
       </w:r>
-      <w:bookmarkEnd w:id="25"/>
+      <w:bookmarkEnd w:id="29"/>
     </w:p>
     <w:p>
       <w:pPr>
@@ -2696,25 +2785,7 @@
         <w:t xml:space="preserve"> </w:t>
       </w:r>
       <w:r>
-        <w:t xml:space="preserve">of testable cases, unlabelled adjusted signals in 31/76 (41%), label-negative adjusted signals in</w:t>
-      </w:r>
-      <w:r>
-        <w:t xml:space="preserve"> </w:t>
-      </w:r>
-      <w:r>
-        <w:t xml:space="preserve">21/54 (39%), crude-only signals in 9/21 (43%), and label-negative ingredients that</w:t>
-      </w:r>
-      <w:r>
-        <w:t xml:space="preserve"> </w:t>
-      </w:r>
-      <w:r>
-        <w:t xml:space="preserve">were neither crude nor adjusted signals in 43/214 (20%) (all label-negative ingredients, as literally specified in</w:t>
-      </w:r>
-      <w:r>
-        <w:t xml:space="preserve"> </w:t>
-      </w:r>
-      <w:r>
-        <w:t xml:space="preserve">the protocol: 68/281 (24%); Table </w:t>
+        <w:t xml:space="preserve">of testable cases and unlabelled adjusted signals in 31/76 (41%) (Table </w:t>
       </w:r>
       <w:hyperlink w:anchor="_01d9fd756df68368595dee6b7688533f3c9fbbd">
         <w:r>
@@ -2725,19 +2796,37 @@
         </w:r>
       </w:hyperlink>
       <w:r>
-        <w:t xml:space="preserve">). In this pre-specified</w:t>
-      </w:r>
-      <w:r>
-        <w:t xml:space="preserve"> </w:t>
-      </w:r>
-      <w:r>
-        <w:t xml:space="preserve">comparison unlabelled signals replicated more often than the background (odds ratio</w:t>
-      </w:r>
-      <w:r>
-        <w:t xml:space="preserve"> </w:t>
-      </w:r>
-      <w:r>
-        <w:t xml:space="preserve">2.74, Fisher</w:t>
+        <w:t xml:space="preserve">).</w:t>
+      </w:r>
+      <w:r>
+        <w:t xml:space="preserve"> </w:t>
+      </w:r>
+      <w:r>
+        <w:t xml:space="preserve">Label-negative adjusted signals replicated in 21/54 (39%) and crude-only signals in</w:t>
+      </w:r>
+      <w:r>
+        <w:t xml:space="preserve"> </w:t>
+      </w:r>
+      <w:r>
+        <w:t xml:space="preserve">9/21 (43%). The background—label-negative ingredients that were neither crude nor adjusted signals—replicated</w:t>
+      </w:r>
+      <w:r>
+        <w:t xml:space="preserve"> </w:t>
+      </w:r>
+      <w:r>
+        <w:t xml:space="preserve">in 43/214 (20%) (all label-negative ingredients, as literally specified in the protocol:</w:t>
+      </w:r>
+      <w:r>
+        <w:t xml:space="preserve"> </w:t>
+      </w:r>
+      <w:r>
+        <w:t xml:space="preserve">68/281 (24%)). In this pre-specified comparison unlabelled signals replicated more</w:t>
+      </w:r>
+      <w:r>
+        <w:t xml:space="preserve"> </w:t>
+      </w:r>
+      <w:r>
+        <w:t xml:space="preserve">often than the background (odds ratio 2.74, Fisher</w:t>
       </w:r>
       <w:r>
         <w:t xml:space="preserve"> </w:t>
@@ -2757,24 +2846,32 @@
         </m:r>
       </m:oMath>
       <w:r>
-        <w:t xml:space="preserve">) but less often than labelled signals. The</w:t>
-      </w:r>
-      <w:r>
-        <w:t xml:space="preserve"> </w:t>
-      </w:r>
-      <w:r>
-        <w:t xml:space="preserve">power-calibrated comparison (post hoc) placed this contrast on a common scale (Figure </w:t>
+        <w:t xml:space="preserve">) but less</w:t>
+      </w:r>
+      <w:r>
+        <w:t xml:space="preserve"> </w:t>
+      </w:r>
+      <w:r>
+        <w:t xml:space="preserve">often than labelled signals.</w:t>
+      </w:r>
+    </w:p>
+    <w:p>
+      <w:pPr>
+        <w:pStyle w:val="BodyText"/>
+      </w:pPr>
+      <w:r>
+        <w:t xml:space="preserve">The power-calibrated comparison (post hoc) placed this contrast on a common scale (Figure </w:t>
       </w:r>
       <w:hyperlink w:anchor="_576b9bd78d0890981a1f156b59228419fd8f27c">
         <w:r>
           <w:rPr>
             <w:rStyle w:val="Hyperlink"/>
           </w:rPr>
-          <w:t xml:space="preserve">1</w:t>
+          <w:t xml:space="preserve">2</w:t>
         </w:r>
       </w:hyperlink>
       <w:r>
-        <w:t xml:space="preserve">): labelled signals</w:t>
+        <w:t xml:space="preserve">). Labelled signals</w:t>
       </w:r>
       <w:r>
         <w:t xml:space="preserve"> </w:t>
@@ -2786,13 +2883,13 @@
         <w:t xml:space="preserve"> </w:t>
       </w:r>
       <w:r>
-        <w:t xml:space="preserve">(31 observed vs 30.5 expected; O/E 1.02, 95% CI 0.77–1.32), whereas unlabelled signals (n=201) replicated less than half</w:t>
-      </w:r>
-      <w:r>
-        <w:t xml:space="preserve"> </w:t>
-      </w:r>
-      <w:r>
-        <w:t xml:space="preserve">as often (25 observed vs 56.8 expected; O/E 0.44, 95% CI 0.29–0.62); the ratio of the two was 0.43</w:t>
+        <w:t xml:space="preserve">(31 observed vs 30.5 expected; O/E 1.02, 95% CI 0.77–1.32). Unlabelled signals (n=201) replicated less than half as often</w:t>
+      </w:r>
+      <w:r>
+        <w:t xml:space="preserve"> </w:t>
+      </w:r>
+      <w:r>
+        <w:t xml:space="preserve">(25 observed vs 56.8 expected; O/E 0.44, 95% CI 0.29–0.62); the ratio of the two was 0.43</w:t>
       </w:r>
       <w:r>
         <w:t xml:space="preserve"> </w:t>
@@ -3043,24 +3140,24 @@
       <w:pPr>
         <w:pStyle w:val="Heading2"/>
       </w:pPr>
-      <w:bookmarkStart w:id="26" w:name="_be549a4ec8708f84b63e1dc0d4821bd33780b5c"/>
+      <w:bookmarkStart w:id="30" w:name="_be549a4ec8708f84b63e1dc0d4821bd33780b5c"/>
       <w:r>
         <w:t xml:space="preserve">Post-hoc analyses</w:t>
       </w:r>
-      <w:bookmarkEnd w:id="26"/>
+      <w:bookmarkEnd w:id="30"/>
     </w:p>
     <w:p>
       <w:pPr>
         <w:pStyle w:val="FirstParagraph"/>
       </w:pPr>
       <w:r>
-        <w:t xml:space="preserve">With the extended indication filter, Canada Vigilance restricted to unsolicited reports and both estimates adjusted</w:t>
-      </w:r>
-      <w:r>
-        <w:t xml:space="preserve"> </w:t>
-      </w:r>
-      <w:r>
-        <w:t xml:space="preserve">(Table </w:t>
+        <w:t xml:space="preserve">The post-hoc framework combined the extended indication filter, Canada Vigilance restricted to unsolicited reports and</w:t>
+      </w:r>
+      <w:r>
+        <w:t xml:space="preserve"> </w:t>
+      </w:r>
+      <w:r>
+        <w:t xml:space="preserve">adjusted estimates in both databases (Table </w:t>
       </w:r>
       <w:hyperlink w:anchor="_fb475224272a447d57b77f14dfc8774bb10ba7c">
         <w:r>
@@ -3071,13 +3168,19 @@
         </w:r>
       </w:hyperlink>
       <w:r>
-        <w:t xml:space="preserve">), labelled hearing-loss signals replicated in 26/44 (59%), unlabelled signals in</w:t>
-      </w:r>
-      <w:r>
-        <w:t xml:space="preserve"> </w:t>
-      </w:r>
-      <w:r>
-        <w:t xml:space="preserve">10/51 (20%) and the background in 19/158 (12%) (Fisher</w:t>
+        <w:t xml:space="preserve">). In it, labelled hearing-loss signals replicated in</w:t>
+      </w:r>
+      <w:r>
+        <w:t xml:space="preserve"> </w:t>
+      </w:r>
+      <w:r>
+        <w:t xml:space="preserve">26/44 (59%), unlabelled signals in 10/51 (20%) and the background in 19/158 (12%)</w:t>
+      </w:r>
+      <w:r>
+        <w:t xml:space="preserve"> </w:t>
+      </w:r>
+      <w:r>
+        <w:t xml:space="preserve">(Fisher</w:t>
       </w:r>
       <w:r>
         <w:t xml:space="preserve"> </w:t>
@@ -3097,13 +3200,7 @@
         </m:r>
       </m:oMath>
       <w:r>
-        <w:t xml:space="preserve">);</w:t>
-      </w:r>
-      <w:r>
-        <w:t xml:space="preserve"> </w:t>
-      </w:r>
-      <w:r>
-        <w:t xml:space="preserve">calibrated on adjusted Canadian counts, O/E was 1.10 (95% CI</w:t>
+        <w:t xml:space="preserve">). Calibrated on adjusted Canadian counts, O/E was 1.10 (95% CI</w:t>
       </w:r>
       <w:r>
         <w:t xml:space="preserve"> </w:t>
@@ -3264,11 +3361,11 @@
       <w:pPr>
         <w:pStyle w:val="Heading2"/>
       </w:pPr>
-      <w:bookmarkStart w:id="27" w:name="_42e042e6440987e2814ddf706c2a7b829123a6f"/>
+      <w:bookmarkStart w:id="31" w:name="_42e042e6440987e2814ddf706c2a7b829123a6f"/>
       <w:r>
         <w:t xml:space="preserve">Signals from previous screens</w:t>
       </w:r>
-      <w:bookmarkEnd w:id="27"/>
+      <w:bookmarkEnd w:id="31"/>
     </w:p>
     <w:p>
       <w:pPr>
@@ -3356,11 +3453,11 @@
       <w:pPr>
         <w:pStyle w:val="Heading2"/>
       </w:pPr>
-      <w:bookmarkStart w:id="28" w:name="_79ce093ef77156c196cf1ee4b9b58429eba3dcd"/>
+      <w:bookmarkStart w:id="32" w:name="_79ce093ef77156c196cf1ee4b9b58429eba3dcd"/>
       <w:r>
         <w:t xml:space="preserve">Case-level review</w:t>
       </w:r>
-      <w:bookmarkEnd w:id="28"/>
+      <w:bookmarkEnd w:id="32"/>
     </w:p>
     <w:p>
       <w:pPr>
@@ -3391,7 +3488,7 @@
           <w:rPr>
             <w:rStyle w:val="Hyperlink"/>
           </w:rPr>
-          <w:t xml:space="preserve">2</w:t>
+          <w:t xml:space="preserve">3</w:t>
         </w:r>
       </w:hyperlink>
       <w:r>
@@ -3531,7 +3628,7 @@
         <w:t xml:space="preserve">were unexplained; the residual count therefore ranges from 2 to 9 depending on post-hoc choices and assessor.</w:t>
       </w:r>
     </w:p>
-    <w:bookmarkStart w:id="29" w:name="_01d9fd756df68368595dee6b7688533f3c9fbbd"/>
+    <w:bookmarkStart w:id="33" w:name="_01d9fd756df68368595dee6b7688533f3c9fbbd"/>
     <w:p>
       <w:pPr>
         <w:pStyle w:val="TableCaption"/>
@@ -4542,7 +4639,7 @@
         </w:tc>
       </w:tr>
     </w:tbl>
-    <w:bookmarkEnd w:id="29"/>
+    <w:bookmarkEnd w:id="33"/>
     <w:p>
       <w:pPr>
         <w:pStyle w:val="FirstParagraph"/>
@@ -4591,7 +4688,7 @@
         <w:t xml:space="preserve">Power-calibrated (post hoc): observed replications vs those expected if each FAERS adjusted estimate were true.</w:t>
       </w:r>
     </w:p>
-    <w:bookmarkStart w:id="30" w:name="_fb475224272a447d57b77f14dfc8774bb10ba7c"/>
+    <w:bookmarkStart w:id="34" w:name="_fb475224272a447d57b77f14dfc8774bb10ba7c"/>
     <w:p>
       <w:pPr>
         <w:pStyle w:val="TableCaption"/>
@@ -5969,9 +6066,9 @@
         </w:tc>
       </w:tr>
     </w:tbl>
-    <w:bookmarkEnd w:id="30"/>
+    <w:bookmarkEnd w:id="34"/>
     <w:p/>
-    <w:bookmarkStart w:id="31" w:name="_5dcdb19b87d05ca6b5d15ccad55830f58746f11"/>
+    <w:bookmarkStart w:id="35" w:name="_5dcdb19b87d05ca6b5d15ccad55830f58746f11"/>
     <w:p>
       <w:pPr>
         <w:pStyle w:val="TableCaption"/>
@@ -6497,9 +6594,9 @@
         </w:tc>
       </w:tr>
     </w:tbl>
-    <w:bookmarkEnd w:id="31"/>
+    <w:bookmarkEnd w:id="35"/>
     <w:p/>
-    <w:bookmarkStart w:id="32" w:name="_a3680f2908c270ccb110f4515419033f2692535"/>
+    <w:bookmarkStart w:id="36" w:name="_a3680f2908c270ccb110f4515419033f2692535"/>
     <w:p>
       <w:pPr>
         <w:pStyle w:val="TableCaption"/>
@@ -8851,8 +8948,8 @@
         </w:tc>
       </w:tr>
     </w:tbl>
-    <w:bookmarkEnd w:id="32"/>
-    <w:bookmarkStart w:id="36" w:name="_576b9bd78d0890981a1f156b59228419fd8f27c"/>
+    <w:bookmarkEnd w:id="36"/>
+    <w:bookmarkStart w:id="40" w:name="_576b9bd78d0890981a1f156b59228419fd8f27c"/>
     <w:p>
       <w:pPr>
         <w:pStyle w:val="CaptionedFigure"/>
@@ -8862,18 +8959,18 @@
           <wp:inline>
             <wp:extent cx="5334000" cy="2080260"/>
             <wp:effectExtent b="0" l="0" r="0" t="0"/>
-            <wp:docPr descr="" title="" id="34" name="Picture"/>
+            <wp:docPr descr="" title="" id="38" name="Picture"/>
             <a:graphic>
               <a:graphicData uri="http://schemas.openxmlformats.org/drawingml/2006/picture">
                 <pic:pic>
                   <pic:nvPicPr>
-                    <pic:cNvPr descr="../figures/replication.png" id="35" name="Picture"/>
+                    <pic:cNvPr descr="../figures/replication.png" id="39" name="Picture"/>
                     <pic:cNvPicPr>
                       <a:picLocks noChangeArrowheads="1" noChangeAspect="1"/>
                     </pic:cNvPicPr>
                   </pic:nvPicPr>
                   <pic:blipFill>
-                    <a:blip r:embed="rId33"/>
+                    <a:blip r:embed="rId37"/>
                     <a:stretch>
                       <a:fillRect/>
                     </a:stretch>
@@ -8926,8 +9023,8 @@
         <w:t xml:space="preserve">A ratio near 1 means signals replicate as their FAERS strength predicts.</w:t>
       </w:r>
     </w:p>
-    <w:bookmarkEnd w:id="36"/>
-    <w:bookmarkStart w:id="40" w:name="_8438971255fac547e59d2aeeb15af050352f533"/>
+    <w:bookmarkEnd w:id="40"/>
+    <w:bookmarkStart w:id="44" w:name="_8438971255fac547e59d2aeeb15af050352f533"/>
     <w:p>
       <w:pPr>
         <w:pStyle w:val="CaptionedFigure"/>
@@ -8937,18 +9034,18 @@
           <wp:inline>
             <wp:extent cx="4533900" cy="4655678"/>
             <wp:effectExtent b="0" l="0" r="0" t="0"/>
-            <wp:docPr descr="" title="" id="38" name="Picture"/>
+            <wp:docPr descr="" title="" id="42" name="Picture"/>
             <a:graphic>
               <a:graphicData uri="http://schemas.openxmlformats.org/drawingml/2006/picture">
                 <pic:pic>
                   <pic:nvPicPr>
-                    <pic:cNvPr descr="../figures/candidates.png" id="39" name="Picture"/>
+                    <pic:cNvPr descr="../figures/candidates.png" id="43" name="Picture"/>
                     <pic:cNvPicPr>
                       <a:picLocks noChangeArrowheads="1" noChangeAspect="1"/>
                     </pic:cNvPicPr>
                   </pic:nvPicPr>
                   <pic:blipFill>
-                    <a:blip r:embed="rId37"/>
+                    <a:blip r:embed="rId41"/>
                     <a:stretch>
                       <a:fillRect/>
                     </a:stretch>
@@ -8989,16 +9086,16 @@
         <w:t xml:space="preserve">(A report cluster; C stimulated reporting; D indication; K established class; E none, bold).</w:t>
       </w:r>
     </w:p>
-    <w:bookmarkEnd w:id="40"/>
+    <w:bookmarkEnd w:id="44"/>
     <w:p>
       <w:pPr>
         <w:pStyle w:val="Heading1"/>
       </w:pPr>
-      <w:bookmarkStart w:id="41" w:name="_discussion"/>
+      <w:bookmarkStart w:id="45" w:name="_discussion"/>
       <w:r>
         <w:t xml:space="preserve">Discussion</w:t>
       </w:r>
-      <w:bookmarkEnd w:id="41"/>
+      <w:bookmarkEnd w:id="45"/>
     </w:p>
     <w:p>
       <w:pPr>
@@ -9060,6 +9157,18 @@
       </w:r>
       <w:r>
         <w:t xml:space="preserve">for drugs with no known association, and co-medication bias can replicate when crude estimates are compared.</w:t>
+      </w:r>
+      <w:r>
+        <w:t xml:space="preserve"> </w:t>
+      </w:r>
+      <w:r>
+        <w:t xml:space="preserve">For regulators and signal-management teams, the practical consequence is that replication in a second database does not</w:t>
+      </w:r>
+      <w:r>
+        <w:t xml:space="preserve"> </w:t>
+      </w:r>
+      <w:r>
+        <w:t xml:space="preserve">strengthen a signal unless reporting artefacts are explicitly addressed.</w:t>
       </w:r>
       <w:r>
         <w:t xml:space="preserve"> </w:t>
@@ -9412,11 +9521,11 @@
       <w:pPr>
         <w:pStyle w:val="Heading4"/>
       </w:pPr>
-      <w:bookmarkStart w:id="42" w:name="_72424125f1c747d5dc92a896a97d43a10aedd6b"/>
+      <w:bookmarkStart w:id="46" w:name="_72424125f1c747d5dc92a896a97d43a10aedd6b"/>
       <w:r>
         <w:t xml:space="preserve">Limitations.</w:t>
       </w:r>
-      <w:bookmarkEnd w:id="42"/>
+      <w:bookmarkEnd w:id="46"/>
     </w:p>
     <w:p>
       <w:pPr>
@@ -9579,11 +9688,11 @@
       <w:pPr>
         <w:pStyle w:val="Heading4"/>
       </w:pPr>
-      <w:bookmarkStart w:id="43" w:name="_2fee5c028dc7c352c541238a75e372b3a85d4c6"/>
+      <w:bookmarkStart w:id="47" w:name="_2fee5c028dc7c352c541238a75e372b3a85d4c6"/>
       <w:r>
         <w:t xml:space="preserve">Conclusions.</w:t>
       </w:r>
-      <w:bookmarkEnd w:id="43"/>
+      <w:bookmarkEnd w:id="47"/>
     </w:p>
     <w:p>
       <w:pPr>
@@ -9608,24 +9717,24 @@
         <w:t xml:space="preserve"> </w:t>
       </w:r>
       <w:r>
-        <w:t xml:space="preserve">adjusted and solicited reports and report clusters are handled explicitly. The few remaining candidates, led by pregabalin,</w:t>
-      </w:r>
-      <w:r>
-        <w:t xml:space="preserve"> </w:t>
-      </w:r>
-      <w:r>
-        <w:t xml:space="preserve">merit study with exposure-based designs.</w:t>
+        <w:t xml:space="preserve">adjusted and solicited reports and report clusters are handled explicitly. The few remaining candidates, with pregabalin the</w:t>
+      </w:r>
+      <w:r>
+        <w:t xml:space="preserve"> </w:t>
+      </w:r>
+      <w:r>
+        <w:t xml:space="preserve">strongest, are hypotheses that merit study with exposure-based designs, not established adverse effects.</w:t>
       </w:r>
     </w:p>
     <w:p>
       <w:pPr>
         <w:pStyle w:val="Heading1"/>
       </w:pPr>
-      <w:bookmarkStart w:id="44" w:name="_ad61382512a69fb2431cb9ccd9664860b940cd1"/>
+      <w:bookmarkStart w:id="48" w:name="_ad61382512a69fb2431cb9ccd9664860b940cd1"/>
       <w:r>
         <w:t xml:space="preserve">Statements and declarations</w:t>
       </w:r>
-      <w:bookmarkEnd w:id="44"/>
+      <w:bookmarkEnd w:id="48"/>
     </w:p>
     <w:p>
       <w:pPr>
@@ -9742,7 +9851,7 @@
       <w:r>
         <w:t xml:space="preserve"> </w:t>
       </w:r>
-      <w:hyperlink r:id="rId45">
+      <w:hyperlink r:id="rId49">
         <w:r>
           <w:rPr>
             <w:rStyle w:val="Hyperlink"/>
@@ -9776,8 +9885,8 @@
         <w:t xml:space="preserve">the manuscript.</w:t>
       </w:r>
     </w:p>
-    <w:bookmarkStart w:id="106" w:name="_refs"/>
-    <w:bookmarkStart w:id="47" w:name="_84053f0725d171dd2bc6aa3b5185bf9f8bf2c68"/>
+    <w:bookmarkStart w:id="110" w:name="_refs"/>
+    <w:bookmarkStart w:id="51" w:name="_84053f0725d171dd2bc6aa3b5185bf9f8bf2c68"/>
     <w:p>
       <w:pPr>
         <w:pStyle w:val="Bibliography"/>
@@ -9788,7 +9897,7 @@
       <w:r>
         <w:t xml:space="preserve"> </w:t>
       </w:r>
-      <w:hyperlink r:id="rId46">
+      <w:hyperlink r:id="rId50">
         <w:r>
           <w:rPr>
             <w:rStyle w:val="Hyperlink"/>
@@ -9797,8 +9906,8 @@
         </w:r>
       </w:hyperlink>
     </w:p>
-    <w:bookmarkEnd w:id="47"/>
-    <w:bookmarkStart w:id="49" w:name="_f2412834f251eb0b10932731b4312628329fafd"/>
+    <w:bookmarkEnd w:id="51"/>
+    <w:bookmarkStart w:id="53" w:name="_f2412834f251eb0b10932731b4312628329fafd"/>
     <w:p>
       <w:pPr>
         <w:pStyle w:val="Bibliography"/>
@@ -9821,7 +9930,7 @@
       <w:r>
         <w:t xml:space="preserve"> </w:t>
       </w:r>
-      <w:hyperlink r:id="rId48">
+      <w:hyperlink r:id="rId52">
         <w:r>
           <w:rPr>
             <w:rStyle w:val="Hyperlink"/>
@@ -9830,8 +9939,8 @@
         </w:r>
       </w:hyperlink>
     </w:p>
-    <w:bookmarkEnd w:id="49"/>
-    <w:bookmarkStart w:id="51" w:name="_3eb866cd3c340b8a7cc3047c7dc913646a996ac"/>
+    <w:bookmarkEnd w:id="53"/>
+    <w:bookmarkStart w:id="55" w:name="_3eb866cd3c340b8a7cc3047c7dc913646a996ac"/>
     <w:p>
       <w:pPr>
         <w:pStyle w:val="Bibliography"/>
@@ -9854,7 +9963,7 @@
       <w:r>
         <w:t xml:space="preserve"> </w:t>
       </w:r>
-      <w:hyperlink r:id="rId50">
+      <w:hyperlink r:id="rId54">
         <w:r>
           <w:rPr>
             <w:rStyle w:val="Hyperlink"/>
@@ -9863,8 +9972,8 @@
         </w:r>
       </w:hyperlink>
     </w:p>
-    <w:bookmarkEnd w:id="51"/>
-    <w:bookmarkStart w:id="53" w:name="_e2e05a58396f1267f3a8bb361b05839586b2d9d"/>
+    <w:bookmarkEnd w:id="55"/>
+    <w:bookmarkStart w:id="57" w:name="_e2e05a58396f1267f3a8bb361b05839586b2d9d"/>
     <w:p>
       <w:pPr>
         <w:pStyle w:val="Bibliography"/>
@@ -9887,7 +9996,7 @@
       <w:r>
         <w:t xml:space="preserve"> </w:t>
       </w:r>
-      <w:hyperlink r:id="rId52">
+      <w:hyperlink r:id="rId56">
         <w:r>
           <w:rPr>
             <w:rStyle w:val="Hyperlink"/>
@@ -9896,8 +10005,8 @@
         </w:r>
       </w:hyperlink>
     </w:p>
-    <w:bookmarkEnd w:id="53"/>
-    <w:bookmarkStart w:id="55" w:name="_88f7dc7fc14cc2a7b84eb40d084bccb766b7bc4"/>
+    <w:bookmarkEnd w:id="57"/>
+    <w:bookmarkStart w:id="59" w:name="_88f7dc7fc14cc2a7b84eb40d084bccb766b7bc4"/>
     <w:p>
       <w:pPr>
         <w:pStyle w:val="Bibliography"/>
@@ -9908,7 +10017,7 @@
       <w:r>
         <w:t xml:space="preserve"> </w:t>
       </w:r>
-      <w:hyperlink r:id="rId54">
+      <w:hyperlink r:id="rId58">
         <w:r>
           <w:rPr>
             <w:rStyle w:val="Hyperlink"/>
@@ -9917,8 +10026,8 @@
         </w:r>
       </w:hyperlink>
     </w:p>
-    <w:bookmarkEnd w:id="55"/>
-    <w:bookmarkStart w:id="57" w:name="_8ec3fe18376330511ec4a1748c7d82a65e4d7cd"/>
+    <w:bookmarkEnd w:id="59"/>
+    <w:bookmarkStart w:id="61" w:name="_8ec3fe18376330511ec4a1748c7d82a65e4d7cd"/>
     <w:p>
       <w:pPr>
         <w:pStyle w:val="Bibliography"/>
@@ -9941,7 +10050,7 @@
       <w:r>
         <w:t xml:space="preserve"> </w:t>
       </w:r>
-      <w:hyperlink r:id="rId56">
+      <w:hyperlink r:id="rId60">
         <w:r>
           <w:rPr>
             <w:rStyle w:val="Hyperlink"/>
@@ -9950,8 +10059,8 @@
         </w:r>
       </w:hyperlink>
     </w:p>
-    <w:bookmarkEnd w:id="57"/>
-    <w:bookmarkStart w:id="59" w:name="_0a60b1061f8d153449c03a179ab59c7d23acda7"/>
+    <w:bookmarkEnd w:id="61"/>
+    <w:bookmarkStart w:id="63" w:name="_0a60b1061f8d153449c03a179ab59c7d23acda7"/>
     <w:p>
       <w:pPr>
         <w:pStyle w:val="Bibliography"/>
@@ -9962,7 +10071,7 @@
       <w:r>
         <w:t xml:space="preserve"> </w:t>
       </w:r>
-      <w:hyperlink r:id="rId58">
+      <w:hyperlink r:id="rId62">
         <w:r>
           <w:rPr>
             <w:rStyle w:val="Hyperlink"/>
@@ -9971,8 +10080,8 @@
         </w:r>
       </w:hyperlink>
     </w:p>
-    <w:bookmarkEnd w:id="59"/>
-    <w:bookmarkStart w:id="61" w:name="_69fa3dc26f2fdd40a036509209653835fb61d11"/>
+    <w:bookmarkEnd w:id="63"/>
+    <w:bookmarkStart w:id="65" w:name="_69fa3dc26f2fdd40a036509209653835fb61d11"/>
     <w:p>
       <w:pPr>
         <w:pStyle w:val="Bibliography"/>
@@ -9995,7 +10104,7 @@
       <w:r>
         <w:t xml:space="preserve"> </w:t>
       </w:r>
-      <w:hyperlink r:id="rId60">
+      <w:hyperlink r:id="rId64">
         <w:r>
           <w:rPr>
             <w:rStyle w:val="Hyperlink"/>
@@ -10004,8 +10113,8 @@
         </w:r>
       </w:hyperlink>
     </w:p>
-    <w:bookmarkEnd w:id="61"/>
-    <w:bookmarkStart w:id="63" w:name="_664899e492519927cc0d763fbc72de5b92fe8d8"/>
+    <w:bookmarkEnd w:id="65"/>
+    <w:bookmarkStart w:id="67" w:name="_664899e492519927cc0d763fbc72de5b92fe8d8"/>
     <w:p>
       <w:pPr>
         <w:pStyle w:val="Bibliography"/>
@@ -10016,7 +10125,7 @@
       <w:r>
         <w:t xml:space="preserve"> </w:t>
       </w:r>
-      <w:hyperlink r:id="rId62">
+      <w:hyperlink r:id="rId66">
         <w:r>
           <w:rPr>
             <w:rStyle w:val="Hyperlink"/>
@@ -10025,8 +10134,8 @@
         </w:r>
       </w:hyperlink>
     </w:p>
-    <w:bookmarkEnd w:id="63"/>
-    <w:bookmarkStart w:id="65" w:name="_8d81a666dfc299bd8bc423508f420ac56bdaf57"/>
+    <w:bookmarkEnd w:id="67"/>
+    <w:bookmarkStart w:id="69" w:name="_8d81a666dfc299bd8bc423508f420ac56bdaf57"/>
     <w:p>
       <w:pPr>
         <w:pStyle w:val="Bibliography"/>
@@ -10046,7 +10155,7 @@
       <w:r>
         <w:t xml:space="preserve"> </w:t>
       </w:r>
-      <w:hyperlink r:id="rId64">
+      <w:hyperlink r:id="rId68">
         <w:r>
           <w:rPr>
             <w:rStyle w:val="Hyperlink"/>
@@ -10055,8 +10164,8 @@
         </w:r>
       </w:hyperlink>
     </w:p>
-    <w:bookmarkEnd w:id="65"/>
-    <w:bookmarkStart w:id="67" w:name="_e7aa4f7e3356611d3b2d5bfbd0b5df916e0cc07"/>
+    <w:bookmarkEnd w:id="69"/>
+    <w:bookmarkStart w:id="71" w:name="_e7aa4f7e3356611d3b2d5bfbd0b5df916e0cc07"/>
     <w:p>
       <w:pPr>
         <w:pStyle w:val="Bibliography"/>
@@ -10079,7 +10188,7 @@
       <w:r>
         <w:t xml:space="preserve"> </w:t>
       </w:r>
-      <w:hyperlink r:id="rId66">
+      <w:hyperlink r:id="rId70">
         <w:r>
           <w:rPr>
             <w:rStyle w:val="Hyperlink"/>
@@ -10088,8 +10197,8 @@
         </w:r>
       </w:hyperlink>
     </w:p>
-    <w:bookmarkEnd w:id="67"/>
-    <w:bookmarkStart w:id="69" w:name="_1ba1f77df109cdb4592a0c39a707f0ba8ca6100"/>
+    <w:bookmarkEnd w:id="71"/>
+    <w:bookmarkStart w:id="73" w:name="_1ba1f77df109cdb4592a0c39a707f0ba8ca6100"/>
     <w:p>
       <w:pPr>
         <w:pStyle w:val="Bibliography"/>
@@ -10106,7 +10215,7 @@
       <w:r>
         <w:t xml:space="preserve"> </w:t>
       </w:r>
-      <w:hyperlink r:id="rId68">
+      <w:hyperlink r:id="rId72">
         <w:r>
           <w:rPr>
             <w:rStyle w:val="Hyperlink"/>
@@ -10115,8 +10224,8 @@
         </w:r>
       </w:hyperlink>
     </w:p>
-    <w:bookmarkEnd w:id="69"/>
-    <w:bookmarkStart w:id="71" w:name="_03b309150ebc524c2a2aa50e5a68757073c3c32"/>
+    <w:bookmarkEnd w:id="73"/>
+    <w:bookmarkStart w:id="75" w:name="_03b309150ebc524c2a2aa50e5a68757073c3c32"/>
     <w:p>
       <w:pPr>
         <w:pStyle w:val="Bibliography"/>
@@ -10175,7 +10284,7 @@
       <w:r>
         <w:t xml:space="preserve"> </w:t>
       </w:r>
-      <w:hyperlink r:id="rId70">
+      <w:hyperlink r:id="rId74">
         <w:r>
           <w:rPr>
             <w:rStyle w:val="Hyperlink"/>
@@ -10184,8 +10293,8 @@
         </w:r>
       </w:hyperlink>
     </w:p>
-    <w:bookmarkEnd w:id="71"/>
-    <w:bookmarkStart w:id="73" w:name="_a1e57bb27bf8d4e7b732f7b1344e148cb46eaa9"/>
+    <w:bookmarkEnd w:id="75"/>
+    <w:bookmarkStart w:id="77" w:name="_a1e57bb27bf8d4e7b732f7b1344e148cb46eaa9"/>
     <w:p>
       <w:pPr>
         <w:pStyle w:val="Bibliography"/>
@@ -10214,7 +10323,7 @@
       <w:r>
         <w:t xml:space="preserve"> </w:t>
       </w:r>
-      <w:hyperlink r:id="rId72">
+      <w:hyperlink r:id="rId76">
         <w:r>
           <w:rPr>
             <w:rStyle w:val="Hyperlink"/>
@@ -10223,8 +10332,8 @@
         </w:r>
       </w:hyperlink>
     </w:p>
-    <w:bookmarkEnd w:id="73"/>
-    <w:bookmarkStart w:id="75" w:name="_cae824e968acfc38e5471fd41568740ceded7c7"/>
+    <w:bookmarkEnd w:id="77"/>
+    <w:bookmarkStart w:id="79" w:name="_cae824e968acfc38e5471fd41568740ceded7c7"/>
     <w:p>
       <w:pPr>
         <w:pStyle w:val="Bibliography"/>
@@ -10235,7 +10344,7 @@
       <w:r>
         <w:t xml:space="preserve"> </w:t>
       </w:r>
-      <w:hyperlink r:id="rId74">
+      <w:hyperlink r:id="rId78">
         <w:r>
           <w:rPr>
             <w:rStyle w:val="Hyperlink"/>
@@ -10244,8 +10353,8 @@
         </w:r>
       </w:hyperlink>
     </w:p>
-    <w:bookmarkEnd w:id="75"/>
-    <w:bookmarkStart w:id="77" w:name="_9bed9da9f5b8220827df58fa5bf65f545c7cff3"/>
+    <w:bookmarkEnd w:id="79"/>
+    <w:bookmarkStart w:id="81" w:name="_9bed9da9f5b8220827df58fa5bf65f545c7cff3"/>
     <w:p>
       <w:pPr>
         <w:pStyle w:val="Bibliography"/>
@@ -10256,7 +10365,7 @@
       <w:r>
         <w:t xml:space="preserve"> </w:t>
       </w:r>
-      <w:hyperlink r:id="rId76">
+      <w:hyperlink r:id="rId80">
         <w:r>
           <w:rPr>
             <w:rStyle w:val="Hyperlink"/>
@@ -10265,8 +10374,8 @@
         </w:r>
       </w:hyperlink>
     </w:p>
-    <w:bookmarkEnd w:id="77"/>
-    <w:bookmarkStart w:id="79" w:name="_d84d6fe33642d5bd1a08514c14a1f98951f6a3d"/>
+    <w:bookmarkEnd w:id="81"/>
+    <w:bookmarkStart w:id="83" w:name="_d84d6fe33642d5bd1a08514c14a1f98951f6a3d"/>
     <w:p>
       <w:pPr>
         <w:pStyle w:val="Bibliography"/>
@@ -10289,7 +10398,7 @@
       <w:r>
         <w:t xml:space="preserve"> </w:t>
       </w:r>
-      <w:hyperlink r:id="rId78">
+      <w:hyperlink r:id="rId82">
         <w:r>
           <w:rPr>
             <w:rStyle w:val="Hyperlink"/>
@@ -10298,8 +10407,8 @@
         </w:r>
       </w:hyperlink>
     </w:p>
-    <w:bookmarkEnd w:id="79"/>
-    <w:bookmarkStart w:id="81" w:name="_691b3d7ec207e6f1ffe01af53ad3661a36dd4eb"/>
+    <w:bookmarkEnd w:id="83"/>
+    <w:bookmarkStart w:id="85" w:name="_691b3d7ec207e6f1ffe01af53ad3661a36dd4eb"/>
     <w:p>
       <w:pPr>
         <w:pStyle w:val="Bibliography"/>
@@ -10310,7 +10419,7 @@
       <w:r>
         <w:t xml:space="preserve"> </w:t>
       </w:r>
-      <w:hyperlink r:id="rId80">
+      <w:hyperlink r:id="rId84">
         <w:r>
           <w:rPr>
             <w:rStyle w:val="Hyperlink"/>
@@ -10319,8 +10428,8 @@
         </w:r>
       </w:hyperlink>
     </w:p>
-    <w:bookmarkEnd w:id="81"/>
-    <w:bookmarkStart w:id="83" w:name="_fc93fbc434fdbfcd6db9f2578266aa3fe63fa92"/>
+    <w:bookmarkEnd w:id="85"/>
+    <w:bookmarkStart w:id="87" w:name="_fc93fbc434fdbfcd6db9f2578266aa3fe63fa92"/>
     <w:p>
       <w:pPr>
         <w:pStyle w:val="Bibliography"/>
@@ -10343,7 +10452,7 @@
       <w:r>
         <w:t xml:space="preserve"> </w:t>
       </w:r>
-      <w:hyperlink r:id="rId82">
+      <w:hyperlink r:id="rId86">
         <w:r>
           <w:rPr>
             <w:rStyle w:val="Hyperlink"/>
@@ -10352,8 +10461,8 @@
         </w:r>
       </w:hyperlink>
     </w:p>
-    <w:bookmarkEnd w:id="83"/>
-    <w:bookmarkStart w:id="85" w:name="_df40665c7477147b950e0d0518f5ab718df28b8"/>
+    <w:bookmarkEnd w:id="87"/>
+    <w:bookmarkStart w:id="89" w:name="_df40665c7477147b950e0d0518f5ab718df28b8"/>
     <w:p>
       <w:pPr>
         <w:pStyle w:val="Bibliography"/>
@@ -10364,7 +10473,7 @@
       <w:r>
         <w:t xml:space="preserve"> </w:t>
       </w:r>
-      <w:hyperlink r:id="rId84">
+      <w:hyperlink r:id="rId88">
         <w:r>
           <w:rPr>
             <w:rStyle w:val="Hyperlink"/>
@@ -10373,8 +10482,8 @@
         </w:r>
       </w:hyperlink>
     </w:p>
-    <w:bookmarkEnd w:id="85"/>
-    <w:bookmarkStart w:id="87" w:name="_d594fe5367581dab5c74dfb3d0f9bf83a5cc680"/>
+    <w:bookmarkEnd w:id="89"/>
+    <w:bookmarkStart w:id="91" w:name="_d594fe5367581dab5c74dfb3d0f9bf83a5cc680"/>
     <w:p>
       <w:pPr>
         <w:pStyle w:val="Bibliography"/>
@@ -10385,7 +10494,7 @@
       <w:r>
         <w:t xml:space="preserve"> </w:t>
       </w:r>
-      <w:hyperlink r:id="rId86">
+      <w:hyperlink r:id="rId90">
         <w:r>
           <w:rPr>
             <w:rStyle w:val="Hyperlink"/>
@@ -10394,8 +10503,8 @@
         </w:r>
       </w:hyperlink>
     </w:p>
-    <w:bookmarkEnd w:id="87"/>
-    <w:bookmarkStart w:id="89" w:name="_3c93df4fc630a9aa327393a0beb1f343989d0b0"/>
+    <w:bookmarkEnd w:id="91"/>
+    <w:bookmarkStart w:id="93" w:name="_3c93df4fc630a9aa327393a0beb1f343989d0b0"/>
     <w:p>
       <w:pPr>
         <w:pStyle w:val="Bibliography"/>
@@ -10418,7 +10527,7 @@
       <w:r>
         <w:t xml:space="preserve"> </w:t>
       </w:r>
-      <w:hyperlink r:id="rId88">
+      <w:hyperlink r:id="rId92">
         <w:r>
           <w:rPr>
             <w:rStyle w:val="Hyperlink"/>
@@ -10427,8 +10536,8 @@
         </w:r>
       </w:hyperlink>
     </w:p>
-    <w:bookmarkEnd w:id="89"/>
-    <w:bookmarkStart w:id="91" w:name="_001e733a8805c7c6795b5be30f8bf7a29c73565"/>
+    <w:bookmarkEnd w:id="93"/>
+    <w:bookmarkStart w:id="95" w:name="_001e733a8805c7c6795b5be30f8bf7a29c73565"/>
     <w:p>
       <w:pPr>
         <w:pStyle w:val="Bibliography"/>
@@ -10451,7 +10560,7 @@
       <w:r>
         <w:t xml:space="preserve"> </w:t>
       </w:r>
-      <w:hyperlink r:id="rId90">
+      <w:hyperlink r:id="rId94">
         <w:r>
           <w:rPr>
             <w:rStyle w:val="Hyperlink"/>
@@ -10460,8 +10569,8 @@
         </w:r>
       </w:hyperlink>
     </w:p>
-    <w:bookmarkEnd w:id="91"/>
-    <w:bookmarkStart w:id="93" w:name="_95a7f6a093e38266fec8ea1947aabbcb850bd47"/>
+    <w:bookmarkEnd w:id="95"/>
+    <w:bookmarkStart w:id="97" w:name="_95a7f6a093e38266fec8ea1947aabbcb850bd47"/>
     <w:p>
       <w:pPr>
         <w:pStyle w:val="Bibliography"/>
@@ -10484,7 +10593,7 @@
       <w:r>
         <w:t xml:space="preserve"> </w:t>
       </w:r>
-      <w:hyperlink r:id="rId92">
+      <w:hyperlink r:id="rId96">
         <w:r>
           <w:rPr>
             <w:rStyle w:val="Hyperlink"/>
@@ -10493,8 +10602,8 @@
         </w:r>
       </w:hyperlink>
     </w:p>
-    <w:bookmarkEnd w:id="93"/>
-    <w:bookmarkStart w:id="95" w:name="_90035051e9cb6e0d4a9b4d996a14af53650eae4"/>
+    <w:bookmarkEnd w:id="97"/>
+    <w:bookmarkStart w:id="99" w:name="_90035051e9cb6e0d4a9b4d996a14af53650eae4"/>
     <w:p>
       <w:pPr>
         <w:pStyle w:val="Bibliography"/>
@@ -10505,7 +10614,7 @@
       <w:r>
         <w:t xml:space="preserve"> </w:t>
       </w:r>
-      <w:hyperlink r:id="rId94">
+      <w:hyperlink r:id="rId98">
         <w:r>
           <w:rPr>
             <w:rStyle w:val="Hyperlink"/>
@@ -10514,8 +10623,8 @@
         </w:r>
       </w:hyperlink>
     </w:p>
-    <w:bookmarkEnd w:id="95"/>
-    <w:bookmarkStart w:id="97" w:name="_22b8669257583e60fc4613cd9bf0682ec3fbb25"/>
+    <w:bookmarkEnd w:id="99"/>
+    <w:bookmarkStart w:id="101" w:name="_22b8669257583e60fc4613cd9bf0682ec3fbb25"/>
     <w:p>
       <w:pPr>
         <w:pStyle w:val="Bibliography"/>
@@ -10526,7 +10635,7 @@
       <w:r>
         <w:t xml:space="preserve"> </w:t>
       </w:r>
-      <w:hyperlink r:id="rId96">
+      <w:hyperlink r:id="rId100">
         <w:r>
           <w:rPr>
             <w:rStyle w:val="Hyperlink"/>
@@ -10535,8 +10644,8 @@
         </w:r>
       </w:hyperlink>
     </w:p>
-    <w:bookmarkEnd w:id="97"/>
-    <w:bookmarkStart w:id="99" w:name="_a75653ffaf987313fa99474d7ab4895d708e5a4"/>
+    <w:bookmarkEnd w:id="101"/>
+    <w:bookmarkStart w:id="103" w:name="_a75653ffaf987313fa99474d7ab4895d708e5a4"/>
     <w:p>
       <w:pPr>
         <w:pStyle w:val="Bibliography"/>
@@ -10547,7 +10656,7 @@
       <w:r>
         <w:t xml:space="preserve"> </w:t>
       </w:r>
-      <w:hyperlink r:id="rId98">
+      <w:hyperlink r:id="rId102">
         <w:r>
           <w:rPr>
             <w:rStyle w:val="Hyperlink"/>
@@ -10556,8 +10665,8 @@
         </w:r>
       </w:hyperlink>
     </w:p>
-    <w:bookmarkEnd w:id="99"/>
-    <w:bookmarkStart w:id="101" w:name="_11593371a69f66357e86220b227297cc20dc733"/>
+    <w:bookmarkEnd w:id="103"/>
+    <w:bookmarkStart w:id="105" w:name="_11593371a69f66357e86220b227297cc20dc733"/>
     <w:p>
       <w:pPr>
         <w:pStyle w:val="Bibliography"/>
@@ -10580,7 +10689,7 @@
       <w:r>
         <w:t xml:space="preserve"> </w:t>
       </w:r>
-      <w:hyperlink r:id="rId100">
+      <w:hyperlink r:id="rId104">
         <w:r>
           <w:rPr>
             <w:rStyle w:val="Hyperlink"/>
@@ -10589,8 +10698,8 @@
         </w:r>
       </w:hyperlink>
     </w:p>
-    <w:bookmarkEnd w:id="101"/>
-    <w:bookmarkStart w:id="103" w:name="_1994c31b65db315423021af066b563f5c10707d"/>
+    <w:bookmarkEnd w:id="105"/>
+    <w:bookmarkStart w:id="107" w:name="_1994c31b65db315423021af066b563f5c10707d"/>
     <w:p>
       <w:pPr>
         <w:pStyle w:val="Bibliography"/>
@@ -10613,7 +10722,7 @@
       <w:r>
         <w:t xml:space="preserve"> </w:t>
       </w:r>
-      <w:hyperlink r:id="rId102">
+      <w:hyperlink r:id="rId106">
         <w:r>
           <w:rPr>
             <w:rStyle w:val="Hyperlink"/>
@@ -10622,8 +10731,8 @@
         </w:r>
       </w:hyperlink>
     </w:p>
-    <w:bookmarkEnd w:id="103"/>
-    <w:bookmarkStart w:id="105" w:name="_816983a1b4f88f3b0231ac3f28316885953f087"/>
+    <w:bookmarkEnd w:id="107"/>
+    <w:bookmarkStart w:id="109" w:name="_816983a1b4f88f3b0231ac3f28316885953f087"/>
     <w:p>
       <w:pPr>
         <w:pStyle w:val="Bibliography"/>
@@ -10634,7 +10743,7 @@
       <w:r>
         <w:t xml:space="preserve"> </w:t>
       </w:r>
-      <w:hyperlink r:id="rId104">
+      <w:hyperlink r:id="rId108">
         <w:r>
           <w:rPr>
             <w:rStyle w:val="Hyperlink"/>
@@ -10643,8 +10752,8 @@
         </w:r>
       </w:hyperlink>
     </w:p>
-    <w:bookmarkEnd w:id="105"/>
-    <w:bookmarkEnd w:id="106"/>
+    <w:bookmarkEnd w:id="109"/>
+    <w:bookmarkEnd w:id="110"/>
     <w:sectPr>
       <w:footnotePr>
         <w:numRestart w:val="eachSect"/>

</xml_diff>

<commit_message>
BJCP Submission Files: Conflict-Of-Interest Statement, Principal-Investigator Note, Abstract Trimmed To Wiley Count
Co-Authored-By: Claude Opus 5.5 <noreply@anthropic.com>
</commit_message>
<xml_diff>
--- a/paper/manuscript.docx
+++ b/paper/manuscript.docx
@@ -170,7 +170,7 @@
         <w:t xml:space="preserve"> </w:t>
       </w:r>
       <w:r>
-        <w:t xml:space="preserve">receiver operating characteristic curve, AUC) and by replication in Canada Vigilance; robust unlabelled signals underwent</w:t>
+        <w:t xml:space="preserve">receiver operating characteristic curve, AUC) and by replication in Canada; robust unlabelled signals underwent</w:t>
       </w:r>
       <w:r>
         <w:t xml:space="preserve"> </w:t>
@@ -212,7 +212,7 @@
         <w:t xml:space="preserve"> </w:t>
       </w:r>
       <w:r>
-        <w:t xml:space="preserve">0.723). Unlabelled signals replicated in Canada more than background but less than labelled ones; power-calibrated (post hoc), labelled signals replicated as predicted (observed/expected</w:t>
+        <w:t xml:space="preserve">0.723). Unlabelled signals replicated in Canada more than background, less than labelled ones; power-calibrated (post hoc), labelled signals replicated as predicted (observed/expected</w:t>
       </w:r>
       <w:r>
         <w:t xml:space="preserve"> </w:t>
@@ -230,7 +230,7 @@
         <w:t xml:space="preserve"> </w:t>
       </w:r>
       <w:r>
-        <w:t xml:space="preserve">also within strata of consumer reporting. Solicited reports, report clusters and shared</w:t>
+        <w:t xml:space="preserve">even within consumer-reporting strata. Solicited reports, report clusters and shared</w:t>
       </w:r>
       <w:r>
         <w:t xml:space="preserve"> </w:t>

</xml_diff>